<commit_message>
Build numbered Word supplement and reporting checklist with matching HTML
</commit_message>
<xml_diff>
--- a/analysis/output/manuscript/Table1.docx
+++ b/analysis/output/manuscript/Table1.docx
@@ -17,12 +17,12 @@
         <w:tblLook w:firstRow="1" w:lastRow="0" w:firstColumn="0" w:lastColumn="0" w:noHBand="0" w:noVBand="1"/>
       </w:tblPr>
       <w:tblGrid>
-        <w:gridCol w:w="1644"/>
-        <w:gridCol w:w="1644"/>
-        <w:gridCol w:w="1644"/>
-        <w:gridCol w:w="1644"/>
-        <w:gridCol w:w="1644"/>
-        <w:gridCol w:w="1644"/>
+        <w:gridCol w:w="1368"/>
+        <w:gridCol w:w="1656"/>
+        <w:gridCol w:w="3168"/>
+        <w:gridCol w:w="648"/>
+        <w:gridCol w:w="1728"/>
+        <w:gridCol w:w="1296"/>
       </w:tblGrid>
       <w:tr>
         <w:trPr>
@@ -6831,60 +6831,56 @@
     <w:name w:val="Normal"/>
     <w:qFormat/>
   </w:style>
-  <w:style w:type="paragraph" w:styleId="Titre1">
+  <w:style xmlns:w="http://schemas.openxmlformats.org/wordprocessingml/2006/main" w:type="paragraph" w:customStyle="1" w:styleId="Titre1">
     <w:name w:val="heading 1"/>
     <w:basedOn w:val="Normal"/>
-    <w:next w:val="Normal"/>
-    <w:link w:val="Titre1Car"/>
-    <w:uiPriority w:val="9"/>
-    <w:qFormat/>
-    <w:rsid w:val="00362E65"/>
     <w:pPr>
+      <w:jc w:val="left"/>
       <w:keepNext/>
-      <w:keepLines/>
-      <w:numPr>
-        <w:numId w:val="3"/>
-      </w:numPr>
       <w:pBdr>
-        <w:bottom w:val="single" w:sz="4" w:space="1" w:color="auto"/>
+        <w:bottom w:val="none" w:sz="0" w:space="0" w:color="000000"/>
+        <w:top w:val="none" w:sz="0" w:space="0" w:color="000000"/>
+        <w:left w:val="none" w:sz="0" w:space="0" w:color="000000"/>
+        <w:right w:val="none" w:sz="0" w:space="0" w:color="000000"/>
       </w:pBdr>
-      <w:spacing w:before="480"/>
-      <w:outlineLvl w:val="0"/>
+      <w:spacing w:after="120" w:before="160" w:line="240"/>
+      <w:ind w:left="0" w:right="0" w:firstLine="0" w:firstLineChars="0"/>
     </w:pPr>
     <w:rPr>
-      <w:rFonts w:asciiTheme="majorHAnsi" w:eastAsiaTheme="majorEastAsia" w:hAnsiTheme="majorHAnsi" w:cstheme="majorBidi"/>
-      <w:b/>
-      <w:bCs/>
-      <w:sz w:val="32"/>
-      <w:szCs w:val="32"/>
+      <w:rFonts w:ascii="Arial" w:hAnsi="Arial" w:eastAsia="Arial" w:cs="Arial"/>
+      <w:i w:val="false"/>
+      <w:b w:val="true"/>
+      <w:u w:val="none"/>
+      <w:strike w:val="false"/>
+      <w:sz w:val="24"/>
+      <w:szCs w:val="24"/>
+      <w:color w:val="000000"/>
     </w:rPr>
   </w:style>
-  <w:style w:type="paragraph" w:styleId="Titre2">
+  <w:style xmlns:w="http://schemas.openxmlformats.org/wordprocessingml/2006/main" w:type="paragraph" w:customStyle="1" w:styleId="Titre2">
     <w:name w:val="heading 2"/>
     <w:basedOn w:val="Normal"/>
-    <w:next w:val="Normal"/>
-    <w:link w:val="Titre2Car"/>
-    <w:uiPriority w:val="9"/>
-    <w:semiHidden/>
-    <w:unhideWhenUsed/>
-    <w:qFormat/>
-    <w:rsid w:val="00362E65"/>
     <w:pPr>
+      <w:jc w:val="left"/>
       <w:keepNext/>
-      <w:keepLines/>
-      <w:numPr>
-        <w:ilvl w:val="1"/>
-        <w:numId w:val="3"/>
-      </w:numPr>
-      <w:spacing w:before="200"/>
-      <w:outlineLvl w:val="1"/>
+      <w:pBdr>
+        <w:bottom w:val="none" w:sz="0" w:space="0" w:color="000000"/>
+        <w:top w:val="none" w:sz="0" w:space="0" w:color="000000"/>
+        <w:left w:val="none" w:sz="0" w:space="0" w:color="000000"/>
+        <w:right w:val="none" w:sz="0" w:space="0" w:color="000000"/>
+      </w:pBdr>
+      <w:spacing w:after="80" w:before="120" w:line="240"/>
+      <w:ind w:left="0" w:right="0" w:firstLine="0" w:firstLineChars="0"/>
     </w:pPr>
     <w:rPr>
-      <w:rFonts w:asciiTheme="majorHAnsi" w:eastAsiaTheme="majorEastAsia" w:hAnsiTheme="majorHAnsi" w:cstheme="majorBidi"/>
-      <w:b/>
-      <w:bCs/>
-      <w:sz w:val="26"/>
-      <w:szCs w:val="26"/>
+      <w:rFonts w:ascii="Arial" w:hAnsi="Arial" w:eastAsia="Arial" w:cs="Arial"/>
+      <w:i w:val="false"/>
+      <w:b w:val="true"/>
+      <w:u w:val="none"/>
+      <w:strike w:val="false"/>
+      <w:sz w:val="20"/>
+      <w:szCs w:val="20"/>
+      <w:color w:val="000000"/>
     </w:rPr>
   </w:style>
   <w:style w:type="paragraph" w:styleId="Titre3">
@@ -7245,6 +7241,31 @@
     <w:next w:val="Normal"/>
     <w:rsid w:val="00901463"/>
   </w:style>
+  <w:style xmlns:w="http://schemas.openxmlformats.org/wordprocessingml/2006/main" w:type="paragraph" w:customStyle="1" w:styleId="ManuscriptBody">
+    <w:name w:val="Manuscript body"/>
+    <w:basedOn w:val="Normal"/>
+    <w:pPr>
+      <w:jc w:val="left"/>
+      <w:pBdr>
+        <w:bottom w:val="none" w:sz="0" w:space="0" w:color="000000"/>
+        <w:top w:val="none" w:sz="0" w:space="0" w:color="000000"/>
+        <w:left w:val="none" w:sz="0" w:space="0" w:color="000000"/>
+        <w:right w:val="none" w:sz="0" w:space="0" w:color="000000"/>
+      </w:pBdr>
+      <w:spacing w:after="0" w:before="0" w:line="240"/>
+      <w:ind w:left="0" w:right="0" w:firstLine="0" w:firstLineChars="0"/>
+    </w:pPr>
+    <w:rPr>
+      <w:rFonts w:ascii="Arial" w:hAnsi="Arial" w:eastAsia="Arial" w:cs="Arial"/>
+      <w:i w:val="false"/>
+      <w:b w:val="false"/>
+      <w:u w:val="none"/>
+      <w:strike w:val="false"/>
+      <w:sz w:val="20"/>
+      <w:szCs w:val="20"/>
+      <w:color w:val="000000"/>
+    </w:rPr>
+  </w:style>
 </w:styles>
 </file>
 

</xml_diff>

<commit_message>
Polish main manuscript tables and standardize Figure 1 TIFF extension
</commit_message>
<xml_diff>
--- a/analysis/output/manuscript/Table1.docx
+++ b/analysis/output/manuscript/Table1.docx
@@ -17,12 +17,13 @@
         <w:tblLook w:firstRow="1" w:lastRow="0" w:firstColumn="0" w:lastColumn="0" w:noHBand="0" w:noVBand="1"/>
       </w:tblPr>
       <w:tblGrid>
-        <w:gridCol w:w="1368"/>
-        <w:gridCol w:w="1656"/>
-        <w:gridCol w:w="3168"/>
-        <w:gridCol w:w="648"/>
-        <w:gridCol w:w="1728"/>
-        <w:gridCol w:w="1296"/>
+        <w:gridCol w:w="1642"/>
+        <w:gridCol w:w="1699"/>
+        <w:gridCol w:w="619"/>
+        <w:gridCol w:w="2808"/>
+        <w:gridCol w:w="662"/>
+        <w:gridCol w:w="1469"/>
+        <w:gridCol w:w="965"/>
       </w:tblGrid>
       <w:tr>
         <w:trPr>
@@ -138,7 +139,7 @@
                 <w:szCs w:val="18"/>
                 <w:color w:val="000000"/>
               </w:rPr>
-              <w:t xml:space="preserve">Journal; year</w:t>
+              <w:t xml:space="preserve">Journal</w:t>
             </w:r>
           </w:p>
         </w:tc>
@@ -194,7 +195,7 @@
                 <w:szCs w:val="18"/>
                 <w:color w:val="000000"/>
               </w:rPr>
-              <w:t xml:space="preserve">Topic</w:t>
+              <w:t xml:space="preserve">Year</w:t>
             </w:r>
           </w:p>
         </w:tc>
@@ -250,7 +251,7 @@
                 <w:szCs w:val="18"/>
                 <w:color w:val="000000"/>
               </w:rPr>
-              <w:t xml:space="preserve">Trials</w:t>
+              <w:t xml:space="preserve">Topic</w:t>
             </w:r>
           </w:p>
         </w:tc>
@@ -306,7 +307,63 @@
                 <w:szCs w:val="18"/>
                 <w:color w:val="000000"/>
               </w:rPr>
-              <w:t xml:space="preserve">Low / Some concerns / High</w:t>
+              <w:t xml:space="preserve">Trials</w:t>
+            </w:r>
+          </w:p>
+        </w:tc>
+        <w:tc>
+          <w:tcPr>
+            <w:tcBorders>
+              <w:bottom w:val="single" w:sz="5" w:space="0" w:color="000000"/>
+              <w:top w:val="single" w:sz="8" w:space="0" w:color="000000"/>
+              <w:left w:val="none" w:sz="0" w:space="0" w:color="000000"/>
+              <w:right w:val="none" w:sz="0" w:space="0" w:color="000000"/>
+            </w:tcBorders>
+            <w:shd w:val="clear" w:color="auto" w:fill="FFFFFF"/>
+            <w:tcMar>
+              <w:top w:w="0" w:type="dxa"/>
+              <w:bottom w:w="0" w:type="dxa"/>
+              <w:left w:w="0" w:type="dxa"/>
+              <w:right w:w="0" w:type="dxa"/>
+            </w:tcMar>
+            <w:vAlign w:val="top"/>
+          </w:tcPr>
+          <w:p>
+            <w:pPr>
+              <w:pStyle w:val="Normal"/>
+              <w:jc w:val="left"/>
+              <w:keepNext/>
+              <w:pBdr>
+                <w:bottom w:val="none" w:sz="0" w:space="0" w:color="000000"/>
+                <w:top w:val="none" w:sz="0" w:space="0" w:color="000000"/>
+                <w:left w:val="none" w:sz="0" w:space="0" w:color="000000"/>
+                <w:right w:val="none" w:sz="0" w:space="0" w:color="000000"/>
+              </w:pBdr>
+              <w:spacing w:after="60" w:before="60" w:line="240"/>
+              <w:ind w:left="60" w:right="60" w:firstLine="0" w:firstLineChars="0"/>
+              <w:rPr>
+                <w:rFonts w:ascii="Arial" w:hAnsi="Arial" w:eastAsia="Arial" w:cs="Arial"/>
+                <w:i w:val="false"/>
+                <w:b w:val="true"/>
+                <w:u w:val="none"/>
+                <w:strike w:val="false"/>
+                <w:sz w:val="18"/>
+                <w:szCs w:val="18"/>
+                <w:color w:val="000000"/>
+              </w:rPr>
+            </w:pPr>
+            <w:r>
+              <w:rPr>
+                <w:rFonts w:ascii="Arial" w:hAnsi="Arial" w:eastAsia="Arial" w:cs="Arial"/>
+                <w:i w:val="false"/>
+                <w:b w:val="true"/>
+                <w:u w:val="none"/>
+                <w:strike w:val="false"/>
+                <w:sz w:val="18"/>
+                <w:szCs w:val="18"/>
+                <w:color w:val="000000"/>
+              </w:rPr>
+              <w:t xml:space="preserve">Published D1–D5 labels, Low / SC / High</w:t>
             </w:r>
           </w:p>
         </w:tc>
@@ -423,7 +480,7 @@
                 <w:szCs w:val="18"/>
                 <w:color w:val="000000"/>
               </w:rPr>
-              <w:t xml:space="preserve">Cardiology</w:t>
+              <w:t xml:space="preserve">General medicine</w:t>
             </w:r>
           </w:p>
         </w:tc>
@@ -478,7 +535,7 @@
                 <w:szCs w:val="18"/>
                 <w:color w:val="000000"/>
               </w:rPr>
-              <w:t xml:space="preserve">Journal of the American College of Cardiology; 2025</w:t>
+              <w:t xml:space="preserve">JAMA</w:t>
             </w:r>
           </w:p>
         </w:tc>
@@ -533,7 +590,7 @@
                 <w:szCs w:val="18"/>
                 <w:color w:val="000000"/>
               </w:rPr>
-              <w:t xml:space="preserve">Early aortic valve replacement vs surveillance in asymptomatic severe aortic stenosis</w:t>
+              <w:t xml:space="preserve">2026</w:t>
             </w:r>
           </w:p>
         </w:tc>
@@ -588,7 +645,7 @@
                 <w:szCs w:val="18"/>
                 <w:color w:val="000000"/>
               </w:rPr>
-              <w:t xml:space="preserve">2</w:t>
+              <w:t xml:space="preserve">SGLT2 inhibitors and kidney outcomes across eGFR and albuminuria</w:t>
             </w:r>
           </w:p>
         </w:tc>
@@ -643,7 +700,7 @@
                 <w:szCs w:val="18"/>
                 <w:color w:val="000000"/>
               </w:rPr>
-              <w:t xml:space="preserve">10 / 0 / 0</w:t>
+              <w:t xml:space="preserve">7</w:t>
             </w:r>
           </w:p>
         </w:tc>
@@ -698,7 +755,62 @@
                 <w:szCs w:val="18"/>
                 <w:color w:val="000000"/>
               </w:rPr>
-              <w:t xml:space="preserve">Yes</w:t>
+              <w:t xml:space="preserve">35 / 0 / 0</w:t>
+            </w:r>
+          </w:p>
+        </w:tc>
+        <w:tc>
+          <w:tcPr>
+            <w:tcBorders>
+              <w:bottom w:val="none" w:sz="0" w:space="0" w:color="000000"/>
+              <w:top w:val="single" w:sz="5" w:space="0" w:color="000000"/>
+              <w:left w:val="none" w:sz="0" w:space="0" w:color="000000"/>
+              <w:right w:val="none" w:sz="0" w:space="0" w:color="000000"/>
+            </w:tcBorders>
+            <w:shd w:val="clear" w:color="auto" w:fill="FFFFFF"/>
+            <w:tcMar>
+              <w:top w:w="0" w:type="dxa"/>
+              <w:bottom w:w="0" w:type="dxa"/>
+              <w:left w:w="0" w:type="dxa"/>
+              <w:right w:w="0" w:type="dxa"/>
+            </w:tcMar>
+            <w:vAlign w:val="top"/>
+          </w:tcPr>
+          <w:p>
+            <w:pPr>
+              <w:pStyle w:val="Normal"/>
+              <w:jc w:val="left"/>
+              <w:pBdr>
+                <w:bottom w:val="none" w:sz="0" w:space="0" w:color="000000"/>
+                <w:top w:val="none" w:sz="0" w:space="0" w:color="000000"/>
+                <w:left w:val="none" w:sz="0" w:space="0" w:color="000000"/>
+                <w:right w:val="none" w:sz="0" w:space="0" w:color="000000"/>
+              </w:pBdr>
+              <w:spacing w:after="60" w:before="60" w:line="240"/>
+              <w:ind w:left="60" w:right="60" w:firstLine="0" w:firstLineChars="0"/>
+              <w:rPr>
+                <w:rFonts w:ascii="Arial" w:hAnsi="Arial" w:eastAsia="Arial" w:cs="Arial"/>
+                <w:i w:val="false"/>
+                <w:b w:val="false"/>
+                <w:u w:val="none"/>
+                <w:strike w:val="false"/>
+                <w:sz w:val="18"/>
+                <w:szCs w:val="18"/>
+                <w:color w:val="000000"/>
+              </w:rPr>
+            </w:pPr>
+            <w:r>
+              <w:rPr>
+                <w:rFonts w:ascii="Arial" w:hAnsi="Arial" w:eastAsia="Arial" w:cs="Arial"/>
+                <w:i w:val="false"/>
+                <w:b w:val="false"/>
+                <w:u w:val="none"/>
+                <w:strike w:val="false"/>
+                <w:sz w:val="18"/>
+                <w:szCs w:val="18"/>
+                <w:color w:val="000000"/>
+              </w:rPr>
+              <w:t xml:space="preserve">No</w:t>
             </w:r>
           </w:p>
         </w:tc>
@@ -759,117 +871,172 @@
                 <w:szCs w:val="18"/>
                 <w:color w:val="000000"/>
               </w:rPr>
-              <w:t xml:space="preserve">Endocrinology</w:t>
-            </w:r>
-          </w:p>
-        </w:tc>
-        <w:tc>
-          <w:tcPr>
-            <w:tcBorders>
-              <w:bottom w:val="none" w:sz="0" w:space="0" w:color="000000"/>
-              <w:top w:val="none" w:sz="0" w:space="0" w:color="000000"/>
-              <w:left w:val="none" w:sz="0" w:space="0" w:color="000000"/>
-              <w:right w:val="none" w:sz="0" w:space="0" w:color="000000"/>
-            </w:tcBorders>
-            <w:shd w:val="clear" w:color="auto" w:fill="FFFFFF"/>
-            <w:tcMar>
-              <w:top w:w="0" w:type="dxa"/>
-              <w:bottom w:w="0" w:type="dxa"/>
-              <w:left w:w="0" w:type="dxa"/>
-              <w:right w:w="0" w:type="dxa"/>
-            </w:tcMar>
-            <w:vAlign w:val="top"/>
-          </w:tcPr>
-          <w:p>
-            <w:pPr>
-              <w:pStyle w:val="Normal"/>
-              <w:jc w:val="left"/>
-              <w:pBdr>
-                <w:bottom w:val="none" w:sz="0" w:space="0" w:color="000000"/>
-                <w:top w:val="none" w:sz="0" w:space="0" w:color="000000"/>
-                <w:left w:val="none" w:sz="0" w:space="0" w:color="000000"/>
-                <w:right w:val="none" w:sz="0" w:space="0" w:color="000000"/>
-              </w:pBdr>
-              <w:spacing w:after="60" w:before="60" w:line="240"/>
-              <w:ind w:left="60" w:right="60" w:firstLine="0" w:firstLineChars="0"/>
-              <w:rPr>
-                <w:rFonts w:ascii="Arial" w:hAnsi="Arial" w:eastAsia="Arial" w:cs="Arial"/>
-                <w:i w:val="false"/>
-                <w:b w:val="false"/>
-                <w:u w:val="none"/>
-                <w:strike w:val="false"/>
-                <w:sz w:val="18"/>
-                <w:szCs w:val="18"/>
-                <w:color w:val="000000"/>
-              </w:rPr>
-            </w:pPr>
-            <w:r>
-              <w:rPr>
-                <w:rFonts w:ascii="Arial" w:hAnsi="Arial" w:eastAsia="Arial" w:cs="Arial"/>
-                <w:i w:val="false"/>
-                <w:b w:val="false"/>
-                <w:u w:val="none"/>
-                <w:strike w:val="false"/>
-                <w:sz w:val="18"/>
-                <w:szCs w:val="18"/>
-                <w:color w:val="000000"/>
-              </w:rPr>
-              <w:t xml:space="preserve">The Lancet Diabetes &amp; Endocrinology; 2025</w:t>
-            </w:r>
-          </w:p>
-        </w:tc>
-        <w:tc>
-          <w:tcPr>
-            <w:tcBorders>
-              <w:bottom w:val="none" w:sz="0" w:space="0" w:color="000000"/>
-              <w:top w:val="none" w:sz="0" w:space="0" w:color="000000"/>
-              <w:left w:val="none" w:sz="0" w:space="0" w:color="000000"/>
-              <w:right w:val="none" w:sz="0" w:space="0" w:color="000000"/>
-            </w:tcBorders>
-            <w:shd w:val="clear" w:color="auto" w:fill="FFFFFF"/>
-            <w:tcMar>
-              <w:top w:w="0" w:type="dxa"/>
-              <w:bottom w:w="0" w:type="dxa"/>
-              <w:left w:w="0" w:type="dxa"/>
-              <w:right w:w="0" w:type="dxa"/>
-            </w:tcMar>
-            <w:vAlign w:val="top"/>
-          </w:tcPr>
-          <w:p>
-            <w:pPr>
-              <w:pStyle w:val="Normal"/>
-              <w:jc w:val="left"/>
-              <w:pBdr>
-                <w:bottom w:val="none" w:sz="0" w:space="0" w:color="000000"/>
-                <w:top w:val="none" w:sz="0" w:space="0" w:color="000000"/>
-                <w:left w:val="none" w:sz="0" w:space="0" w:color="000000"/>
-                <w:right w:val="none" w:sz="0" w:space="0" w:color="000000"/>
-              </w:pBdr>
-              <w:spacing w:after="60" w:before="60" w:line="240"/>
-              <w:ind w:left="60" w:right="60" w:firstLine="0" w:firstLineChars="0"/>
-              <w:rPr>
-                <w:rFonts w:ascii="Arial" w:hAnsi="Arial" w:eastAsia="Arial" w:cs="Arial"/>
-                <w:i w:val="false"/>
-                <w:b w:val="false"/>
-                <w:u w:val="none"/>
-                <w:strike w:val="false"/>
-                <w:sz w:val="18"/>
-                <w:szCs w:val="18"/>
-                <w:color w:val="000000"/>
-              </w:rPr>
-            </w:pPr>
-            <w:r>
-              <w:rPr>
-                <w:rFonts w:ascii="Arial" w:hAnsi="Arial" w:eastAsia="Arial" w:cs="Arial"/>
-                <w:i w:val="false"/>
-                <w:b w:val="false"/>
-                <w:u w:val="none"/>
-                <w:strike w:val="false"/>
-                <w:sz w:val="18"/>
-                <w:szCs w:val="18"/>
-                <w:color w:val="000000"/>
-              </w:rPr>
-              <w:t xml:space="preserve">GLP-1 receptor agonists and kidney and cardiovascular outcomes</w:t>
+              <w:t xml:space="preserve">General medicine</w:t>
+            </w:r>
+          </w:p>
+        </w:tc>
+        <w:tc>
+          <w:tcPr>
+            <w:tcBorders>
+              <w:bottom w:val="none" w:sz="0" w:space="0" w:color="000000"/>
+              <w:top w:val="none" w:sz="0" w:space="0" w:color="000000"/>
+              <w:left w:val="none" w:sz="0" w:space="0" w:color="000000"/>
+              <w:right w:val="none" w:sz="0" w:space="0" w:color="000000"/>
+            </w:tcBorders>
+            <w:shd w:val="clear" w:color="auto" w:fill="FFFFFF"/>
+            <w:tcMar>
+              <w:top w:w="0" w:type="dxa"/>
+              <w:bottom w:w="0" w:type="dxa"/>
+              <w:left w:w="0" w:type="dxa"/>
+              <w:right w:w="0" w:type="dxa"/>
+            </w:tcMar>
+            <w:vAlign w:val="top"/>
+          </w:tcPr>
+          <w:p>
+            <w:pPr>
+              <w:pStyle w:val="Normal"/>
+              <w:jc w:val="left"/>
+              <w:pBdr>
+                <w:bottom w:val="none" w:sz="0" w:space="0" w:color="000000"/>
+                <w:top w:val="none" w:sz="0" w:space="0" w:color="000000"/>
+                <w:left w:val="none" w:sz="0" w:space="0" w:color="000000"/>
+                <w:right w:val="none" w:sz="0" w:space="0" w:color="000000"/>
+              </w:pBdr>
+              <w:spacing w:after="60" w:before="60" w:line="240"/>
+              <w:ind w:left="60" w:right="60" w:firstLine="0" w:firstLineChars="0"/>
+              <w:rPr>
+                <w:rFonts w:ascii="Arial" w:hAnsi="Arial" w:eastAsia="Arial" w:cs="Arial"/>
+                <w:i w:val="false"/>
+                <w:b w:val="false"/>
+                <w:u w:val="none"/>
+                <w:strike w:val="false"/>
+                <w:sz w:val="18"/>
+                <w:szCs w:val="18"/>
+                <w:color w:val="000000"/>
+              </w:rPr>
+            </w:pPr>
+            <w:r>
+              <w:rPr>
+                <w:rFonts w:ascii="Arial" w:hAnsi="Arial" w:eastAsia="Arial" w:cs="Arial"/>
+                <w:i w:val="false"/>
+                <w:b w:val="false"/>
+                <w:u w:val="none"/>
+                <w:strike w:val="false"/>
+                <w:sz w:val="18"/>
+                <w:szCs w:val="18"/>
+                <w:color w:val="000000"/>
+              </w:rPr>
+              <w:t xml:space="preserve">Lancet</w:t>
+            </w:r>
+          </w:p>
+        </w:tc>
+        <w:tc>
+          <w:tcPr>
+            <w:tcBorders>
+              <w:bottom w:val="none" w:sz="0" w:space="0" w:color="000000"/>
+              <w:top w:val="none" w:sz="0" w:space="0" w:color="000000"/>
+              <w:left w:val="none" w:sz="0" w:space="0" w:color="000000"/>
+              <w:right w:val="none" w:sz="0" w:space="0" w:color="000000"/>
+            </w:tcBorders>
+            <w:shd w:val="clear" w:color="auto" w:fill="FFFFFF"/>
+            <w:tcMar>
+              <w:top w:w="0" w:type="dxa"/>
+              <w:bottom w:w="0" w:type="dxa"/>
+              <w:left w:w="0" w:type="dxa"/>
+              <w:right w:w="0" w:type="dxa"/>
+            </w:tcMar>
+            <w:vAlign w:val="top"/>
+          </w:tcPr>
+          <w:p>
+            <w:pPr>
+              <w:pStyle w:val="Normal"/>
+              <w:jc w:val="left"/>
+              <w:pBdr>
+                <w:bottom w:val="none" w:sz="0" w:space="0" w:color="000000"/>
+                <w:top w:val="none" w:sz="0" w:space="0" w:color="000000"/>
+                <w:left w:val="none" w:sz="0" w:space="0" w:color="000000"/>
+                <w:right w:val="none" w:sz="0" w:space="0" w:color="000000"/>
+              </w:pBdr>
+              <w:spacing w:after="60" w:before="60" w:line="240"/>
+              <w:ind w:left="60" w:right="60" w:firstLine="0" w:firstLineChars="0"/>
+              <w:rPr>
+                <w:rFonts w:ascii="Arial" w:hAnsi="Arial" w:eastAsia="Arial" w:cs="Arial"/>
+                <w:i w:val="false"/>
+                <w:b w:val="false"/>
+                <w:u w:val="none"/>
+                <w:strike w:val="false"/>
+                <w:sz w:val="18"/>
+                <w:szCs w:val="18"/>
+                <w:color w:val="000000"/>
+              </w:rPr>
+            </w:pPr>
+            <w:r>
+              <w:rPr>
+                <w:rFonts w:ascii="Arial" w:hAnsi="Arial" w:eastAsia="Arial" w:cs="Arial"/>
+                <w:i w:val="false"/>
+                <w:b w:val="false"/>
+                <w:u w:val="none"/>
+                <w:strike w:val="false"/>
+                <w:sz w:val="18"/>
+                <w:szCs w:val="18"/>
+                <w:color w:val="000000"/>
+              </w:rPr>
+              <w:t xml:space="preserve">2025</w:t>
+            </w:r>
+          </w:p>
+        </w:tc>
+        <w:tc>
+          <w:tcPr>
+            <w:tcBorders>
+              <w:bottom w:val="none" w:sz="0" w:space="0" w:color="000000"/>
+              <w:top w:val="none" w:sz="0" w:space="0" w:color="000000"/>
+              <w:left w:val="none" w:sz="0" w:space="0" w:color="000000"/>
+              <w:right w:val="none" w:sz="0" w:space="0" w:color="000000"/>
+            </w:tcBorders>
+            <w:shd w:val="clear" w:color="auto" w:fill="FFFFFF"/>
+            <w:tcMar>
+              <w:top w:w="0" w:type="dxa"/>
+              <w:bottom w:w="0" w:type="dxa"/>
+              <w:left w:w="0" w:type="dxa"/>
+              <w:right w:w="0" w:type="dxa"/>
+            </w:tcMar>
+            <w:vAlign w:val="top"/>
+          </w:tcPr>
+          <w:p>
+            <w:pPr>
+              <w:pStyle w:val="Normal"/>
+              <w:jc w:val="left"/>
+              <w:pBdr>
+                <w:bottom w:val="none" w:sz="0" w:space="0" w:color="000000"/>
+                <w:top w:val="none" w:sz="0" w:space="0" w:color="000000"/>
+                <w:left w:val="none" w:sz="0" w:space="0" w:color="000000"/>
+                <w:right w:val="none" w:sz="0" w:space="0" w:color="000000"/>
+              </w:pBdr>
+              <w:spacing w:after="60" w:before="60" w:line="240"/>
+              <w:ind w:left="60" w:right="60" w:firstLine="0" w:firstLineChars="0"/>
+              <w:rPr>
+                <w:rFonts w:ascii="Arial" w:hAnsi="Arial" w:eastAsia="Arial" w:cs="Arial"/>
+                <w:i w:val="false"/>
+                <w:b w:val="false"/>
+                <w:u w:val="none"/>
+                <w:strike w:val="false"/>
+                <w:sz w:val="18"/>
+                <w:szCs w:val="18"/>
+                <w:color w:val="000000"/>
+              </w:rPr>
+            </w:pPr>
+            <w:r>
+              <w:rPr>
+                <w:rFonts w:ascii="Arial" w:hAnsi="Arial" w:eastAsia="Arial" w:cs="Arial"/>
+                <w:i w:val="false"/>
+                <w:b w:val="false"/>
+                <w:u w:val="none"/>
+                <w:strike w:val="false"/>
+                <w:sz w:val="18"/>
+                <w:szCs w:val="18"/>
+                <w:color w:val="000000"/>
+              </w:rPr>
+              <w:t xml:space="preserve">Clopidogrel vs aspirin for secondary prevention of coronary artery disease</w:t>
             </w:r>
           </w:p>
         </w:tc>
@@ -979,7 +1146,7 @@
                 <w:szCs w:val="18"/>
                 <w:color w:val="000000"/>
               </w:rPr>
-              <w:t xml:space="preserve">35 / 0 / 0</w:t>
+              <w:t xml:space="preserve">32 / 3 / 0</w:t>
             </w:r>
           </w:p>
         </w:tc>
@@ -1095,227 +1262,282 @@
                 <w:szCs w:val="18"/>
                 <w:color w:val="000000"/>
               </w:rPr>
-              <w:t xml:space="preserve">Gastroenterology</w:t>
-            </w:r>
-          </w:p>
-        </w:tc>
-        <w:tc>
-          <w:tcPr>
-            <w:tcBorders>
-              <w:bottom w:val="none" w:sz="0" w:space="0" w:color="000000"/>
-              <w:top w:val="none" w:sz="0" w:space="0" w:color="000000"/>
-              <w:left w:val="none" w:sz="0" w:space="0" w:color="000000"/>
-              <w:right w:val="none" w:sz="0" w:space="0" w:color="000000"/>
-            </w:tcBorders>
-            <w:shd w:val="clear" w:color="auto" w:fill="FFFFFF"/>
-            <w:tcMar>
-              <w:top w:w="0" w:type="dxa"/>
-              <w:bottom w:w="0" w:type="dxa"/>
-              <w:left w:w="0" w:type="dxa"/>
-              <w:right w:w="0" w:type="dxa"/>
-            </w:tcMar>
-            <w:vAlign w:val="top"/>
-          </w:tcPr>
-          <w:p>
-            <w:pPr>
-              <w:pStyle w:val="Normal"/>
-              <w:jc w:val="left"/>
-              <w:pBdr>
-                <w:bottom w:val="none" w:sz="0" w:space="0" w:color="000000"/>
-                <w:top w:val="none" w:sz="0" w:space="0" w:color="000000"/>
-                <w:left w:val="none" w:sz="0" w:space="0" w:color="000000"/>
-                <w:right w:val="none" w:sz="0" w:space="0" w:color="000000"/>
-              </w:pBdr>
-              <w:spacing w:after="60" w:before="60" w:line="240"/>
-              <w:ind w:left="60" w:right="60" w:firstLine="0" w:firstLineChars="0"/>
-              <w:rPr>
-                <w:rFonts w:ascii="Arial" w:hAnsi="Arial" w:eastAsia="Arial" w:cs="Arial"/>
-                <w:i w:val="false"/>
-                <w:b w:val="false"/>
-                <w:u w:val="none"/>
-                <w:strike w:val="false"/>
-                <w:sz w:val="18"/>
-                <w:szCs w:val="18"/>
-                <w:color w:val="000000"/>
-              </w:rPr>
-            </w:pPr>
-            <w:r>
-              <w:rPr>
-                <w:rFonts w:ascii="Arial" w:hAnsi="Arial" w:eastAsia="Arial" w:cs="Arial"/>
-                <w:i w:val="false"/>
-                <w:b w:val="false"/>
-                <w:u w:val="none"/>
-                <w:strike w:val="false"/>
-                <w:sz w:val="18"/>
-                <w:szCs w:val="18"/>
-                <w:color w:val="000000"/>
-              </w:rPr>
-              <w:t xml:space="preserve">Gastroenterology; 2025</w:t>
-            </w:r>
-          </w:p>
-        </w:tc>
-        <w:tc>
-          <w:tcPr>
-            <w:tcBorders>
-              <w:bottom w:val="none" w:sz="0" w:space="0" w:color="000000"/>
-              <w:top w:val="none" w:sz="0" w:space="0" w:color="000000"/>
-              <w:left w:val="none" w:sz="0" w:space="0" w:color="000000"/>
-              <w:right w:val="none" w:sz="0" w:space="0" w:color="000000"/>
-            </w:tcBorders>
-            <w:shd w:val="clear" w:color="auto" w:fill="FFFFFF"/>
-            <w:tcMar>
-              <w:top w:w="0" w:type="dxa"/>
-              <w:bottom w:w="0" w:type="dxa"/>
-              <w:left w:w="0" w:type="dxa"/>
-              <w:right w:w="0" w:type="dxa"/>
-            </w:tcMar>
-            <w:vAlign w:val="top"/>
-          </w:tcPr>
-          <w:p>
-            <w:pPr>
-              <w:pStyle w:val="Normal"/>
-              <w:jc w:val="left"/>
-              <w:pBdr>
-                <w:bottom w:val="none" w:sz="0" w:space="0" w:color="000000"/>
-                <w:top w:val="none" w:sz="0" w:space="0" w:color="000000"/>
-                <w:left w:val="none" w:sz="0" w:space="0" w:color="000000"/>
-                <w:right w:val="none" w:sz="0" w:space="0" w:color="000000"/>
-              </w:pBdr>
-              <w:spacing w:after="60" w:before="60" w:line="240"/>
-              <w:ind w:left="60" w:right="60" w:firstLine="0" w:firstLineChars="0"/>
-              <w:rPr>
-                <w:rFonts w:ascii="Arial" w:hAnsi="Arial" w:eastAsia="Arial" w:cs="Arial"/>
-                <w:i w:val="false"/>
-                <w:b w:val="false"/>
-                <w:u w:val="none"/>
-                <w:strike w:val="false"/>
-                <w:sz w:val="18"/>
-                <w:szCs w:val="18"/>
-                <w:color w:val="000000"/>
-              </w:rPr>
-            </w:pPr>
-            <w:r>
-              <w:rPr>
-                <w:rFonts w:ascii="Arial" w:hAnsi="Arial" w:eastAsia="Arial" w:cs="Arial"/>
-                <w:i w:val="false"/>
-                <w:b w:val="false"/>
-                <w:u w:val="none"/>
-                <w:strike w:val="false"/>
-                <w:sz w:val="18"/>
-                <w:szCs w:val="18"/>
-                <w:color w:val="000000"/>
-              </w:rPr>
-              <w:t xml:space="preserve">GLP-1 receptor agonists and gastrointestinal adverse events</w:t>
-            </w:r>
-          </w:p>
-        </w:tc>
-        <w:tc>
-          <w:tcPr>
-            <w:tcBorders>
-              <w:bottom w:val="none" w:sz="0" w:space="0" w:color="000000"/>
-              <w:top w:val="none" w:sz="0" w:space="0" w:color="000000"/>
-              <w:left w:val="none" w:sz="0" w:space="0" w:color="000000"/>
-              <w:right w:val="none" w:sz="0" w:space="0" w:color="000000"/>
-            </w:tcBorders>
-            <w:shd w:val="clear" w:color="auto" w:fill="FFFFFF"/>
-            <w:tcMar>
-              <w:top w:w="0" w:type="dxa"/>
-              <w:bottom w:w="0" w:type="dxa"/>
-              <w:left w:w="0" w:type="dxa"/>
-              <w:right w:w="0" w:type="dxa"/>
-            </w:tcMar>
-            <w:vAlign w:val="top"/>
-          </w:tcPr>
-          <w:p>
-            <w:pPr>
-              <w:pStyle w:val="Normal"/>
-              <w:jc w:val="left"/>
-              <w:pBdr>
-                <w:bottom w:val="none" w:sz="0" w:space="0" w:color="000000"/>
-                <w:top w:val="none" w:sz="0" w:space="0" w:color="000000"/>
-                <w:left w:val="none" w:sz="0" w:space="0" w:color="000000"/>
-                <w:right w:val="none" w:sz="0" w:space="0" w:color="000000"/>
-              </w:pBdr>
-              <w:spacing w:after="60" w:before="60" w:line="240"/>
-              <w:ind w:left="60" w:right="60" w:firstLine="0" w:firstLineChars="0"/>
-              <w:rPr>
-                <w:rFonts w:ascii="Arial" w:hAnsi="Arial" w:eastAsia="Arial" w:cs="Arial"/>
-                <w:i w:val="false"/>
-                <w:b w:val="false"/>
-                <w:u w:val="none"/>
-                <w:strike w:val="false"/>
-                <w:sz w:val="18"/>
-                <w:szCs w:val="18"/>
-                <w:color w:val="000000"/>
-              </w:rPr>
-            </w:pPr>
-            <w:r>
-              <w:rPr>
-                <w:rFonts w:ascii="Arial" w:hAnsi="Arial" w:eastAsia="Arial" w:cs="Arial"/>
-                <w:i w:val="false"/>
-                <w:b w:val="false"/>
-                <w:u w:val="none"/>
-                <w:strike w:val="false"/>
-                <w:sz w:val="18"/>
-                <w:szCs w:val="18"/>
-                <w:color w:val="000000"/>
-              </w:rPr>
-              <w:t xml:space="preserve">7</w:t>
-            </w:r>
-          </w:p>
-        </w:tc>
-        <w:tc>
-          <w:tcPr>
-            <w:tcBorders>
-              <w:bottom w:val="none" w:sz="0" w:space="0" w:color="000000"/>
-              <w:top w:val="none" w:sz="0" w:space="0" w:color="000000"/>
-              <w:left w:val="none" w:sz="0" w:space="0" w:color="000000"/>
-              <w:right w:val="none" w:sz="0" w:space="0" w:color="000000"/>
-            </w:tcBorders>
-            <w:shd w:val="clear" w:color="auto" w:fill="FFFFFF"/>
-            <w:tcMar>
-              <w:top w:w="0" w:type="dxa"/>
-              <w:bottom w:w="0" w:type="dxa"/>
-              <w:left w:w="0" w:type="dxa"/>
-              <w:right w:w="0" w:type="dxa"/>
-            </w:tcMar>
-            <w:vAlign w:val="top"/>
-          </w:tcPr>
-          <w:p>
-            <w:pPr>
-              <w:pStyle w:val="Normal"/>
-              <w:jc w:val="left"/>
-              <w:pBdr>
-                <w:bottom w:val="none" w:sz="0" w:space="0" w:color="000000"/>
-                <w:top w:val="none" w:sz="0" w:space="0" w:color="000000"/>
-                <w:left w:val="none" w:sz="0" w:space="0" w:color="000000"/>
-                <w:right w:val="none" w:sz="0" w:space="0" w:color="000000"/>
-              </w:pBdr>
-              <w:spacing w:after="60" w:before="60" w:line="240"/>
-              <w:ind w:left="60" w:right="60" w:firstLine="0" w:firstLineChars="0"/>
-              <w:rPr>
-                <w:rFonts w:ascii="Arial" w:hAnsi="Arial" w:eastAsia="Arial" w:cs="Arial"/>
-                <w:i w:val="false"/>
-                <w:b w:val="false"/>
-                <w:u w:val="none"/>
-                <w:strike w:val="false"/>
-                <w:sz w:val="18"/>
-                <w:szCs w:val="18"/>
-                <w:color w:val="000000"/>
-              </w:rPr>
-            </w:pPr>
-            <w:r>
-              <w:rPr>
-                <w:rFonts w:ascii="Arial" w:hAnsi="Arial" w:eastAsia="Arial" w:cs="Arial"/>
-                <w:i w:val="false"/>
-                <w:b w:val="false"/>
-                <w:u w:val="none"/>
-                <w:strike w:val="false"/>
-                <w:sz w:val="18"/>
-                <w:szCs w:val="18"/>
-                <w:color w:val="000000"/>
-              </w:rPr>
-              <w:t xml:space="preserve">31 / 4 / 0</w:t>
+              <w:t xml:space="preserve">Cardiology</w:t>
+            </w:r>
+          </w:p>
+        </w:tc>
+        <w:tc>
+          <w:tcPr>
+            <w:tcBorders>
+              <w:bottom w:val="none" w:sz="0" w:space="0" w:color="000000"/>
+              <w:top w:val="none" w:sz="0" w:space="0" w:color="000000"/>
+              <w:left w:val="none" w:sz="0" w:space="0" w:color="000000"/>
+              <w:right w:val="none" w:sz="0" w:space="0" w:color="000000"/>
+            </w:tcBorders>
+            <w:shd w:val="clear" w:color="auto" w:fill="FFFFFF"/>
+            <w:tcMar>
+              <w:top w:w="0" w:type="dxa"/>
+              <w:bottom w:w="0" w:type="dxa"/>
+              <w:left w:w="0" w:type="dxa"/>
+              <w:right w:w="0" w:type="dxa"/>
+            </w:tcMar>
+            <w:vAlign w:val="top"/>
+          </w:tcPr>
+          <w:p>
+            <w:pPr>
+              <w:pStyle w:val="Normal"/>
+              <w:jc w:val="left"/>
+              <w:pBdr>
+                <w:bottom w:val="none" w:sz="0" w:space="0" w:color="000000"/>
+                <w:top w:val="none" w:sz="0" w:space="0" w:color="000000"/>
+                <w:left w:val="none" w:sz="0" w:space="0" w:color="000000"/>
+                <w:right w:val="none" w:sz="0" w:space="0" w:color="000000"/>
+              </w:pBdr>
+              <w:spacing w:after="60" w:before="60" w:line="240"/>
+              <w:ind w:left="60" w:right="60" w:firstLine="0" w:firstLineChars="0"/>
+              <w:rPr>
+                <w:rFonts w:ascii="Arial" w:hAnsi="Arial" w:eastAsia="Arial" w:cs="Arial"/>
+                <w:i w:val="false"/>
+                <w:b w:val="false"/>
+                <w:u w:val="none"/>
+                <w:strike w:val="false"/>
+                <w:sz w:val="18"/>
+                <w:szCs w:val="18"/>
+                <w:color w:val="000000"/>
+              </w:rPr>
+            </w:pPr>
+            <w:r>
+              <w:rPr>
+                <w:rFonts w:ascii="Arial" w:hAnsi="Arial" w:eastAsia="Arial" w:cs="Arial"/>
+                <w:i w:val="false"/>
+                <w:b w:val="false"/>
+                <w:u w:val="none"/>
+                <w:strike w:val="false"/>
+                <w:sz w:val="18"/>
+                <w:szCs w:val="18"/>
+                <w:color w:val="000000"/>
+              </w:rPr>
+              <w:t xml:space="preserve">J Am Coll Cardiol</w:t>
+            </w:r>
+          </w:p>
+        </w:tc>
+        <w:tc>
+          <w:tcPr>
+            <w:tcBorders>
+              <w:bottom w:val="none" w:sz="0" w:space="0" w:color="000000"/>
+              <w:top w:val="none" w:sz="0" w:space="0" w:color="000000"/>
+              <w:left w:val="none" w:sz="0" w:space="0" w:color="000000"/>
+              <w:right w:val="none" w:sz="0" w:space="0" w:color="000000"/>
+            </w:tcBorders>
+            <w:shd w:val="clear" w:color="auto" w:fill="FFFFFF"/>
+            <w:tcMar>
+              <w:top w:w="0" w:type="dxa"/>
+              <w:bottom w:w="0" w:type="dxa"/>
+              <w:left w:w="0" w:type="dxa"/>
+              <w:right w:w="0" w:type="dxa"/>
+            </w:tcMar>
+            <w:vAlign w:val="top"/>
+          </w:tcPr>
+          <w:p>
+            <w:pPr>
+              <w:pStyle w:val="Normal"/>
+              <w:jc w:val="left"/>
+              <w:pBdr>
+                <w:bottom w:val="none" w:sz="0" w:space="0" w:color="000000"/>
+                <w:top w:val="none" w:sz="0" w:space="0" w:color="000000"/>
+                <w:left w:val="none" w:sz="0" w:space="0" w:color="000000"/>
+                <w:right w:val="none" w:sz="0" w:space="0" w:color="000000"/>
+              </w:pBdr>
+              <w:spacing w:after="60" w:before="60" w:line="240"/>
+              <w:ind w:left="60" w:right="60" w:firstLine="0" w:firstLineChars="0"/>
+              <w:rPr>
+                <w:rFonts w:ascii="Arial" w:hAnsi="Arial" w:eastAsia="Arial" w:cs="Arial"/>
+                <w:i w:val="false"/>
+                <w:b w:val="false"/>
+                <w:u w:val="none"/>
+                <w:strike w:val="false"/>
+                <w:sz w:val="18"/>
+                <w:szCs w:val="18"/>
+                <w:color w:val="000000"/>
+              </w:rPr>
+            </w:pPr>
+            <w:r>
+              <w:rPr>
+                <w:rFonts w:ascii="Arial" w:hAnsi="Arial" w:eastAsia="Arial" w:cs="Arial"/>
+                <w:i w:val="false"/>
+                <w:b w:val="false"/>
+                <w:u w:val="none"/>
+                <w:strike w:val="false"/>
+                <w:sz w:val="18"/>
+                <w:szCs w:val="18"/>
+                <w:color w:val="000000"/>
+              </w:rPr>
+              <w:t xml:space="preserve">2025</w:t>
+            </w:r>
+          </w:p>
+        </w:tc>
+        <w:tc>
+          <w:tcPr>
+            <w:tcBorders>
+              <w:bottom w:val="none" w:sz="0" w:space="0" w:color="000000"/>
+              <w:top w:val="none" w:sz="0" w:space="0" w:color="000000"/>
+              <w:left w:val="none" w:sz="0" w:space="0" w:color="000000"/>
+              <w:right w:val="none" w:sz="0" w:space="0" w:color="000000"/>
+            </w:tcBorders>
+            <w:shd w:val="clear" w:color="auto" w:fill="FFFFFF"/>
+            <w:tcMar>
+              <w:top w:w="0" w:type="dxa"/>
+              <w:bottom w:w="0" w:type="dxa"/>
+              <w:left w:w="0" w:type="dxa"/>
+              <w:right w:w="0" w:type="dxa"/>
+            </w:tcMar>
+            <w:vAlign w:val="top"/>
+          </w:tcPr>
+          <w:p>
+            <w:pPr>
+              <w:pStyle w:val="Normal"/>
+              <w:jc w:val="left"/>
+              <w:pBdr>
+                <w:bottom w:val="none" w:sz="0" w:space="0" w:color="000000"/>
+                <w:top w:val="none" w:sz="0" w:space="0" w:color="000000"/>
+                <w:left w:val="none" w:sz="0" w:space="0" w:color="000000"/>
+                <w:right w:val="none" w:sz="0" w:space="0" w:color="000000"/>
+              </w:pBdr>
+              <w:spacing w:after="60" w:before="60" w:line="240"/>
+              <w:ind w:left="60" w:right="60" w:firstLine="0" w:firstLineChars="0"/>
+              <w:rPr>
+                <w:rFonts w:ascii="Arial" w:hAnsi="Arial" w:eastAsia="Arial" w:cs="Arial"/>
+                <w:i w:val="false"/>
+                <w:b w:val="false"/>
+                <w:u w:val="none"/>
+                <w:strike w:val="false"/>
+                <w:sz w:val="18"/>
+                <w:szCs w:val="18"/>
+                <w:color w:val="000000"/>
+              </w:rPr>
+            </w:pPr>
+            <w:r>
+              <w:rPr>
+                <w:rFonts w:ascii="Arial" w:hAnsi="Arial" w:eastAsia="Arial" w:cs="Arial"/>
+                <w:i w:val="false"/>
+                <w:b w:val="false"/>
+                <w:u w:val="none"/>
+                <w:strike w:val="false"/>
+                <w:sz w:val="18"/>
+                <w:szCs w:val="18"/>
+                <w:color w:val="000000"/>
+              </w:rPr>
+              <w:t xml:space="preserve">Early aortic valve replacement vs surveillance in asymptomatic severe aortic stenosis</w:t>
+            </w:r>
+          </w:p>
+        </w:tc>
+        <w:tc>
+          <w:tcPr>
+            <w:tcBorders>
+              <w:bottom w:val="none" w:sz="0" w:space="0" w:color="000000"/>
+              <w:top w:val="none" w:sz="0" w:space="0" w:color="000000"/>
+              <w:left w:val="none" w:sz="0" w:space="0" w:color="000000"/>
+              <w:right w:val="none" w:sz="0" w:space="0" w:color="000000"/>
+            </w:tcBorders>
+            <w:shd w:val="clear" w:color="auto" w:fill="FFFFFF"/>
+            <w:tcMar>
+              <w:top w:w="0" w:type="dxa"/>
+              <w:bottom w:w="0" w:type="dxa"/>
+              <w:left w:w="0" w:type="dxa"/>
+              <w:right w:w="0" w:type="dxa"/>
+            </w:tcMar>
+            <w:vAlign w:val="top"/>
+          </w:tcPr>
+          <w:p>
+            <w:pPr>
+              <w:pStyle w:val="Normal"/>
+              <w:jc w:val="left"/>
+              <w:pBdr>
+                <w:bottom w:val="none" w:sz="0" w:space="0" w:color="000000"/>
+                <w:top w:val="none" w:sz="0" w:space="0" w:color="000000"/>
+                <w:left w:val="none" w:sz="0" w:space="0" w:color="000000"/>
+                <w:right w:val="none" w:sz="0" w:space="0" w:color="000000"/>
+              </w:pBdr>
+              <w:spacing w:after="60" w:before="60" w:line="240"/>
+              <w:ind w:left="60" w:right="60" w:firstLine="0" w:firstLineChars="0"/>
+              <w:rPr>
+                <w:rFonts w:ascii="Arial" w:hAnsi="Arial" w:eastAsia="Arial" w:cs="Arial"/>
+                <w:i w:val="false"/>
+                <w:b w:val="false"/>
+                <w:u w:val="none"/>
+                <w:strike w:val="false"/>
+                <w:sz w:val="18"/>
+                <w:szCs w:val="18"/>
+                <w:color w:val="000000"/>
+              </w:rPr>
+            </w:pPr>
+            <w:r>
+              <w:rPr>
+                <w:rFonts w:ascii="Arial" w:hAnsi="Arial" w:eastAsia="Arial" w:cs="Arial"/>
+                <w:i w:val="false"/>
+                <w:b w:val="false"/>
+                <w:u w:val="none"/>
+                <w:strike w:val="false"/>
+                <w:sz w:val="18"/>
+                <w:szCs w:val="18"/>
+                <w:color w:val="000000"/>
+              </w:rPr>
+              <w:t xml:space="preserve">2</w:t>
+            </w:r>
+          </w:p>
+        </w:tc>
+        <w:tc>
+          <w:tcPr>
+            <w:tcBorders>
+              <w:bottom w:val="none" w:sz="0" w:space="0" w:color="000000"/>
+              <w:top w:val="none" w:sz="0" w:space="0" w:color="000000"/>
+              <w:left w:val="none" w:sz="0" w:space="0" w:color="000000"/>
+              <w:right w:val="none" w:sz="0" w:space="0" w:color="000000"/>
+            </w:tcBorders>
+            <w:shd w:val="clear" w:color="auto" w:fill="FFFFFF"/>
+            <w:tcMar>
+              <w:top w:w="0" w:type="dxa"/>
+              <w:bottom w:w="0" w:type="dxa"/>
+              <w:left w:w="0" w:type="dxa"/>
+              <w:right w:w="0" w:type="dxa"/>
+            </w:tcMar>
+            <w:vAlign w:val="top"/>
+          </w:tcPr>
+          <w:p>
+            <w:pPr>
+              <w:pStyle w:val="Normal"/>
+              <w:jc w:val="left"/>
+              <w:pBdr>
+                <w:bottom w:val="none" w:sz="0" w:space="0" w:color="000000"/>
+                <w:top w:val="none" w:sz="0" w:space="0" w:color="000000"/>
+                <w:left w:val="none" w:sz="0" w:space="0" w:color="000000"/>
+                <w:right w:val="none" w:sz="0" w:space="0" w:color="000000"/>
+              </w:pBdr>
+              <w:spacing w:after="60" w:before="60" w:line="240"/>
+              <w:ind w:left="60" w:right="60" w:firstLine="0" w:firstLineChars="0"/>
+              <w:rPr>
+                <w:rFonts w:ascii="Arial" w:hAnsi="Arial" w:eastAsia="Arial" w:cs="Arial"/>
+                <w:i w:val="false"/>
+                <w:b w:val="false"/>
+                <w:u w:val="none"/>
+                <w:strike w:val="false"/>
+                <w:sz w:val="18"/>
+                <w:szCs w:val="18"/>
+                <w:color w:val="000000"/>
+              </w:rPr>
+            </w:pPr>
+            <w:r>
+              <w:rPr>
+                <w:rFonts w:ascii="Arial" w:hAnsi="Arial" w:eastAsia="Arial" w:cs="Arial"/>
+                <w:i w:val="false"/>
+                <w:b w:val="false"/>
+                <w:u w:val="none"/>
+                <w:strike w:val="false"/>
+                <w:sz w:val="18"/>
+                <w:szCs w:val="18"/>
+                <w:color w:val="000000"/>
+              </w:rPr>
+              <w:t xml:space="preserve">10 / 0 / 0</w:t>
             </w:r>
           </w:p>
         </w:tc>
@@ -1431,117 +1653,172 @@
                 <w:szCs w:val="18"/>
                 <w:color w:val="000000"/>
               </w:rPr>
-              <w:t xml:space="preserve">General medicine</w:t>
-            </w:r>
-          </w:p>
-        </w:tc>
-        <w:tc>
-          <w:tcPr>
-            <w:tcBorders>
-              <w:bottom w:val="none" w:sz="0" w:space="0" w:color="000000"/>
-              <w:top w:val="none" w:sz="0" w:space="0" w:color="000000"/>
-              <w:left w:val="none" w:sz="0" w:space="0" w:color="000000"/>
-              <w:right w:val="none" w:sz="0" w:space="0" w:color="000000"/>
-            </w:tcBorders>
-            <w:shd w:val="clear" w:color="auto" w:fill="FFFFFF"/>
-            <w:tcMar>
-              <w:top w:w="0" w:type="dxa"/>
-              <w:bottom w:w="0" w:type="dxa"/>
-              <w:left w:w="0" w:type="dxa"/>
-              <w:right w:w="0" w:type="dxa"/>
-            </w:tcMar>
-            <w:vAlign w:val="top"/>
-          </w:tcPr>
-          <w:p>
-            <w:pPr>
-              <w:pStyle w:val="Normal"/>
-              <w:jc w:val="left"/>
-              <w:pBdr>
-                <w:bottom w:val="none" w:sz="0" w:space="0" w:color="000000"/>
-                <w:top w:val="none" w:sz="0" w:space="0" w:color="000000"/>
-                <w:left w:val="none" w:sz="0" w:space="0" w:color="000000"/>
-                <w:right w:val="none" w:sz="0" w:space="0" w:color="000000"/>
-              </w:pBdr>
-              <w:spacing w:after="60" w:before="60" w:line="240"/>
-              <w:ind w:left="60" w:right="60" w:firstLine="0" w:firstLineChars="0"/>
-              <w:rPr>
-                <w:rFonts w:ascii="Arial" w:hAnsi="Arial" w:eastAsia="Arial" w:cs="Arial"/>
-                <w:i w:val="false"/>
-                <w:b w:val="false"/>
-                <w:u w:val="none"/>
-                <w:strike w:val="false"/>
-                <w:sz w:val="18"/>
-                <w:szCs w:val="18"/>
-                <w:color w:val="000000"/>
-              </w:rPr>
-            </w:pPr>
-            <w:r>
-              <w:rPr>
-                <w:rFonts w:ascii="Arial" w:hAnsi="Arial" w:eastAsia="Arial" w:cs="Arial"/>
-                <w:i w:val="false"/>
-                <w:b w:val="false"/>
-                <w:u w:val="none"/>
-                <w:strike w:val="false"/>
-                <w:sz w:val="18"/>
-                <w:szCs w:val="18"/>
-                <w:color w:val="000000"/>
-              </w:rPr>
-              <w:t xml:space="preserve">JAMA; 2026</w:t>
-            </w:r>
-          </w:p>
-        </w:tc>
-        <w:tc>
-          <w:tcPr>
-            <w:tcBorders>
-              <w:bottom w:val="none" w:sz="0" w:space="0" w:color="000000"/>
-              <w:top w:val="none" w:sz="0" w:space="0" w:color="000000"/>
-              <w:left w:val="none" w:sz="0" w:space="0" w:color="000000"/>
-              <w:right w:val="none" w:sz="0" w:space="0" w:color="000000"/>
-            </w:tcBorders>
-            <w:shd w:val="clear" w:color="auto" w:fill="FFFFFF"/>
-            <w:tcMar>
-              <w:top w:w="0" w:type="dxa"/>
-              <w:bottom w:w="0" w:type="dxa"/>
-              <w:left w:w="0" w:type="dxa"/>
-              <w:right w:w="0" w:type="dxa"/>
-            </w:tcMar>
-            <w:vAlign w:val="top"/>
-          </w:tcPr>
-          <w:p>
-            <w:pPr>
-              <w:pStyle w:val="Normal"/>
-              <w:jc w:val="left"/>
-              <w:pBdr>
-                <w:bottom w:val="none" w:sz="0" w:space="0" w:color="000000"/>
-                <w:top w:val="none" w:sz="0" w:space="0" w:color="000000"/>
-                <w:left w:val="none" w:sz="0" w:space="0" w:color="000000"/>
-                <w:right w:val="none" w:sz="0" w:space="0" w:color="000000"/>
-              </w:pBdr>
-              <w:spacing w:after="60" w:before="60" w:line="240"/>
-              <w:ind w:left="60" w:right="60" w:firstLine="0" w:firstLineChars="0"/>
-              <w:rPr>
-                <w:rFonts w:ascii="Arial" w:hAnsi="Arial" w:eastAsia="Arial" w:cs="Arial"/>
-                <w:i w:val="false"/>
-                <w:b w:val="false"/>
-                <w:u w:val="none"/>
-                <w:strike w:val="false"/>
-                <w:sz w:val="18"/>
-                <w:szCs w:val="18"/>
-                <w:color w:val="000000"/>
-              </w:rPr>
-            </w:pPr>
-            <w:r>
-              <w:rPr>
-                <w:rFonts w:ascii="Arial" w:hAnsi="Arial" w:eastAsia="Arial" w:cs="Arial"/>
-                <w:i w:val="false"/>
-                <w:b w:val="false"/>
-                <w:u w:val="none"/>
-                <w:strike w:val="false"/>
-                <w:sz w:val="18"/>
-                <w:szCs w:val="18"/>
-                <w:color w:val="000000"/>
-              </w:rPr>
-              <w:t xml:space="preserve">SGLT2 inhibitors and kidney outcomes across eGFR and albuminuria</w:t>
+              <w:t xml:space="preserve">Endocrinology</w:t>
+            </w:r>
+          </w:p>
+        </w:tc>
+        <w:tc>
+          <w:tcPr>
+            <w:tcBorders>
+              <w:bottom w:val="none" w:sz="0" w:space="0" w:color="000000"/>
+              <w:top w:val="none" w:sz="0" w:space="0" w:color="000000"/>
+              <w:left w:val="none" w:sz="0" w:space="0" w:color="000000"/>
+              <w:right w:val="none" w:sz="0" w:space="0" w:color="000000"/>
+            </w:tcBorders>
+            <w:shd w:val="clear" w:color="auto" w:fill="FFFFFF"/>
+            <w:tcMar>
+              <w:top w:w="0" w:type="dxa"/>
+              <w:bottom w:w="0" w:type="dxa"/>
+              <w:left w:w="0" w:type="dxa"/>
+              <w:right w:w="0" w:type="dxa"/>
+            </w:tcMar>
+            <w:vAlign w:val="top"/>
+          </w:tcPr>
+          <w:p>
+            <w:pPr>
+              <w:pStyle w:val="Normal"/>
+              <w:jc w:val="left"/>
+              <w:pBdr>
+                <w:bottom w:val="none" w:sz="0" w:space="0" w:color="000000"/>
+                <w:top w:val="none" w:sz="0" w:space="0" w:color="000000"/>
+                <w:left w:val="none" w:sz="0" w:space="0" w:color="000000"/>
+                <w:right w:val="none" w:sz="0" w:space="0" w:color="000000"/>
+              </w:pBdr>
+              <w:spacing w:after="60" w:before="60" w:line="240"/>
+              <w:ind w:left="60" w:right="60" w:firstLine="0" w:firstLineChars="0"/>
+              <w:rPr>
+                <w:rFonts w:ascii="Arial" w:hAnsi="Arial" w:eastAsia="Arial" w:cs="Arial"/>
+                <w:i w:val="false"/>
+                <w:b w:val="false"/>
+                <w:u w:val="none"/>
+                <w:strike w:val="false"/>
+                <w:sz w:val="18"/>
+                <w:szCs w:val="18"/>
+                <w:color w:val="000000"/>
+              </w:rPr>
+            </w:pPr>
+            <w:r>
+              <w:rPr>
+                <w:rFonts w:ascii="Arial" w:hAnsi="Arial" w:eastAsia="Arial" w:cs="Arial"/>
+                <w:i w:val="false"/>
+                <w:b w:val="false"/>
+                <w:u w:val="none"/>
+                <w:strike w:val="false"/>
+                <w:sz w:val="18"/>
+                <w:szCs w:val="18"/>
+                <w:color w:val="000000"/>
+              </w:rPr>
+              <w:t xml:space="preserve">Lancet Diabetes Endocrinol</w:t>
+            </w:r>
+          </w:p>
+        </w:tc>
+        <w:tc>
+          <w:tcPr>
+            <w:tcBorders>
+              <w:bottom w:val="none" w:sz="0" w:space="0" w:color="000000"/>
+              <w:top w:val="none" w:sz="0" w:space="0" w:color="000000"/>
+              <w:left w:val="none" w:sz="0" w:space="0" w:color="000000"/>
+              <w:right w:val="none" w:sz="0" w:space="0" w:color="000000"/>
+            </w:tcBorders>
+            <w:shd w:val="clear" w:color="auto" w:fill="FFFFFF"/>
+            <w:tcMar>
+              <w:top w:w="0" w:type="dxa"/>
+              <w:bottom w:w="0" w:type="dxa"/>
+              <w:left w:w="0" w:type="dxa"/>
+              <w:right w:w="0" w:type="dxa"/>
+            </w:tcMar>
+            <w:vAlign w:val="top"/>
+          </w:tcPr>
+          <w:p>
+            <w:pPr>
+              <w:pStyle w:val="Normal"/>
+              <w:jc w:val="left"/>
+              <w:pBdr>
+                <w:bottom w:val="none" w:sz="0" w:space="0" w:color="000000"/>
+                <w:top w:val="none" w:sz="0" w:space="0" w:color="000000"/>
+                <w:left w:val="none" w:sz="0" w:space="0" w:color="000000"/>
+                <w:right w:val="none" w:sz="0" w:space="0" w:color="000000"/>
+              </w:pBdr>
+              <w:spacing w:after="60" w:before="60" w:line="240"/>
+              <w:ind w:left="60" w:right="60" w:firstLine="0" w:firstLineChars="0"/>
+              <w:rPr>
+                <w:rFonts w:ascii="Arial" w:hAnsi="Arial" w:eastAsia="Arial" w:cs="Arial"/>
+                <w:i w:val="false"/>
+                <w:b w:val="false"/>
+                <w:u w:val="none"/>
+                <w:strike w:val="false"/>
+                <w:sz w:val="18"/>
+                <w:szCs w:val="18"/>
+                <w:color w:val="000000"/>
+              </w:rPr>
+            </w:pPr>
+            <w:r>
+              <w:rPr>
+                <w:rFonts w:ascii="Arial" w:hAnsi="Arial" w:eastAsia="Arial" w:cs="Arial"/>
+                <w:i w:val="false"/>
+                <w:b w:val="false"/>
+                <w:u w:val="none"/>
+                <w:strike w:val="false"/>
+                <w:sz w:val="18"/>
+                <w:szCs w:val="18"/>
+                <w:color w:val="000000"/>
+              </w:rPr>
+              <w:t xml:space="preserve">2025</w:t>
+            </w:r>
+          </w:p>
+        </w:tc>
+        <w:tc>
+          <w:tcPr>
+            <w:tcBorders>
+              <w:bottom w:val="none" w:sz="0" w:space="0" w:color="000000"/>
+              <w:top w:val="none" w:sz="0" w:space="0" w:color="000000"/>
+              <w:left w:val="none" w:sz="0" w:space="0" w:color="000000"/>
+              <w:right w:val="none" w:sz="0" w:space="0" w:color="000000"/>
+            </w:tcBorders>
+            <w:shd w:val="clear" w:color="auto" w:fill="FFFFFF"/>
+            <w:tcMar>
+              <w:top w:w="0" w:type="dxa"/>
+              <w:bottom w:w="0" w:type="dxa"/>
+              <w:left w:w="0" w:type="dxa"/>
+              <w:right w:w="0" w:type="dxa"/>
+            </w:tcMar>
+            <w:vAlign w:val="top"/>
+          </w:tcPr>
+          <w:p>
+            <w:pPr>
+              <w:pStyle w:val="Normal"/>
+              <w:jc w:val="left"/>
+              <w:pBdr>
+                <w:bottom w:val="none" w:sz="0" w:space="0" w:color="000000"/>
+                <w:top w:val="none" w:sz="0" w:space="0" w:color="000000"/>
+                <w:left w:val="none" w:sz="0" w:space="0" w:color="000000"/>
+                <w:right w:val="none" w:sz="0" w:space="0" w:color="000000"/>
+              </w:pBdr>
+              <w:spacing w:after="60" w:before="60" w:line="240"/>
+              <w:ind w:left="60" w:right="60" w:firstLine="0" w:firstLineChars="0"/>
+              <w:rPr>
+                <w:rFonts w:ascii="Arial" w:hAnsi="Arial" w:eastAsia="Arial" w:cs="Arial"/>
+                <w:i w:val="false"/>
+                <w:b w:val="false"/>
+                <w:u w:val="none"/>
+                <w:strike w:val="false"/>
+                <w:sz w:val="18"/>
+                <w:szCs w:val="18"/>
+                <w:color w:val="000000"/>
+              </w:rPr>
+            </w:pPr>
+            <w:r>
+              <w:rPr>
+                <w:rFonts w:ascii="Arial" w:hAnsi="Arial" w:eastAsia="Arial" w:cs="Arial"/>
+                <w:i w:val="false"/>
+                <w:b w:val="false"/>
+                <w:u w:val="none"/>
+                <w:strike w:val="false"/>
+                <w:sz w:val="18"/>
+                <w:szCs w:val="18"/>
+                <w:color w:val="000000"/>
+              </w:rPr>
+              <w:t xml:space="preserve">GLP-1 receptor agonists and kidney and cardiovascular outcomes</w:t>
             </w:r>
           </w:p>
         </w:tc>
@@ -1706,7 +1983,7 @@
                 <w:szCs w:val="18"/>
                 <w:color w:val="000000"/>
               </w:rPr>
-              <w:t xml:space="preserve">No</w:t>
+              <w:t xml:space="preserve">Yes</w:t>
             </w:r>
           </w:p>
         </w:tc>
@@ -1767,117 +2044,172 @@
                 <w:szCs w:val="18"/>
                 <w:color w:val="000000"/>
               </w:rPr>
-              <w:t xml:space="preserve">General medicine</w:t>
-            </w:r>
-          </w:p>
-        </w:tc>
-        <w:tc>
-          <w:tcPr>
-            <w:tcBorders>
-              <w:bottom w:val="none" w:sz="0" w:space="0" w:color="000000"/>
-              <w:top w:val="none" w:sz="0" w:space="0" w:color="000000"/>
-              <w:left w:val="none" w:sz="0" w:space="0" w:color="000000"/>
-              <w:right w:val="none" w:sz="0" w:space="0" w:color="000000"/>
-            </w:tcBorders>
-            <w:shd w:val="clear" w:color="auto" w:fill="FFFFFF"/>
-            <w:tcMar>
-              <w:top w:w="0" w:type="dxa"/>
-              <w:bottom w:w="0" w:type="dxa"/>
-              <w:left w:w="0" w:type="dxa"/>
-              <w:right w:w="0" w:type="dxa"/>
-            </w:tcMar>
-            <w:vAlign w:val="top"/>
-          </w:tcPr>
-          <w:p>
-            <w:pPr>
-              <w:pStyle w:val="Normal"/>
-              <w:jc w:val="left"/>
-              <w:pBdr>
-                <w:bottom w:val="none" w:sz="0" w:space="0" w:color="000000"/>
-                <w:top w:val="none" w:sz="0" w:space="0" w:color="000000"/>
-                <w:left w:val="none" w:sz="0" w:space="0" w:color="000000"/>
-                <w:right w:val="none" w:sz="0" w:space="0" w:color="000000"/>
-              </w:pBdr>
-              <w:spacing w:after="60" w:before="60" w:line="240"/>
-              <w:ind w:left="60" w:right="60" w:firstLine="0" w:firstLineChars="0"/>
-              <w:rPr>
-                <w:rFonts w:ascii="Arial" w:hAnsi="Arial" w:eastAsia="Arial" w:cs="Arial"/>
-                <w:i w:val="false"/>
-                <w:b w:val="false"/>
-                <w:u w:val="none"/>
-                <w:strike w:val="false"/>
-                <w:sz w:val="18"/>
-                <w:szCs w:val="18"/>
-                <w:color w:val="000000"/>
-              </w:rPr>
-            </w:pPr>
-            <w:r>
-              <w:rPr>
-                <w:rFonts w:ascii="Arial" w:hAnsi="Arial" w:eastAsia="Arial" w:cs="Arial"/>
-                <w:i w:val="false"/>
-                <w:b w:val="false"/>
-                <w:u w:val="none"/>
-                <w:strike w:val="false"/>
-                <w:sz w:val="18"/>
-                <w:szCs w:val="18"/>
-                <w:color w:val="000000"/>
-              </w:rPr>
-              <w:t xml:space="preserve">The Lancet; 2025</w:t>
-            </w:r>
-          </w:p>
-        </w:tc>
-        <w:tc>
-          <w:tcPr>
-            <w:tcBorders>
-              <w:bottom w:val="none" w:sz="0" w:space="0" w:color="000000"/>
-              <w:top w:val="none" w:sz="0" w:space="0" w:color="000000"/>
-              <w:left w:val="none" w:sz="0" w:space="0" w:color="000000"/>
-              <w:right w:val="none" w:sz="0" w:space="0" w:color="000000"/>
-            </w:tcBorders>
-            <w:shd w:val="clear" w:color="auto" w:fill="FFFFFF"/>
-            <w:tcMar>
-              <w:top w:w="0" w:type="dxa"/>
-              <w:bottom w:w="0" w:type="dxa"/>
-              <w:left w:w="0" w:type="dxa"/>
-              <w:right w:w="0" w:type="dxa"/>
-            </w:tcMar>
-            <w:vAlign w:val="top"/>
-          </w:tcPr>
-          <w:p>
-            <w:pPr>
-              <w:pStyle w:val="Normal"/>
-              <w:jc w:val="left"/>
-              <w:pBdr>
-                <w:bottom w:val="none" w:sz="0" w:space="0" w:color="000000"/>
-                <w:top w:val="none" w:sz="0" w:space="0" w:color="000000"/>
-                <w:left w:val="none" w:sz="0" w:space="0" w:color="000000"/>
-                <w:right w:val="none" w:sz="0" w:space="0" w:color="000000"/>
-              </w:pBdr>
-              <w:spacing w:after="60" w:before="60" w:line="240"/>
-              <w:ind w:left="60" w:right="60" w:firstLine="0" w:firstLineChars="0"/>
-              <w:rPr>
-                <w:rFonts w:ascii="Arial" w:hAnsi="Arial" w:eastAsia="Arial" w:cs="Arial"/>
-                <w:i w:val="false"/>
-                <w:b w:val="false"/>
-                <w:u w:val="none"/>
-                <w:strike w:val="false"/>
-                <w:sz w:val="18"/>
-                <w:szCs w:val="18"/>
-                <w:color w:val="000000"/>
-              </w:rPr>
-            </w:pPr>
-            <w:r>
-              <w:rPr>
-                <w:rFonts w:ascii="Arial" w:hAnsi="Arial" w:eastAsia="Arial" w:cs="Arial"/>
-                <w:i w:val="false"/>
-                <w:b w:val="false"/>
-                <w:u w:val="none"/>
-                <w:strike w:val="false"/>
-                <w:sz w:val="18"/>
-                <w:szCs w:val="18"/>
-                <w:color w:val="000000"/>
-              </w:rPr>
-              <w:t xml:space="preserve">Clopidogrel vs aspirin for secondary prevention of coronary artery disease</w:t>
+              <w:t xml:space="preserve">Gastroenterology</w:t>
+            </w:r>
+          </w:p>
+        </w:tc>
+        <w:tc>
+          <w:tcPr>
+            <w:tcBorders>
+              <w:bottom w:val="none" w:sz="0" w:space="0" w:color="000000"/>
+              <w:top w:val="none" w:sz="0" w:space="0" w:color="000000"/>
+              <w:left w:val="none" w:sz="0" w:space="0" w:color="000000"/>
+              <w:right w:val="none" w:sz="0" w:space="0" w:color="000000"/>
+            </w:tcBorders>
+            <w:shd w:val="clear" w:color="auto" w:fill="FFFFFF"/>
+            <w:tcMar>
+              <w:top w:w="0" w:type="dxa"/>
+              <w:bottom w:w="0" w:type="dxa"/>
+              <w:left w:w="0" w:type="dxa"/>
+              <w:right w:w="0" w:type="dxa"/>
+            </w:tcMar>
+            <w:vAlign w:val="top"/>
+          </w:tcPr>
+          <w:p>
+            <w:pPr>
+              <w:pStyle w:val="Normal"/>
+              <w:jc w:val="left"/>
+              <w:pBdr>
+                <w:bottom w:val="none" w:sz="0" w:space="0" w:color="000000"/>
+                <w:top w:val="none" w:sz="0" w:space="0" w:color="000000"/>
+                <w:left w:val="none" w:sz="0" w:space="0" w:color="000000"/>
+                <w:right w:val="none" w:sz="0" w:space="0" w:color="000000"/>
+              </w:pBdr>
+              <w:spacing w:after="60" w:before="60" w:line="240"/>
+              <w:ind w:left="60" w:right="60" w:firstLine="0" w:firstLineChars="0"/>
+              <w:rPr>
+                <w:rFonts w:ascii="Arial" w:hAnsi="Arial" w:eastAsia="Arial" w:cs="Arial"/>
+                <w:i w:val="false"/>
+                <w:b w:val="false"/>
+                <w:u w:val="none"/>
+                <w:strike w:val="false"/>
+                <w:sz w:val="18"/>
+                <w:szCs w:val="18"/>
+                <w:color w:val="000000"/>
+              </w:rPr>
+            </w:pPr>
+            <w:r>
+              <w:rPr>
+                <w:rFonts w:ascii="Arial" w:hAnsi="Arial" w:eastAsia="Arial" w:cs="Arial"/>
+                <w:i w:val="false"/>
+                <w:b w:val="false"/>
+                <w:u w:val="none"/>
+                <w:strike w:val="false"/>
+                <w:sz w:val="18"/>
+                <w:szCs w:val="18"/>
+                <w:color w:val="000000"/>
+              </w:rPr>
+              <w:t xml:space="preserve">Gastroenterology</w:t>
+            </w:r>
+          </w:p>
+        </w:tc>
+        <w:tc>
+          <w:tcPr>
+            <w:tcBorders>
+              <w:bottom w:val="none" w:sz="0" w:space="0" w:color="000000"/>
+              <w:top w:val="none" w:sz="0" w:space="0" w:color="000000"/>
+              <w:left w:val="none" w:sz="0" w:space="0" w:color="000000"/>
+              <w:right w:val="none" w:sz="0" w:space="0" w:color="000000"/>
+            </w:tcBorders>
+            <w:shd w:val="clear" w:color="auto" w:fill="FFFFFF"/>
+            <w:tcMar>
+              <w:top w:w="0" w:type="dxa"/>
+              <w:bottom w:w="0" w:type="dxa"/>
+              <w:left w:w="0" w:type="dxa"/>
+              <w:right w:w="0" w:type="dxa"/>
+            </w:tcMar>
+            <w:vAlign w:val="top"/>
+          </w:tcPr>
+          <w:p>
+            <w:pPr>
+              <w:pStyle w:val="Normal"/>
+              <w:jc w:val="left"/>
+              <w:pBdr>
+                <w:bottom w:val="none" w:sz="0" w:space="0" w:color="000000"/>
+                <w:top w:val="none" w:sz="0" w:space="0" w:color="000000"/>
+                <w:left w:val="none" w:sz="0" w:space="0" w:color="000000"/>
+                <w:right w:val="none" w:sz="0" w:space="0" w:color="000000"/>
+              </w:pBdr>
+              <w:spacing w:after="60" w:before="60" w:line="240"/>
+              <w:ind w:left="60" w:right="60" w:firstLine="0" w:firstLineChars="0"/>
+              <w:rPr>
+                <w:rFonts w:ascii="Arial" w:hAnsi="Arial" w:eastAsia="Arial" w:cs="Arial"/>
+                <w:i w:val="false"/>
+                <w:b w:val="false"/>
+                <w:u w:val="none"/>
+                <w:strike w:val="false"/>
+                <w:sz w:val="18"/>
+                <w:szCs w:val="18"/>
+                <w:color w:val="000000"/>
+              </w:rPr>
+            </w:pPr>
+            <w:r>
+              <w:rPr>
+                <w:rFonts w:ascii="Arial" w:hAnsi="Arial" w:eastAsia="Arial" w:cs="Arial"/>
+                <w:i w:val="false"/>
+                <w:b w:val="false"/>
+                <w:u w:val="none"/>
+                <w:strike w:val="false"/>
+                <w:sz w:val="18"/>
+                <w:szCs w:val="18"/>
+                <w:color w:val="000000"/>
+              </w:rPr>
+              <w:t xml:space="preserve">2025</w:t>
+            </w:r>
+          </w:p>
+        </w:tc>
+        <w:tc>
+          <w:tcPr>
+            <w:tcBorders>
+              <w:bottom w:val="none" w:sz="0" w:space="0" w:color="000000"/>
+              <w:top w:val="none" w:sz="0" w:space="0" w:color="000000"/>
+              <w:left w:val="none" w:sz="0" w:space="0" w:color="000000"/>
+              <w:right w:val="none" w:sz="0" w:space="0" w:color="000000"/>
+            </w:tcBorders>
+            <w:shd w:val="clear" w:color="auto" w:fill="FFFFFF"/>
+            <w:tcMar>
+              <w:top w:w="0" w:type="dxa"/>
+              <w:bottom w:w="0" w:type="dxa"/>
+              <w:left w:w="0" w:type="dxa"/>
+              <w:right w:w="0" w:type="dxa"/>
+            </w:tcMar>
+            <w:vAlign w:val="top"/>
+          </w:tcPr>
+          <w:p>
+            <w:pPr>
+              <w:pStyle w:val="Normal"/>
+              <w:jc w:val="left"/>
+              <w:pBdr>
+                <w:bottom w:val="none" w:sz="0" w:space="0" w:color="000000"/>
+                <w:top w:val="none" w:sz="0" w:space="0" w:color="000000"/>
+                <w:left w:val="none" w:sz="0" w:space="0" w:color="000000"/>
+                <w:right w:val="none" w:sz="0" w:space="0" w:color="000000"/>
+              </w:pBdr>
+              <w:spacing w:after="60" w:before="60" w:line="240"/>
+              <w:ind w:left="60" w:right="60" w:firstLine="0" w:firstLineChars="0"/>
+              <w:rPr>
+                <w:rFonts w:ascii="Arial" w:hAnsi="Arial" w:eastAsia="Arial" w:cs="Arial"/>
+                <w:i w:val="false"/>
+                <w:b w:val="false"/>
+                <w:u w:val="none"/>
+                <w:strike w:val="false"/>
+                <w:sz w:val="18"/>
+                <w:szCs w:val="18"/>
+                <w:color w:val="000000"/>
+              </w:rPr>
+            </w:pPr>
+            <w:r>
+              <w:rPr>
+                <w:rFonts w:ascii="Arial" w:hAnsi="Arial" w:eastAsia="Arial" w:cs="Arial"/>
+                <w:i w:val="false"/>
+                <w:b w:val="false"/>
+                <w:u w:val="none"/>
+                <w:strike w:val="false"/>
+                <w:sz w:val="18"/>
+                <w:szCs w:val="18"/>
+                <w:color w:val="000000"/>
+              </w:rPr>
+              <w:t xml:space="preserve">GLP-1 receptor agonists and gastrointestinal adverse events</w:t>
             </w:r>
           </w:p>
         </w:tc>
@@ -1987,7 +2319,7 @@
                 <w:szCs w:val="18"/>
                 <w:color w:val="000000"/>
               </w:rPr>
-              <w:t xml:space="preserve">32 / 3 / 0</w:t>
+              <w:t xml:space="preserve">31 / 4 / 0</w:t>
             </w:r>
           </w:p>
         </w:tc>
@@ -2158,7 +2490,62 @@
                 <w:szCs w:val="18"/>
                 <w:color w:val="000000"/>
               </w:rPr>
-              <w:t xml:space="preserve">Clinical Infectious Diseases; 2025</w:t>
+              <w:t xml:space="preserve">Clin Infect Dis</w:t>
+            </w:r>
+          </w:p>
+        </w:tc>
+        <w:tc>
+          <w:tcPr>
+            <w:tcBorders>
+              <w:bottom w:val="none" w:sz="0" w:space="0" w:color="000000"/>
+              <w:top w:val="none" w:sz="0" w:space="0" w:color="000000"/>
+              <w:left w:val="none" w:sz="0" w:space="0" w:color="000000"/>
+              <w:right w:val="none" w:sz="0" w:space="0" w:color="000000"/>
+            </w:tcBorders>
+            <w:shd w:val="clear" w:color="auto" w:fill="FFFFFF"/>
+            <w:tcMar>
+              <w:top w:w="0" w:type="dxa"/>
+              <w:bottom w:w="0" w:type="dxa"/>
+              <w:left w:w="0" w:type="dxa"/>
+              <w:right w:w="0" w:type="dxa"/>
+            </w:tcMar>
+            <w:vAlign w:val="top"/>
+          </w:tcPr>
+          <w:p>
+            <w:pPr>
+              <w:pStyle w:val="Normal"/>
+              <w:jc w:val="left"/>
+              <w:pBdr>
+                <w:bottom w:val="none" w:sz="0" w:space="0" w:color="000000"/>
+                <w:top w:val="none" w:sz="0" w:space="0" w:color="000000"/>
+                <w:left w:val="none" w:sz="0" w:space="0" w:color="000000"/>
+                <w:right w:val="none" w:sz="0" w:space="0" w:color="000000"/>
+              </w:pBdr>
+              <w:spacing w:after="60" w:before="60" w:line="240"/>
+              <w:ind w:left="60" w:right="60" w:firstLine="0" w:firstLineChars="0"/>
+              <w:rPr>
+                <w:rFonts w:ascii="Arial" w:hAnsi="Arial" w:eastAsia="Arial" w:cs="Arial"/>
+                <w:i w:val="false"/>
+                <w:b w:val="false"/>
+                <w:u w:val="none"/>
+                <w:strike w:val="false"/>
+                <w:sz w:val="18"/>
+                <w:szCs w:val="18"/>
+                <w:color w:val="000000"/>
+              </w:rPr>
+            </w:pPr>
+            <w:r>
+              <w:rPr>
+                <w:rFonts w:ascii="Arial" w:hAnsi="Arial" w:eastAsia="Arial" w:cs="Arial"/>
+                <w:i w:val="false"/>
+                <w:b w:val="false"/>
+                <w:u w:val="none"/>
+                <w:strike w:val="false"/>
+                <w:sz w:val="18"/>
+                <w:szCs w:val="18"/>
+                <w:color w:val="000000"/>
+              </w:rPr>
+              <w:t xml:space="preserve">2025</w:t>
             </w:r>
           </w:p>
         </w:tc>
@@ -2494,7 +2881,62 @@
                 <w:szCs w:val="18"/>
                 <w:color w:val="000000"/>
               </w:rPr>
-              <w:t xml:space="preserve">Clinical Journal of the American Society of Nephrology; 2025</w:t>
+              <w:t xml:space="preserve">Clin J Am Soc Nephrol</w:t>
+            </w:r>
+          </w:p>
+        </w:tc>
+        <w:tc>
+          <w:tcPr>
+            <w:tcBorders>
+              <w:bottom w:val="none" w:sz="0" w:space="0" w:color="000000"/>
+              <w:top w:val="none" w:sz="0" w:space="0" w:color="000000"/>
+              <w:left w:val="none" w:sz="0" w:space="0" w:color="000000"/>
+              <w:right w:val="none" w:sz="0" w:space="0" w:color="000000"/>
+            </w:tcBorders>
+            <w:shd w:val="clear" w:color="auto" w:fill="FFFFFF"/>
+            <w:tcMar>
+              <w:top w:w="0" w:type="dxa"/>
+              <w:bottom w:w="0" w:type="dxa"/>
+              <w:left w:w="0" w:type="dxa"/>
+              <w:right w:w="0" w:type="dxa"/>
+            </w:tcMar>
+            <w:vAlign w:val="top"/>
+          </w:tcPr>
+          <w:p>
+            <w:pPr>
+              <w:pStyle w:val="Normal"/>
+              <w:jc w:val="left"/>
+              <w:pBdr>
+                <w:bottom w:val="none" w:sz="0" w:space="0" w:color="000000"/>
+                <w:top w:val="none" w:sz="0" w:space="0" w:color="000000"/>
+                <w:left w:val="none" w:sz="0" w:space="0" w:color="000000"/>
+                <w:right w:val="none" w:sz="0" w:space="0" w:color="000000"/>
+              </w:pBdr>
+              <w:spacing w:after="60" w:before="60" w:line="240"/>
+              <w:ind w:left="60" w:right="60" w:firstLine="0" w:firstLineChars="0"/>
+              <w:rPr>
+                <w:rFonts w:ascii="Arial" w:hAnsi="Arial" w:eastAsia="Arial" w:cs="Arial"/>
+                <w:i w:val="false"/>
+                <w:b w:val="false"/>
+                <w:u w:val="none"/>
+                <w:strike w:val="false"/>
+                <w:sz w:val="18"/>
+                <w:szCs w:val="18"/>
+                <w:color w:val="000000"/>
+              </w:rPr>
+            </w:pPr>
+            <w:r>
+              <w:rPr>
+                <w:rFonts w:ascii="Arial" w:hAnsi="Arial" w:eastAsia="Arial" w:cs="Arial"/>
+                <w:i w:val="false"/>
+                <w:b w:val="false"/>
+                <w:u w:val="none"/>
+                <w:strike w:val="false"/>
+                <w:sz w:val="18"/>
+                <w:szCs w:val="18"/>
+                <w:color w:val="000000"/>
+              </w:rPr>
+              <w:t xml:space="preserve">2025</w:t>
             </w:r>
           </w:p>
         </w:tc>
@@ -2830,7 +3272,62 @@
                 <w:szCs w:val="18"/>
                 <w:color w:val="000000"/>
               </w:rPr>
-              <w:t xml:space="preserve">The Lancet Neurology; 2025</w:t>
+              <w:t xml:space="preserve">Lancet Neurol</w:t>
+            </w:r>
+          </w:p>
+        </w:tc>
+        <w:tc>
+          <w:tcPr>
+            <w:tcBorders>
+              <w:bottom w:val="none" w:sz="0" w:space="0" w:color="000000"/>
+              <w:top w:val="none" w:sz="0" w:space="0" w:color="000000"/>
+              <w:left w:val="none" w:sz="0" w:space="0" w:color="000000"/>
+              <w:right w:val="none" w:sz="0" w:space="0" w:color="000000"/>
+            </w:tcBorders>
+            <w:shd w:val="clear" w:color="auto" w:fill="FFFFFF"/>
+            <w:tcMar>
+              <w:top w:w="0" w:type="dxa"/>
+              <w:bottom w:w="0" w:type="dxa"/>
+              <w:left w:w="0" w:type="dxa"/>
+              <w:right w:w="0" w:type="dxa"/>
+            </w:tcMar>
+            <w:vAlign w:val="top"/>
+          </w:tcPr>
+          <w:p>
+            <w:pPr>
+              <w:pStyle w:val="Normal"/>
+              <w:jc w:val="left"/>
+              <w:pBdr>
+                <w:bottom w:val="none" w:sz="0" w:space="0" w:color="000000"/>
+                <w:top w:val="none" w:sz="0" w:space="0" w:color="000000"/>
+                <w:left w:val="none" w:sz="0" w:space="0" w:color="000000"/>
+                <w:right w:val="none" w:sz="0" w:space="0" w:color="000000"/>
+              </w:pBdr>
+              <w:spacing w:after="60" w:before="60" w:line="240"/>
+              <w:ind w:left="60" w:right="60" w:firstLine="0" w:firstLineChars="0"/>
+              <w:rPr>
+                <w:rFonts w:ascii="Arial" w:hAnsi="Arial" w:eastAsia="Arial" w:cs="Arial"/>
+                <w:i w:val="false"/>
+                <w:b w:val="false"/>
+                <w:u w:val="none"/>
+                <w:strike w:val="false"/>
+                <w:sz w:val="18"/>
+                <w:szCs w:val="18"/>
+                <w:color w:val="000000"/>
+              </w:rPr>
+            </w:pPr>
+            <w:r>
+              <w:rPr>
+                <w:rFonts w:ascii="Arial" w:hAnsi="Arial" w:eastAsia="Arial" w:cs="Arial"/>
+                <w:i w:val="false"/>
+                <w:b w:val="false"/>
+                <w:u w:val="none"/>
+                <w:strike w:val="false"/>
+                <w:sz w:val="18"/>
+                <w:szCs w:val="18"/>
+                <w:color w:val="000000"/>
+              </w:rPr>
+              <w:t xml:space="preserve">2025</w:t>
             </w:r>
           </w:p>
         </w:tc>
@@ -3166,7 +3663,62 @@
                 <w:szCs w:val="18"/>
                 <w:color w:val="000000"/>
               </w:rPr>
-              <w:t xml:space="preserve">Human Reproduction Update; 2026</w:t>
+              <w:t xml:space="preserve">Hum Reprod Update</w:t>
+            </w:r>
+          </w:p>
+        </w:tc>
+        <w:tc>
+          <w:tcPr>
+            <w:tcBorders>
+              <w:bottom w:val="none" w:sz="0" w:space="0" w:color="000000"/>
+              <w:top w:val="none" w:sz="0" w:space="0" w:color="000000"/>
+              <w:left w:val="none" w:sz="0" w:space="0" w:color="000000"/>
+              <w:right w:val="none" w:sz="0" w:space="0" w:color="000000"/>
+            </w:tcBorders>
+            <w:shd w:val="clear" w:color="auto" w:fill="FFFFFF"/>
+            <w:tcMar>
+              <w:top w:w="0" w:type="dxa"/>
+              <w:bottom w:w="0" w:type="dxa"/>
+              <w:left w:w="0" w:type="dxa"/>
+              <w:right w:w="0" w:type="dxa"/>
+            </w:tcMar>
+            <w:vAlign w:val="top"/>
+          </w:tcPr>
+          <w:p>
+            <w:pPr>
+              <w:pStyle w:val="Normal"/>
+              <w:jc w:val="left"/>
+              <w:pBdr>
+                <w:bottom w:val="none" w:sz="0" w:space="0" w:color="000000"/>
+                <w:top w:val="none" w:sz="0" w:space="0" w:color="000000"/>
+                <w:left w:val="none" w:sz="0" w:space="0" w:color="000000"/>
+                <w:right w:val="none" w:sz="0" w:space="0" w:color="000000"/>
+              </w:pBdr>
+              <w:spacing w:after="60" w:before="60" w:line="240"/>
+              <w:ind w:left="60" w:right="60" w:firstLine="0" w:firstLineChars="0"/>
+              <w:rPr>
+                <w:rFonts w:ascii="Arial" w:hAnsi="Arial" w:eastAsia="Arial" w:cs="Arial"/>
+                <w:i w:val="false"/>
+                <w:b w:val="false"/>
+                <w:u w:val="none"/>
+                <w:strike w:val="false"/>
+                <w:sz w:val="18"/>
+                <w:szCs w:val="18"/>
+                <w:color w:val="000000"/>
+              </w:rPr>
+            </w:pPr>
+            <w:r>
+              <w:rPr>
+                <w:rFonts w:ascii="Arial" w:hAnsi="Arial" w:eastAsia="Arial" w:cs="Arial"/>
+                <w:i w:val="false"/>
+                <w:b w:val="false"/>
+                <w:u w:val="none"/>
+                <w:strike w:val="false"/>
+                <w:sz w:val="18"/>
+                <w:szCs w:val="18"/>
+                <w:color w:val="000000"/>
+              </w:rPr>
+              <w:t xml:space="preserve">2026</w:t>
             </w:r>
           </w:p>
         </w:tc>
@@ -3502,7 +4054,62 @@
                 <w:szCs w:val="18"/>
                 <w:color w:val="000000"/>
               </w:rPr>
-              <w:t xml:space="preserve">The Lancet Oncology; 2026</w:t>
+              <w:t xml:space="preserve">Lancet Oncol</w:t>
+            </w:r>
+          </w:p>
+        </w:tc>
+        <w:tc>
+          <w:tcPr>
+            <w:tcBorders>
+              <w:bottom w:val="none" w:sz="0" w:space="0" w:color="000000"/>
+              <w:top w:val="none" w:sz="0" w:space="0" w:color="000000"/>
+              <w:left w:val="none" w:sz="0" w:space="0" w:color="000000"/>
+              <w:right w:val="none" w:sz="0" w:space="0" w:color="000000"/>
+            </w:tcBorders>
+            <w:shd w:val="clear" w:color="auto" w:fill="FFFFFF"/>
+            <w:tcMar>
+              <w:top w:w="0" w:type="dxa"/>
+              <w:bottom w:w="0" w:type="dxa"/>
+              <w:left w:w="0" w:type="dxa"/>
+              <w:right w:w="0" w:type="dxa"/>
+            </w:tcMar>
+            <w:vAlign w:val="top"/>
+          </w:tcPr>
+          <w:p>
+            <w:pPr>
+              <w:pStyle w:val="Normal"/>
+              <w:jc w:val="left"/>
+              <w:pBdr>
+                <w:bottom w:val="none" w:sz="0" w:space="0" w:color="000000"/>
+                <w:top w:val="none" w:sz="0" w:space="0" w:color="000000"/>
+                <w:left w:val="none" w:sz="0" w:space="0" w:color="000000"/>
+                <w:right w:val="none" w:sz="0" w:space="0" w:color="000000"/>
+              </w:pBdr>
+              <w:spacing w:after="60" w:before="60" w:line="240"/>
+              <w:ind w:left="60" w:right="60" w:firstLine="0" w:firstLineChars="0"/>
+              <w:rPr>
+                <w:rFonts w:ascii="Arial" w:hAnsi="Arial" w:eastAsia="Arial" w:cs="Arial"/>
+                <w:i w:val="false"/>
+                <w:b w:val="false"/>
+                <w:u w:val="none"/>
+                <w:strike w:val="false"/>
+                <w:sz w:val="18"/>
+                <w:szCs w:val="18"/>
+                <w:color w:val="000000"/>
+              </w:rPr>
+            </w:pPr>
+            <w:r>
+              <w:rPr>
+                <w:rFonts w:ascii="Arial" w:hAnsi="Arial" w:eastAsia="Arial" w:cs="Arial"/>
+                <w:i w:val="false"/>
+                <w:b w:val="false"/>
+                <w:u w:val="none"/>
+                <w:strike w:val="false"/>
+                <w:sz w:val="18"/>
+                <w:szCs w:val="18"/>
+                <w:color w:val="000000"/>
+              </w:rPr>
+              <w:t xml:space="preserve">2026</w:t>
             </w:r>
           </w:p>
         </w:tc>
@@ -3838,7 +4445,62 @@
                 <w:szCs w:val="18"/>
                 <w:color w:val="000000"/>
               </w:rPr>
-              <w:t xml:space="preserve">The American Journal of Sports Medicine; 2025</w:t>
+              <w:t xml:space="preserve">Am J Sports Med</w:t>
+            </w:r>
+          </w:p>
+        </w:tc>
+        <w:tc>
+          <w:tcPr>
+            <w:tcBorders>
+              <w:bottom w:val="none" w:sz="0" w:space="0" w:color="000000"/>
+              <w:top w:val="none" w:sz="0" w:space="0" w:color="000000"/>
+              <w:left w:val="none" w:sz="0" w:space="0" w:color="000000"/>
+              <w:right w:val="none" w:sz="0" w:space="0" w:color="000000"/>
+            </w:tcBorders>
+            <w:shd w:val="clear" w:color="auto" w:fill="FFFFFF"/>
+            <w:tcMar>
+              <w:top w:w="0" w:type="dxa"/>
+              <w:bottom w:w="0" w:type="dxa"/>
+              <w:left w:w="0" w:type="dxa"/>
+              <w:right w:w="0" w:type="dxa"/>
+            </w:tcMar>
+            <w:vAlign w:val="top"/>
+          </w:tcPr>
+          <w:p>
+            <w:pPr>
+              <w:pStyle w:val="Normal"/>
+              <w:jc w:val="left"/>
+              <w:pBdr>
+                <w:bottom w:val="none" w:sz="0" w:space="0" w:color="000000"/>
+                <w:top w:val="none" w:sz="0" w:space="0" w:color="000000"/>
+                <w:left w:val="none" w:sz="0" w:space="0" w:color="000000"/>
+                <w:right w:val="none" w:sz="0" w:space="0" w:color="000000"/>
+              </w:pBdr>
+              <w:spacing w:after="60" w:before="60" w:line="240"/>
+              <w:ind w:left="60" w:right="60" w:firstLine="0" w:firstLineChars="0"/>
+              <w:rPr>
+                <w:rFonts w:ascii="Arial" w:hAnsi="Arial" w:eastAsia="Arial" w:cs="Arial"/>
+                <w:i w:val="false"/>
+                <w:b w:val="false"/>
+                <w:u w:val="none"/>
+                <w:strike w:val="false"/>
+                <w:sz w:val="18"/>
+                <w:szCs w:val="18"/>
+                <w:color w:val="000000"/>
+              </w:rPr>
+            </w:pPr>
+            <w:r>
+              <w:rPr>
+                <w:rFonts w:ascii="Arial" w:hAnsi="Arial" w:eastAsia="Arial" w:cs="Arial"/>
+                <w:i w:val="false"/>
+                <w:b w:val="false"/>
+                <w:u w:val="none"/>
+                <w:strike w:val="false"/>
+                <w:sz w:val="18"/>
+                <w:szCs w:val="18"/>
+                <w:color w:val="000000"/>
+              </w:rPr>
+              <w:t xml:space="preserve">2025</w:t>
             </w:r>
           </w:p>
         </w:tc>
@@ -4174,7 +4836,62 @@
                 <w:szCs w:val="18"/>
                 <w:color w:val="000000"/>
               </w:rPr>
-              <w:t xml:space="preserve">JAMA Pediatrics; 2025</w:t>
+              <w:t xml:space="preserve">JAMA Pediatr</w:t>
+            </w:r>
+          </w:p>
+        </w:tc>
+        <w:tc>
+          <w:tcPr>
+            <w:tcBorders>
+              <w:bottom w:val="none" w:sz="0" w:space="0" w:color="000000"/>
+              <w:top w:val="none" w:sz="0" w:space="0" w:color="000000"/>
+              <w:left w:val="none" w:sz="0" w:space="0" w:color="000000"/>
+              <w:right w:val="none" w:sz="0" w:space="0" w:color="000000"/>
+            </w:tcBorders>
+            <w:shd w:val="clear" w:color="auto" w:fill="FFFFFF"/>
+            <w:tcMar>
+              <w:top w:w="0" w:type="dxa"/>
+              <w:bottom w:w="0" w:type="dxa"/>
+              <w:left w:w="0" w:type="dxa"/>
+              <w:right w:w="0" w:type="dxa"/>
+            </w:tcMar>
+            <w:vAlign w:val="top"/>
+          </w:tcPr>
+          <w:p>
+            <w:pPr>
+              <w:pStyle w:val="Normal"/>
+              <w:jc w:val="left"/>
+              <w:pBdr>
+                <w:bottom w:val="none" w:sz="0" w:space="0" w:color="000000"/>
+                <w:top w:val="none" w:sz="0" w:space="0" w:color="000000"/>
+                <w:left w:val="none" w:sz="0" w:space="0" w:color="000000"/>
+                <w:right w:val="none" w:sz="0" w:space="0" w:color="000000"/>
+              </w:pBdr>
+              <w:spacing w:after="60" w:before="60" w:line="240"/>
+              <w:ind w:left="60" w:right="60" w:firstLine="0" w:firstLineChars="0"/>
+              <w:rPr>
+                <w:rFonts w:ascii="Arial" w:hAnsi="Arial" w:eastAsia="Arial" w:cs="Arial"/>
+                <w:i w:val="false"/>
+                <w:b w:val="false"/>
+                <w:u w:val="none"/>
+                <w:strike w:val="false"/>
+                <w:sz w:val="18"/>
+                <w:szCs w:val="18"/>
+                <w:color w:val="000000"/>
+              </w:rPr>
+            </w:pPr>
+            <w:r>
+              <w:rPr>
+                <w:rFonts w:ascii="Arial" w:hAnsi="Arial" w:eastAsia="Arial" w:cs="Arial"/>
+                <w:i w:val="false"/>
+                <w:b w:val="false"/>
+                <w:u w:val="none"/>
+                <w:strike w:val="false"/>
+                <w:sz w:val="18"/>
+                <w:szCs w:val="18"/>
+                <w:color w:val="000000"/>
+              </w:rPr>
+              <w:t xml:space="preserve">2025</w:t>
             </w:r>
           </w:p>
         </w:tc>
@@ -4510,7 +5227,62 @@
                 <w:szCs w:val="18"/>
                 <w:color w:val="000000"/>
               </w:rPr>
-              <w:t xml:space="preserve">The Lancet Psychiatry; 2026</w:t>
+              <w:t xml:space="preserve">Lancet Psychiatry</w:t>
+            </w:r>
+          </w:p>
+        </w:tc>
+        <w:tc>
+          <w:tcPr>
+            <w:tcBorders>
+              <w:bottom w:val="none" w:sz="0" w:space="0" w:color="000000"/>
+              <w:top w:val="none" w:sz="0" w:space="0" w:color="000000"/>
+              <w:left w:val="none" w:sz="0" w:space="0" w:color="000000"/>
+              <w:right w:val="none" w:sz="0" w:space="0" w:color="000000"/>
+            </w:tcBorders>
+            <w:shd w:val="clear" w:color="auto" w:fill="FFFFFF"/>
+            <w:tcMar>
+              <w:top w:w="0" w:type="dxa"/>
+              <w:bottom w:w="0" w:type="dxa"/>
+              <w:left w:w="0" w:type="dxa"/>
+              <w:right w:w="0" w:type="dxa"/>
+            </w:tcMar>
+            <w:vAlign w:val="top"/>
+          </w:tcPr>
+          <w:p>
+            <w:pPr>
+              <w:pStyle w:val="Normal"/>
+              <w:jc w:val="left"/>
+              <w:pBdr>
+                <w:bottom w:val="none" w:sz="0" w:space="0" w:color="000000"/>
+                <w:top w:val="none" w:sz="0" w:space="0" w:color="000000"/>
+                <w:left w:val="none" w:sz="0" w:space="0" w:color="000000"/>
+                <w:right w:val="none" w:sz="0" w:space="0" w:color="000000"/>
+              </w:pBdr>
+              <w:spacing w:after="60" w:before="60" w:line="240"/>
+              <w:ind w:left="60" w:right="60" w:firstLine="0" w:firstLineChars="0"/>
+              <w:rPr>
+                <w:rFonts w:ascii="Arial" w:hAnsi="Arial" w:eastAsia="Arial" w:cs="Arial"/>
+                <w:i w:val="false"/>
+                <w:b w:val="false"/>
+                <w:u w:val="none"/>
+                <w:strike w:val="false"/>
+                <w:sz w:val="18"/>
+                <w:szCs w:val="18"/>
+                <w:color w:val="000000"/>
+              </w:rPr>
+            </w:pPr>
+            <w:r>
+              <w:rPr>
+                <w:rFonts w:ascii="Arial" w:hAnsi="Arial" w:eastAsia="Arial" w:cs="Arial"/>
+                <w:i w:val="false"/>
+                <w:b w:val="false"/>
+                <w:u w:val="none"/>
+                <w:strike w:val="false"/>
+                <w:sz w:val="18"/>
+                <w:szCs w:val="18"/>
+                <w:color w:val="000000"/>
+              </w:rPr>
+              <w:t xml:space="preserve">2026</w:t>
             </w:r>
           </w:p>
         </w:tc>
@@ -4846,7 +5618,62 @@
                 <w:szCs w:val="18"/>
                 <w:color w:val="000000"/>
               </w:rPr>
-              <w:t xml:space="preserve">The Lancet Respiratory Medicine; 2025</w:t>
+              <w:t xml:space="preserve">Lancet Respir Med</w:t>
+            </w:r>
+          </w:p>
+        </w:tc>
+        <w:tc>
+          <w:tcPr>
+            <w:tcBorders>
+              <w:bottom w:val="none" w:sz="0" w:space="0" w:color="000000"/>
+              <w:top w:val="none" w:sz="0" w:space="0" w:color="000000"/>
+              <w:left w:val="none" w:sz="0" w:space="0" w:color="000000"/>
+              <w:right w:val="none" w:sz="0" w:space="0" w:color="000000"/>
+            </w:tcBorders>
+            <w:shd w:val="clear" w:color="auto" w:fill="FFFFFF"/>
+            <w:tcMar>
+              <w:top w:w="0" w:type="dxa"/>
+              <w:bottom w:w="0" w:type="dxa"/>
+              <w:left w:w="0" w:type="dxa"/>
+              <w:right w:w="0" w:type="dxa"/>
+            </w:tcMar>
+            <w:vAlign w:val="top"/>
+          </w:tcPr>
+          <w:p>
+            <w:pPr>
+              <w:pStyle w:val="Normal"/>
+              <w:jc w:val="left"/>
+              <w:pBdr>
+                <w:bottom w:val="none" w:sz="0" w:space="0" w:color="000000"/>
+                <w:top w:val="none" w:sz="0" w:space="0" w:color="000000"/>
+                <w:left w:val="none" w:sz="0" w:space="0" w:color="000000"/>
+                <w:right w:val="none" w:sz="0" w:space="0" w:color="000000"/>
+              </w:pBdr>
+              <w:spacing w:after="60" w:before="60" w:line="240"/>
+              <w:ind w:left="60" w:right="60" w:firstLine="0" w:firstLineChars="0"/>
+              <w:rPr>
+                <w:rFonts w:ascii="Arial" w:hAnsi="Arial" w:eastAsia="Arial" w:cs="Arial"/>
+                <w:i w:val="false"/>
+                <w:b w:val="false"/>
+                <w:u w:val="none"/>
+                <w:strike w:val="false"/>
+                <w:sz w:val="18"/>
+                <w:szCs w:val="18"/>
+                <w:color w:val="000000"/>
+              </w:rPr>
+            </w:pPr>
+            <w:r>
+              <w:rPr>
+                <w:rFonts w:ascii="Arial" w:hAnsi="Arial" w:eastAsia="Arial" w:cs="Arial"/>
+                <w:i w:val="false"/>
+                <w:b w:val="false"/>
+                <w:u w:val="none"/>
+                <w:strike w:val="false"/>
+                <w:sz w:val="18"/>
+                <w:szCs w:val="18"/>
+                <w:color w:val="000000"/>
+              </w:rPr>
+              <w:t xml:space="preserve">2025</w:t>
             </w:r>
           </w:p>
         </w:tc>
@@ -5182,7 +6009,62 @@
                 <w:szCs w:val="18"/>
                 <w:color w:val="000000"/>
               </w:rPr>
-              <w:t xml:space="preserve">The Lancet Rheumatology; 2025</w:t>
+              <w:t xml:space="preserve">Lancet Rheumatol</w:t>
+            </w:r>
+          </w:p>
+        </w:tc>
+        <w:tc>
+          <w:tcPr>
+            <w:tcBorders>
+              <w:bottom w:val="none" w:sz="0" w:space="0" w:color="000000"/>
+              <w:top w:val="none" w:sz="0" w:space="0" w:color="000000"/>
+              <w:left w:val="none" w:sz="0" w:space="0" w:color="000000"/>
+              <w:right w:val="none" w:sz="0" w:space="0" w:color="000000"/>
+            </w:tcBorders>
+            <w:shd w:val="clear" w:color="auto" w:fill="FFFFFF"/>
+            <w:tcMar>
+              <w:top w:w="0" w:type="dxa"/>
+              <w:bottom w:w="0" w:type="dxa"/>
+              <w:left w:w="0" w:type="dxa"/>
+              <w:right w:w="0" w:type="dxa"/>
+            </w:tcMar>
+            <w:vAlign w:val="top"/>
+          </w:tcPr>
+          <w:p>
+            <w:pPr>
+              <w:pStyle w:val="Normal"/>
+              <w:jc w:val="left"/>
+              <w:pBdr>
+                <w:bottom w:val="none" w:sz="0" w:space="0" w:color="000000"/>
+                <w:top w:val="none" w:sz="0" w:space="0" w:color="000000"/>
+                <w:left w:val="none" w:sz="0" w:space="0" w:color="000000"/>
+                <w:right w:val="none" w:sz="0" w:space="0" w:color="000000"/>
+              </w:pBdr>
+              <w:spacing w:after="60" w:before="60" w:line="240"/>
+              <w:ind w:left="60" w:right="60" w:firstLine="0" w:firstLineChars="0"/>
+              <w:rPr>
+                <w:rFonts w:ascii="Arial" w:hAnsi="Arial" w:eastAsia="Arial" w:cs="Arial"/>
+                <w:i w:val="false"/>
+                <w:b w:val="false"/>
+                <w:u w:val="none"/>
+                <w:strike w:val="false"/>
+                <w:sz w:val="18"/>
+                <w:szCs w:val="18"/>
+                <w:color w:val="000000"/>
+              </w:rPr>
+            </w:pPr>
+            <w:r>
+              <w:rPr>
+                <w:rFonts w:ascii="Arial" w:hAnsi="Arial" w:eastAsia="Arial" w:cs="Arial"/>
+                <w:i w:val="false"/>
+                <w:b w:val="false"/>
+                <w:u w:val="none"/>
+                <w:strike w:val="false"/>
+                <w:sz w:val="18"/>
+                <w:szCs w:val="18"/>
+                <w:color w:val="000000"/>
+              </w:rPr>
+              <w:t xml:space="preserve">2025</w:t>
             </w:r>
           </w:p>
         </w:tc>
@@ -5518,7 +6400,62 @@
                 <w:szCs w:val="18"/>
                 <w:color w:val="000000"/>
               </w:rPr>
-              <w:t xml:space="preserve">British Journal of Anaesthesia; 2025</w:t>
+              <w:t xml:space="preserve">Br J Anaesth</w:t>
+            </w:r>
+          </w:p>
+        </w:tc>
+        <w:tc>
+          <w:tcPr>
+            <w:tcBorders>
+              <w:bottom w:val="none" w:sz="0" w:space="0" w:color="000000"/>
+              <w:top w:val="none" w:sz="0" w:space="0" w:color="000000"/>
+              <w:left w:val="none" w:sz="0" w:space="0" w:color="000000"/>
+              <w:right w:val="none" w:sz="0" w:space="0" w:color="000000"/>
+            </w:tcBorders>
+            <w:shd w:val="clear" w:color="auto" w:fill="FFFFFF"/>
+            <w:tcMar>
+              <w:top w:w="0" w:type="dxa"/>
+              <w:bottom w:w="0" w:type="dxa"/>
+              <w:left w:w="0" w:type="dxa"/>
+              <w:right w:w="0" w:type="dxa"/>
+            </w:tcMar>
+            <w:vAlign w:val="top"/>
+          </w:tcPr>
+          <w:p>
+            <w:pPr>
+              <w:pStyle w:val="Normal"/>
+              <w:jc w:val="left"/>
+              <w:pBdr>
+                <w:bottom w:val="none" w:sz="0" w:space="0" w:color="000000"/>
+                <w:top w:val="none" w:sz="0" w:space="0" w:color="000000"/>
+                <w:left w:val="none" w:sz="0" w:space="0" w:color="000000"/>
+                <w:right w:val="none" w:sz="0" w:space="0" w:color="000000"/>
+              </w:pBdr>
+              <w:spacing w:after="60" w:before="60" w:line="240"/>
+              <w:ind w:left="60" w:right="60" w:firstLine="0" w:firstLineChars="0"/>
+              <w:rPr>
+                <w:rFonts w:ascii="Arial" w:hAnsi="Arial" w:eastAsia="Arial" w:cs="Arial"/>
+                <w:i w:val="false"/>
+                <w:b w:val="false"/>
+                <w:u w:val="none"/>
+                <w:strike w:val="false"/>
+                <w:sz w:val="18"/>
+                <w:szCs w:val="18"/>
+                <w:color w:val="000000"/>
+              </w:rPr>
+            </w:pPr>
+            <w:r>
+              <w:rPr>
+                <w:rFonts w:ascii="Arial" w:hAnsi="Arial" w:eastAsia="Arial" w:cs="Arial"/>
+                <w:i w:val="false"/>
+                <w:b w:val="false"/>
+                <w:u w:val="none"/>
+                <w:strike w:val="false"/>
+                <w:sz w:val="18"/>
+                <w:szCs w:val="18"/>
+                <w:color w:val="000000"/>
+              </w:rPr>
+              <w:t xml:space="preserve">2025</w:t>
             </w:r>
           </w:p>
         </w:tc>
@@ -5968,6 +6905,62 @@
                 <w:szCs w:val="18"/>
                 <w:color w:val="000000"/>
               </w:rPr>
+              <w:t xml:space="preserve"/>
+            </w:r>
+          </w:p>
+        </w:tc>
+        <w:tc>
+          <w:tcPr>
+            <w:tcBorders>
+              <w:bottom w:val="single" w:sz="8" w:space="0" w:color="000000"/>
+              <w:top w:val="none" w:sz="0" w:space="0" w:color="000000"/>
+              <w:left w:val="none" w:sz="0" w:space="0" w:color="000000"/>
+              <w:right w:val="none" w:sz="0" w:space="0" w:color="000000"/>
+            </w:tcBorders>
+            <w:shd w:val="clear" w:color="auto" w:fill="FFFFFF"/>
+            <w:tcMar>
+              <w:top w:w="0" w:type="dxa"/>
+              <w:bottom w:w="0" w:type="dxa"/>
+              <w:left w:w="0" w:type="dxa"/>
+              <w:right w:w="0" w:type="dxa"/>
+            </w:tcMar>
+            <w:vAlign w:val="top"/>
+          </w:tcPr>
+          <w:p>
+            <w:pPr>
+              <w:pStyle w:val="Normal"/>
+              <w:jc w:val="left"/>
+              <w:keepNext/>
+              <w:pBdr>
+                <w:bottom w:val="none" w:sz="0" w:space="0" w:color="000000"/>
+                <w:top w:val="none" w:sz="0" w:space="0" w:color="000000"/>
+                <w:left w:val="none" w:sz="0" w:space="0" w:color="000000"/>
+                <w:right w:val="none" w:sz="0" w:space="0" w:color="000000"/>
+              </w:pBdr>
+              <w:spacing w:after="60" w:before="60" w:line="240"/>
+              <w:ind w:left="60" w:right="60" w:firstLine="0" w:firstLineChars="0"/>
+              <w:rPr>
+                <w:rFonts w:ascii="Arial" w:hAnsi="Arial" w:eastAsia="Arial" w:cs="Arial"/>
+                <w:i w:val="false"/>
+                <w:b w:val="false"/>
+                <w:u w:val="none"/>
+                <w:strike w:val="false"/>
+                <w:sz w:val="18"/>
+                <w:szCs w:val="18"/>
+                <w:color w:val="000000"/>
+              </w:rPr>
+            </w:pPr>
+            <w:r>
+              <w:rPr>
+                <w:rFonts w:ascii="Arial" w:hAnsi="Arial" w:eastAsia="Arial" w:cs="Arial"/>
+                <w:i w:val="false"/>
+                <w:b w:val="false"/>
+                <w:u w:val="none"/>
+                <w:strike w:val="false"/>
+                <w:sz w:val="18"/>
+                <w:szCs w:val="18"/>
+                <w:color w:val="000000"/>
+              </w:rPr>
               <w:t xml:space="preserve">102</w:t>
             </w:r>
           </w:p>
@@ -6092,7 +7085,7 @@
         </w:trPr>
         <w:tc>
           <w:tcPr>
-            <w:gridSpan w:val="6"/>
+            <w:gridSpan w:val="7"/>
             <w:tcBorders>
               <w:bottom w:val="none" w:sz="0" w:space="0" w:color="FFFFFF"/>
               <w:top w:val="single" w:sz="8" w:space="0" w:color="000000"/>
@@ -6142,7 +7135,7 @@
                 <w:szCs w:val="18"/>
                 <w:color w:val="000000"/>
               </w:rPr>
-              <w:t xml:space="preserve">RoB 2, risk of bias tool for randomised trials. Counts are published labels pooled across D1–D5. Overall given indicates whether published Overall labels are available; total is labelled trials/all trials. The analysis excludes three unsupported-design trials from all arms. Metadata are curated from the source meta-analyses.</w:t>
+              <w:t xml:space="preserve">SC, Some concerns; RoB 2, risk of bias tool for randomised trials. Counts are published labels pooled across D1–D5. Overall given indicates whether published Overall labels are available; total is labelled trials/all trials. The analysis excludes three unsupported-design trials from all arms. Metadata are curated from the source meta-analyses.</w:t>
             </w:r>
           </w:p>
         </w:tc>

</xml_diff>

<commit_message>
Fix main table label wrapping and extend Word no-wrap QA
</commit_message>
<xml_diff>
--- a/analysis/output/manuscript/Table1.docx
+++ b/analysis/output/manuscript/Table1.docx
@@ -17,13 +17,13 @@
         <w:tblLook w:firstRow="1" w:lastRow="0" w:firstColumn="0" w:lastColumn="0" w:noHBand="0" w:noVBand="1"/>
       </w:tblPr>
       <w:tblGrid>
-        <w:gridCol w:w="1642"/>
-        <w:gridCol w:w="1699"/>
-        <w:gridCol w:w="619"/>
-        <w:gridCol w:w="2808"/>
-        <w:gridCol w:w="662"/>
-        <w:gridCol w:w="1469"/>
-        <w:gridCol w:w="965"/>
+        <w:gridCol w:w="2318"/>
+        <w:gridCol w:w="2304"/>
+        <w:gridCol w:w="504"/>
+        <w:gridCol w:w="2405"/>
+        <w:gridCol w:w="576"/>
+        <w:gridCol w:w="1109"/>
+        <w:gridCol w:w="778"/>
       </w:tblGrid>
       <w:tr>
         <w:trPr>
@@ -59,8 +59,8 @@
                 <w:left w:val="none" w:sz="0" w:space="0" w:color="000000"/>
                 <w:right w:val="none" w:sz="0" w:space="0" w:color="000000"/>
               </w:pBdr>
-              <w:spacing w:after="60" w:before="60" w:line="240"/>
-              <w:ind w:left="60" w:right="60" w:firstLine="0" w:firstLineChars="0"/>
+              <w:spacing w:after="40" w:before="40" w:line="240"/>
+              <w:ind w:left="20" w:right="20" w:firstLine="0" w:firstLineChars="0"/>
               <w:rPr>
                 <w:rFonts w:ascii="Arial" w:hAnsi="Arial" w:eastAsia="Arial" w:cs="Arial"/>
                 <w:i w:val="false"/>
@@ -115,8 +115,8 @@
                 <w:left w:val="none" w:sz="0" w:space="0" w:color="000000"/>
                 <w:right w:val="none" w:sz="0" w:space="0" w:color="000000"/>
               </w:pBdr>
-              <w:spacing w:after="60" w:before="60" w:line="240"/>
-              <w:ind w:left="60" w:right="60" w:firstLine="0" w:firstLineChars="0"/>
+              <w:spacing w:after="40" w:before="40" w:line="240"/>
+              <w:ind w:left="20" w:right="20" w:firstLine="0" w:firstLineChars="0"/>
               <w:rPr>
                 <w:rFonts w:ascii="Arial" w:hAnsi="Arial" w:eastAsia="Arial" w:cs="Arial"/>
                 <w:i w:val="false"/>
@@ -171,8 +171,8 @@
                 <w:left w:val="none" w:sz="0" w:space="0" w:color="000000"/>
                 <w:right w:val="none" w:sz="0" w:space="0" w:color="000000"/>
               </w:pBdr>
-              <w:spacing w:after="60" w:before="60" w:line="240"/>
-              <w:ind w:left="60" w:right="60" w:firstLine="0" w:firstLineChars="0"/>
+              <w:spacing w:after="40" w:before="40" w:line="240"/>
+              <w:ind w:left="20" w:right="20" w:firstLine="0" w:firstLineChars="0"/>
               <w:rPr>
                 <w:rFonts w:ascii="Arial" w:hAnsi="Arial" w:eastAsia="Arial" w:cs="Arial"/>
                 <w:i w:val="false"/>
@@ -227,8 +227,8 @@
                 <w:left w:val="none" w:sz="0" w:space="0" w:color="000000"/>
                 <w:right w:val="none" w:sz="0" w:space="0" w:color="000000"/>
               </w:pBdr>
-              <w:spacing w:after="60" w:before="60" w:line="240"/>
-              <w:ind w:left="60" w:right="60" w:firstLine="0" w:firstLineChars="0"/>
+              <w:spacing w:after="40" w:before="40" w:line="240"/>
+              <w:ind w:left="20" w:right="20" w:firstLine="0" w:firstLineChars="0"/>
               <w:rPr>
                 <w:rFonts w:ascii="Arial" w:hAnsi="Arial" w:eastAsia="Arial" w:cs="Arial"/>
                 <w:i w:val="false"/>
@@ -283,8 +283,8 @@
                 <w:left w:val="none" w:sz="0" w:space="0" w:color="000000"/>
                 <w:right w:val="none" w:sz="0" w:space="0" w:color="000000"/>
               </w:pBdr>
-              <w:spacing w:after="60" w:before="60" w:line="240"/>
-              <w:ind w:left="60" w:right="60" w:firstLine="0" w:firstLineChars="0"/>
+              <w:spacing w:after="40" w:before="40" w:line="240"/>
+              <w:ind w:left="20" w:right="20" w:firstLine="0" w:firstLineChars="0"/>
               <w:rPr>
                 <w:rFonts w:ascii="Arial" w:hAnsi="Arial" w:eastAsia="Arial" w:cs="Arial"/>
                 <w:i w:val="false"/>
@@ -339,8 +339,8 @@
                 <w:left w:val="none" w:sz="0" w:space="0" w:color="000000"/>
                 <w:right w:val="none" w:sz="0" w:space="0" w:color="000000"/>
               </w:pBdr>
-              <w:spacing w:after="60" w:before="60" w:line="240"/>
-              <w:ind w:left="60" w:right="60" w:firstLine="0" w:firstLineChars="0"/>
+              <w:spacing w:after="40" w:before="40" w:line="240"/>
+              <w:ind w:left="20" w:right="20" w:firstLine="0" w:firstLineChars="0"/>
               <w:rPr>
                 <w:rFonts w:ascii="Arial" w:hAnsi="Arial" w:eastAsia="Arial" w:cs="Arial"/>
                 <w:i w:val="false"/>
@@ -395,8 +395,8 @@
                 <w:left w:val="none" w:sz="0" w:space="0" w:color="000000"/>
                 <w:right w:val="none" w:sz="0" w:space="0" w:color="000000"/>
               </w:pBdr>
-              <w:spacing w:after="60" w:before="60" w:line="240"/>
-              <w:ind w:left="60" w:right="60" w:firstLine="0" w:firstLineChars="0"/>
+              <w:spacing w:after="40" w:before="40" w:line="240"/>
+              <w:ind w:left="20" w:right="20" w:firstLine="0" w:firstLineChars="0"/>
               <w:rPr>
                 <w:rFonts w:ascii="Arial" w:hAnsi="Arial" w:eastAsia="Arial" w:cs="Arial"/>
                 <w:i w:val="false"/>
@@ -456,8 +456,8 @@
                 <w:left w:val="none" w:sz="0" w:space="0" w:color="000000"/>
                 <w:right w:val="none" w:sz="0" w:space="0" w:color="000000"/>
               </w:pBdr>
-              <w:spacing w:after="60" w:before="60" w:line="240"/>
-              <w:ind w:left="60" w:right="60" w:firstLine="0" w:firstLineChars="0"/>
+              <w:spacing w:after="40" w:before="40" w:line="240"/>
+              <w:ind w:left="20" w:right="20" w:firstLine="0" w:firstLineChars="0"/>
               <w:rPr>
                 <w:rFonts w:ascii="Arial" w:hAnsi="Arial" w:eastAsia="Arial" w:cs="Arial"/>
                 <w:i w:val="false"/>
@@ -511,8 +511,8 @@
                 <w:left w:val="none" w:sz="0" w:space="0" w:color="000000"/>
                 <w:right w:val="none" w:sz="0" w:space="0" w:color="000000"/>
               </w:pBdr>
-              <w:spacing w:after="60" w:before="60" w:line="240"/>
-              <w:ind w:left="60" w:right="60" w:firstLine="0" w:firstLineChars="0"/>
+              <w:spacing w:after="40" w:before="40" w:line="240"/>
+              <w:ind w:left="20" w:right="20" w:firstLine="0" w:firstLineChars="0"/>
               <w:rPr>
                 <w:rFonts w:ascii="Arial" w:hAnsi="Arial" w:eastAsia="Arial" w:cs="Arial"/>
                 <w:i w:val="false"/>
@@ -566,8 +566,8 @@
                 <w:left w:val="none" w:sz="0" w:space="0" w:color="000000"/>
                 <w:right w:val="none" w:sz="0" w:space="0" w:color="000000"/>
               </w:pBdr>
-              <w:spacing w:after="60" w:before="60" w:line="240"/>
-              <w:ind w:left="60" w:right="60" w:firstLine="0" w:firstLineChars="0"/>
+              <w:spacing w:after="40" w:before="40" w:line="240"/>
+              <w:ind w:left="20" w:right="20" w:firstLine="0" w:firstLineChars="0"/>
               <w:rPr>
                 <w:rFonts w:ascii="Arial" w:hAnsi="Arial" w:eastAsia="Arial" w:cs="Arial"/>
                 <w:i w:val="false"/>
@@ -621,8 +621,8 @@
                 <w:left w:val="none" w:sz="0" w:space="0" w:color="000000"/>
                 <w:right w:val="none" w:sz="0" w:space="0" w:color="000000"/>
               </w:pBdr>
-              <w:spacing w:after="60" w:before="60" w:line="240"/>
-              <w:ind w:left="60" w:right="60" w:firstLine="0" w:firstLineChars="0"/>
+              <w:spacing w:after="40" w:before="40" w:line="240"/>
+              <w:ind w:left="20" w:right="20" w:firstLine="0" w:firstLineChars="0"/>
               <w:rPr>
                 <w:rFonts w:ascii="Arial" w:hAnsi="Arial" w:eastAsia="Arial" w:cs="Arial"/>
                 <w:i w:val="false"/>
@@ -676,8 +676,8 @@
                 <w:left w:val="none" w:sz="0" w:space="0" w:color="000000"/>
                 <w:right w:val="none" w:sz="0" w:space="0" w:color="000000"/>
               </w:pBdr>
-              <w:spacing w:after="60" w:before="60" w:line="240"/>
-              <w:ind w:left="60" w:right="60" w:firstLine="0" w:firstLineChars="0"/>
+              <w:spacing w:after="40" w:before="40" w:line="240"/>
+              <w:ind w:left="20" w:right="20" w:firstLine="0" w:firstLineChars="0"/>
               <w:rPr>
                 <w:rFonts w:ascii="Arial" w:hAnsi="Arial" w:eastAsia="Arial" w:cs="Arial"/>
                 <w:i w:val="false"/>
@@ -731,8 +731,8 @@
                 <w:left w:val="none" w:sz="0" w:space="0" w:color="000000"/>
                 <w:right w:val="none" w:sz="0" w:space="0" w:color="000000"/>
               </w:pBdr>
-              <w:spacing w:after="60" w:before="60" w:line="240"/>
-              <w:ind w:left="60" w:right="60" w:firstLine="0" w:firstLineChars="0"/>
+              <w:spacing w:after="40" w:before="40" w:line="240"/>
+              <w:ind w:left="20" w:right="20" w:firstLine="0" w:firstLineChars="0"/>
               <w:rPr>
                 <w:rFonts w:ascii="Arial" w:hAnsi="Arial" w:eastAsia="Arial" w:cs="Arial"/>
                 <w:i w:val="false"/>
@@ -786,8 +786,8 @@
                 <w:left w:val="none" w:sz="0" w:space="0" w:color="000000"/>
                 <w:right w:val="none" w:sz="0" w:space="0" w:color="000000"/>
               </w:pBdr>
-              <w:spacing w:after="60" w:before="60" w:line="240"/>
-              <w:ind w:left="60" w:right="60" w:firstLine="0" w:firstLineChars="0"/>
+              <w:spacing w:after="40" w:before="40" w:line="240"/>
+              <w:ind w:left="20" w:right="20" w:firstLine="0" w:firstLineChars="0"/>
               <w:rPr>
                 <w:rFonts w:ascii="Arial" w:hAnsi="Arial" w:eastAsia="Arial" w:cs="Arial"/>
                 <w:i w:val="false"/>
@@ -847,8 +847,8 @@
                 <w:left w:val="none" w:sz="0" w:space="0" w:color="000000"/>
                 <w:right w:val="none" w:sz="0" w:space="0" w:color="000000"/>
               </w:pBdr>
-              <w:spacing w:after="60" w:before="60" w:line="240"/>
-              <w:ind w:left="60" w:right="60" w:firstLine="0" w:firstLineChars="0"/>
+              <w:spacing w:after="40" w:before="40" w:line="240"/>
+              <w:ind w:left="20" w:right="20" w:firstLine="0" w:firstLineChars="0"/>
               <w:rPr>
                 <w:rFonts w:ascii="Arial" w:hAnsi="Arial" w:eastAsia="Arial" w:cs="Arial"/>
                 <w:i w:val="false"/>
@@ -902,8 +902,8 @@
                 <w:left w:val="none" w:sz="0" w:space="0" w:color="000000"/>
                 <w:right w:val="none" w:sz="0" w:space="0" w:color="000000"/>
               </w:pBdr>
-              <w:spacing w:after="60" w:before="60" w:line="240"/>
-              <w:ind w:left="60" w:right="60" w:firstLine="0" w:firstLineChars="0"/>
+              <w:spacing w:after="40" w:before="40" w:line="240"/>
+              <w:ind w:left="20" w:right="20" w:firstLine="0" w:firstLineChars="0"/>
               <w:rPr>
                 <w:rFonts w:ascii="Arial" w:hAnsi="Arial" w:eastAsia="Arial" w:cs="Arial"/>
                 <w:i w:val="false"/>
@@ -957,8 +957,8 @@
                 <w:left w:val="none" w:sz="0" w:space="0" w:color="000000"/>
                 <w:right w:val="none" w:sz="0" w:space="0" w:color="000000"/>
               </w:pBdr>
-              <w:spacing w:after="60" w:before="60" w:line="240"/>
-              <w:ind w:left="60" w:right="60" w:firstLine="0" w:firstLineChars="0"/>
+              <w:spacing w:after="40" w:before="40" w:line="240"/>
+              <w:ind w:left="20" w:right="20" w:firstLine="0" w:firstLineChars="0"/>
               <w:rPr>
                 <w:rFonts w:ascii="Arial" w:hAnsi="Arial" w:eastAsia="Arial" w:cs="Arial"/>
                 <w:i w:val="false"/>
@@ -1012,8 +1012,8 @@
                 <w:left w:val="none" w:sz="0" w:space="0" w:color="000000"/>
                 <w:right w:val="none" w:sz="0" w:space="0" w:color="000000"/>
               </w:pBdr>
-              <w:spacing w:after="60" w:before="60" w:line="240"/>
-              <w:ind w:left="60" w:right="60" w:firstLine="0" w:firstLineChars="0"/>
+              <w:spacing w:after="40" w:before="40" w:line="240"/>
+              <w:ind w:left="20" w:right="20" w:firstLine="0" w:firstLineChars="0"/>
               <w:rPr>
                 <w:rFonts w:ascii="Arial" w:hAnsi="Arial" w:eastAsia="Arial" w:cs="Arial"/>
                 <w:i w:val="false"/>
@@ -1067,8 +1067,8 @@
                 <w:left w:val="none" w:sz="0" w:space="0" w:color="000000"/>
                 <w:right w:val="none" w:sz="0" w:space="0" w:color="000000"/>
               </w:pBdr>
-              <w:spacing w:after="60" w:before="60" w:line="240"/>
-              <w:ind w:left="60" w:right="60" w:firstLine="0" w:firstLineChars="0"/>
+              <w:spacing w:after="40" w:before="40" w:line="240"/>
+              <w:ind w:left="20" w:right="20" w:firstLine="0" w:firstLineChars="0"/>
               <w:rPr>
                 <w:rFonts w:ascii="Arial" w:hAnsi="Arial" w:eastAsia="Arial" w:cs="Arial"/>
                 <w:i w:val="false"/>
@@ -1122,8 +1122,8 @@
                 <w:left w:val="none" w:sz="0" w:space="0" w:color="000000"/>
                 <w:right w:val="none" w:sz="0" w:space="0" w:color="000000"/>
               </w:pBdr>
-              <w:spacing w:after="60" w:before="60" w:line="240"/>
-              <w:ind w:left="60" w:right="60" w:firstLine="0" w:firstLineChars="0"/>
+              <w:spacing w:after="40" w:before="40" w:line="240"/>
+              <w:ind w:left="20" w:right="20" w:firstLine="0" w:firstLineChars="0"/>
               <w:rPr>
                 <w:rFonts w:ascii="Arial" w:hAnsi="Arial" w:eastAsia="Arial" w:cs="Arial"/>
                 <w:i w:val="false"/>
@@ -1177,8 +1177,8 @@
                 <w:left w:val="none" w:sz="0" w:space="0" w:color="000000"/>
                 <w:right w:val="none" w:sz="0" w:space="0" w:color="000000"/>
               </w:pBdr>
-              <w:spacing w:after="60" w:before="60" w:line="240"/>
-              <w:ind w:left="60" w:right="60" w:firstLine="0" w:firstLineChars="0"/>
+              <w:spacing w:after="40" w:before="40" w:line="240"/>
+              <w:ind w:left="20" w:right="20" w:firstLine="0" w:firstLineChars="0"/>
               <w:rPr>
                 <w:rFonts w:ascii="Arial" w:hAnsi="Arial" w:eastAsia="Arial" w:cs="Arial"/>
                 <w:i w:val="false"/>
@@ -1238,8 +1238,8 @@
                 <w:left w:val="none" w:sz="0" w:space="0" w:color="000000"/>
                 <w:right w:val="none" w:sz="0" w:space="0" w:color="000000"/>
               </w:pBdr>
-              <w:spacing w:after="60" w:before="60" w:line="240"/>
-              <w:ind w:left="60" w:right="60" w:firstLine="0" w:firstLineChars="0"/>
+              <w:spacing w:after="40" w:before="40" w:line="240"/>
+              <w:ind w:left="20" w:right="20" w:firstLine="0" w:firstLineChars="0"/>
               <w:rPr>
                 <w:rFonts w:ascii="Arial" w:hAnsi="Arial" w:eastAsia="Arial" w:cs="Arial"/>
                 <w:i w:val="false"/>
@@ -1293,8 +1293,8 @@
                 <w:left w:val="none" w:sz="0" w:space="0" w:color="000000"/>
                 <w:right w:val="none" w:sz="0" w:space="0" w:color="000000"/>
               </w:pBdr>
-              <w:spacing w:after="60" w:before="60" w:line="240"/>
-              <w:ind w:left="60" w:right="60" w:firstLine="0" w:firstLineChars="0"/>
+              <w:spacing w:after="40" w:before="40" w:line="240"/>
+              <w:ind w:left="20" w:right="20" w:firstLine="0" w:firstLineChars="0"/>
               <w:rPr>
                 <w:rFonts w:ascii="Arial" w:hAnsi="Arial" w:eastAsia="Arial" w:cs="Arial"/>
                 <w:i w:val="false"/>
@@ -1348,8 +1348,8 @@
                 <w:left w:val="none" w:sz="0" w:space="0" w:color="000000"/>
                 <w:right w:val="none" w:sz="0" w:space="0" w:color="000000"/>
               </w:pBdr>
-              <w:spacing w:after="60" w:before="60" w:line="240"/>
-              <w:ind w:left="60" w:right="60" w:firstLine="0" w:firstLineChars="0"/>
+              <w:spacing w:after="40" w:before="40" w:line="240"/>
+              <w:ind w:left="20" w:right="20" w:firstLine="0" w:firstLineChars="0"/>
               <w:rPr>
                 <w:rFonts w:ascii="Arial" w:hAnsi="Arial" w:eastAsia="Arial" w:cs="Arial"/>
                 <w:i w:val="false"/>
@@ -1403,8 +1403,8 @@
                 <w:left w:val="none" w:sz="0" w:space="0" w:color="000000"/>
                 <w:right w:val="none" w:sz="0" w:space="0" w:color="000000"/>
               </w:pBdr>
-              <w:spacing w:after="60" w:before="60" w:line="240"/>
-              <w:ind w:left="60" w:right="60" w:firstLine="0" w:firstLineChars="0"/>
+              <w:spacing w:after="40" w:before="40" w:line="240"/>
+              <w:ind w:left="20" w:right="20" w:firstLine="0" w:firstLineChars="0"/>
               <w:rPr>
                 <w:rFonts w:ascii="Arial" w:hAnsi="Arial" w:eastAsia="Arial" w:cs="Arial"/>
                 <w:i w:val="false"/>
@@ -1458,8 +1458,8 @@
                 <w:left w:val="none" w:sz="0" w:space="0" w:color="000000"/>
                 <w:right w:val="none" w:sz="0" w:space="0" w:color="000000"/>
               </w:pBdr>
-              <w:spacing w:after="60" w:before="60" w:line="240"/>
-              <w:ind w:left="60" w:right="60" w:firstLine="0" w:firstLineChars="0"/>
+              <w:spacing w:after="40" w:before="40" w:line="240"/>
+              <w:ind w:left="20" w:right="20" w:firstLine="0" w:firstLineChars="0"/>
               <w:rPr>
                 <w:rFonts w:ascii="Arial" w:hAnsi="Arial" w:eastAsia="Arial" w:cs="Arial"/>
                 <w:i w:val="false"/>
@@ -1513,8 +1513,8 @@
                 <w:left w:val="none" w:sz="0" w:space="0" w:color="000000"/>
                 <w:right w:val="none" w:sz="0" w:space="0" w:color="000000"/>
               </w:pBdr>
-              <w:spacing w:after="60" w:before="60" w:line="240"/>
-              <w:ind w:left="60" w:right="60" w:firstLine="0" w:firstLineChars="0"/>
+              <w:spacing w:after="40" w:before="40" w:line="240"/>
+              <w:ind w:left="20" w:right="20" w:firstLine="0" w:firstLineChars="0"/>
               <w:rPr>
                 <w:rFonts w:ascii="Arial" w:hAnsi="Arial" w:eastAsia="Arial" w:cs="Arial"/>
                 <w:i w:val="false"/>
@@ -1568,8 +1568,8 @@
                 <w:left w:val="none" w:sz="0" w:space="0" w:color="000000"/>
                 <w:right w:val="none" w:sz="0" w:space="0" w:color="000000"/>
               </w:pBdr>
-              <w:spacing w:after="60" w:before="60" w:line="240"/>
-              <w:ind w:left="60" w:right="60" w:firstLine="0" w:firstLineChars="0"/>
+              <w:spacing w:after="40" w:before="40" w:line="240"/>
+              <w:ind w:left="20" w:right="20" w:firstLine="0" w:firstLineChars="0"/>
               <w:rPr>
                 <w:rFonts w:ascii="Arial" w:hAnsi="Arial" w:eastAsia="Arial" w:cs="Arial"/>
                 <w:i w:val="false"/>
@@ -1629,8 +1629,8 @@
                 <w:left w:val="none" w:sz="0" w:space="0" w:color="000000"/>
                 <w:right w:val="none" w:sz="0" w:space="0" w:color="000000"/>
               </w:pBdr>
-              <w:spacing w:after="60" w:before="60" w:line="240"/>
-              <w:ind w:left="60" w:right="60" w:firstLine="0" w:firstLineChars="0"/>
+              <w:spacing w:after="40" w:before="40" w:line="240"/>
+              <w:ind w:left="20" w:right="20" w:firstLine="0" w:firstLineChars="0"/>
               <w:rPr>
                 <w:rFonts w:ascii="Arial" w:hAnsi="Arial" w:eastAsia="Arial" w:cs="Arial"/>
                 <w:i w:val="false"/>
@@ -1684,8 +1684,8 @@
                 <w:left w:val="none" w:sz="0" w:space="0" w:color="000000"/>
                 <w:right w:val="none" w:sz="0" w:space="0" w:color="000000"/>
               </w:pBdr>
-              <w:spacing w:after="60" w:before="60" w:line="240"/>
-              <w:ind w:left="60" w:right="60" w:firstLine="0" w:firstLineChars="0"/>
+              <w:spacing w:after="40" w:before="40" w:line="240"/>
+              <w:ind w:left="20" w:right="20" w:firstLine="0" w:firstLineChars="0"/>
               <w:rPr>
                 <w:rFonts w:ascii="Arial" w:hAnsi="Arial" w:eastAsia="Arial" w:cs="Arial"/>
                 <w:i w:val="false"/>
@@ -1739,8 +1739,8 @@
                 <w:left w:val="none" w:sz="0" w:space="0" w:color="000000"/>
                 <w:right w:val="none" w:sz="0" w:space="0" w:color="000000"/>
               </w:pBdr>
-              <w:spacing w:after="60" w:before="60" w:line="240"/>
-              <w:ind w:left="60" w:right="60" w:firstLine="0" w:firstLineChars="0"/>
+              <w:spacing w:after="40" w:before="40" w:line="240"/>
+              <w:ind w:left="20" w:right="20" w:firstLine="0" w:firstLineChars="0"/>
               <w:rPr>
                 <w:rFonts w:ascii="Arial" w:hAnsi="Arial" w:eastAsia="Arial" w:cs="Arial"/>
                 <w:i w:val="false"/>
@@ -1794,8 +1794,8 @@
                 <w:left w:val="none" w:sz="0" w:space="0" w:color="000000"/>
                 <w:right w:val="none" w:sz="0" w:space="0" w:color="000000"/>
               </w:pBdr>
-              <w:spacing w:after="60" w:before="60" w:line="240"/>
-              <w:ind w:left="60" w:right="60" w:firstLine="0" w:firstLineChars="0"/>
+              <w:spacing w:after="40" w:before="40" w:line="240"/>
+              <w:ind w:left="20" w:right="20" w:firstLine="0" w:firstLineChars="0"/>
               <w:rPr>
                 <w:rFonts w:ascii="Arial" w:hAnsi="Arial" w:eastAsia="Arial" w:cs="Arial"/>
                 <w:i w:val="false"/>
@@ -1849,8 +1849,8 @@
                 <w:left w:val="none" w:sz="0" w:space="0" w:color="000000"/>
                 <w:right w:val="none" w:sz="0" w:space="0" w:color="000000"/>
               </w:pBdr>
-              <w:spacing w:after="60" w:before="60" w:line="240"/>
-              <w:ind w:left="60" w:right="60" w:firstLine="0" w:firstLineChars="0"/>
+              <w:spacing w:after="40" w:before="40" w:line="240"/>
+              <w:ind w:left="20" w:right="20" w:firstLine="0" w:firstLineChars="0"/>
               <w:rPr>
                 <w:rFonts w:ascii="Arial" w:hAnsi="Arial" w:eastAsia="Arial" w:cs="Arial"/>
                 <w:i w:val="false"/>
@@ -1904,8 +1904,8 @@
                 <w:left w:val="none" w:sz="0" w:space="0" w:color="000000"/>
                 <w:right w:val="none" w:sz="0" w:space="0" w:color="000000"/>
               </w:pBdr>
-              <w:spacing w:after="60" w:before="60" w:line="240"/>
-              <w:ind w:left="60" w:right="60" w:firstLine="0" w:firstLineChars="0"/>
+              <w:spacing w:after="40" w:before="40" w:line="240"/>
+              <w:ind w:left="20" w:right="20" w:firstLine="0" w:firstLineChars="0"/>
               <w:rPr>
                 <w:rFonts w:ascii="Arial" w:hAnsi="Arial" w:eastAsia="Arial" w:cs="Arial"/>
                 <w:i w:val="false"/>
@@ -1959,8 +1959,8 @@
                 <w:left w:val="none" w:sz="0" w:space="0" w:color="000000"/>
                 <w:right w:val="none" w:sz="0" w:space="0" w:color="000000"/>
               </w:pBdr>
-              <w:spacing w:after="60" w:before="60" w:line="240"/>
-              <w:ind w:left="60" w:right="60" w:firstLine="0" w:firstLineChars="0"/>
+              <w:spacing w:after="40" w:before="40" w:line="240"/>
+              <w:ind w:left="20" w:right="20" w:firstLine="0" w:firstLineChars="0"/>
               <w:rPr>
                 <w:rFonts w:ascii="Arial" w:hAnsi="Arial" w:eastAsia="Arial" w:cs="Arial"/>
                 <w:i w:val="false"/>
@@ -2020,8 +2020,8 @@
                 <w:left w:val="none" w:sz="0" w:space="0" w:color="000000"/>
                 <w:right w:val="none" w:sz="0" w:space="0" w:color="000000"/>
               </w:pBdr>
-              <w:spacing w:after="60" w:before="60" w:line="240"/>
-              <w:ind w:left="60" w:right="60" w:firstLine="0" w:firstLineChars="0"/>
+              <w:spacing w:after="40" w:before="40" w:line="240"/>
+              <w:ind w:left="20" w:right="20" w:firstLine="0" w:firstLineChars="0"/>
               <w:rPr>
                 <w:rFonts w:ascii="Arial" w:hAnsi="Arial" w:eastAsia="Arial" w:cs="Arial"/>
                 <w:i w:val="false"/>
@@ -2075,8 +2075,8 @@
                 <w:left w:val="none" w:sz="0" w:space="0" w:color="000000"/>
                 <w:right w:val="none" w:sz="0" w:space="0" w:color="000000"/>
               </w:pBdr>
-              <w:spacing w:after="60" w:before="60" w:line="240"/>
-              <w:ind w:left="60" w:right="60" w:firstLine="0" w:firstLineChars="0"/>
+              <w:spacing w:after="40" w:before="40" w:line="240"/>
+              <w:ind w:left="20" w:right="20" w:firstLine="0" w:firstLineChars="0"/>
               <w:rPr>
                 <w:rFonts w:ascii="Arial" w:hAnsi="Arial" w:eastAsia="Arial" w:cs="Arial"/>
                 <w:i w:val="false"/>
@@ -2130,8 +2130,8 @@
                 <w:left w:val="none" w:sz="0" w:space="0" w:color="000000"/>
                 <w:right w:val="none" w:sz="0" w:space="0" w:color="000000"/>
               </w:pBdr>
-              <w:spacing w:after="60" w:before="60" w:line="240"/>
-              <w:ind w:left="60" w:right="60" w:firstLine="0" w:firstLineChars="0"/>
+              <w:spacing w:after="40" w:before="40" w:line="240"/>
+              <w:ind w:left="20" w:right="20" w:firstLine="0" w:firstLineChars="0"/>
               <w:rPr>
                 <w:rFonts w:ascii="Arial" w:hAnsi="Arial" w:eastAsia="Arial" w:cs="Arial"/>
                 <w:i w:val="false"/>
@@ -2185,8 +2185,8 @@
                 <w:left w:val="none" w:sz="0" w:space="0" w:color="000000"/>
                 <w:right w:val="none" w:sz="0" w:space="0" w:color="000000"/>
               </w:pBdr>
-              <w:spacing w:after="60" w:before="60" w:line="240"/>
-              <w:ind w:left="60" w:right="60" w:firstLine="0" w:firstLineChars="0"/>
+              <w:spacing w:after="40" w:before="40" w:line="240"/>
+              <w:ind w:left="20" w:right="20" w:firstLine="0" w:firstLineChars="0"/>
               <w:rPr>
                 <w:rFonts w:ascii="Arial" w:hAnsi="Arial" w:eastAsia="Arial" w:cs="Arial"/>
                 <w:i w:val="false"/>
@@ -2240,8 +2240,8 @@
                 <w:left w:val="none" w:sz="0" w:space="0" w:color="000000"/>
                 <w:right w:val="none" w:sz="0" w:space="0" w:color="000000"/>
               </w:pBdr>
-              <w:spacing w:after="60" w:before="60" w:line="240"/>
-              <w:ind w:left="60" w:right="60" w:firstLine="0" w:firstLineChars="0"/>
+              <w:spacing w:after="40" w:before="40" w:line="240"/>
+              <w:ind w:left="20" w:right="20" w:firstLine="0" w:firstLineChars="0"/>
               <w:rPr>
                 <w:rFonts w:ascii="Arial" w:hAnsi="Arial" w:eastAsia="Arial" w:cs="Arial"/>
                 <w:i w:val="false"/>
@@ -2295,8 +2295,8 @@
                 <w:left w:val="none" w:sz="0" w:space="0" w:color="000000"/>
                 <w:right w:val="none" w:sz="0" w:space="0" w:color="000000"/>
               </w:pBdr>
-              <w:spacing w:after="60" w:before="60" w:line="240"/>
-              <w:ind w:left="60" w:right="60" w:firstLine="0" w:firstLineChars="0"/>
+              <w:spacing w:after="40" w:before="40" w:line="240"/>
+              <w:ind w:left="20" w:right="20" w:firstLine="0" w:firstLineChars="0"/>
               <w:rPr>
                 <w:rFonts w:ascii="Arial" w:hAnsi="Arial" w:eastAsia="Arial" w:cs="Arial"/>
                 <w:i w:val="false"/>
@@ -2350,8 +2350,8 @@
                 <w:left w:val="none" w:sz="0" w:space="0" w:color="000000"/>
                 <w:right w:val="none" w:sz="0" w:space="0" w:color="000000"/>
               </w:pBdr>
-              <w:spacing w:after="60" w:before="60" w:line="240"/>
-              <w:ind w:left="60" w:right="60" w:firstLine="0" w:firstLineChars="0"/>
+              <w:spacing w:after="40" w:before="40" w:line="240"/>
+              <w:ind w:left="20" w:right="20" w:firstLine="0" w:firstLineChars="0"/>
               <w:rPr>
                 <w:rFonts w:ascii="Arial" w:hAnsi="Arial" w:eastAsia="Arial" w:cs="Arial"/>
                 <w:i w:val="false"/>
@@ -2411,8 +2411,8 @@
                 <w:left w:val="none" w:sz="0" w:space="0" w:color="000000"/>
                 <w:right w:val="none" w:sz="0" w:space="0" w:color="000000"/>
               </w:pBdr>
-              <w:spacing w:after="60" w:before="60" w:line="240"/>
-              <w:ind w:left="60" w:right="60" w:firstLine="0" w:firstLineChars="0"/>
+              <w:spacing w:after="40" w:before="40" w:line="240"/>
+              <w:ind w:left="20" w:right="20" w:firstLine="0" w:firstLineChars="0"/>
               <w:rPr>
                 <w:rFonts w:ascii="Arial" w:hAnsi="Arial" w:eastAsia="Arial" w:cs="Arial"/>
                 <w:i w:val="false"/>
@@ -2466,8 +2466,8 @@
                 <w:left w:val="none" w:sz="0" w:space="0" w:color="000000"/>
                 <w:right w:val="none" w:sz="0" w:space="0" w:color="000000"/>
               </w:pBdr>
-              <w:spacing w:after="60" w:before="60" w:line="240"/>
-              <w:ind w:left="60" w:right="60" w:firstLine="0" w:firstLineChars="0"/>
+              <w:spacing w:after="40" w:before="40" w:line="240"/>
+              <w:ind w:left="20" w:right="20" w:firstLine="0" w:firstLineChars="0"/>
               <w:rPr>
                 <w:rFonts w:ascii="Arial" w:hAnsi="Arial" w:eastAsia="Arial" w:cs="Arial"/>
                 <w:i w:val="false"/>
@@ -2521,8 +2521,8 @@
                 <w:left w:val="none" w:sz="0" w:space="0" w:color="000000"/>
                 <w:right w:val="none" w:sz="0" w:space="0" w:color="000000"/>
               </w:pBdr>
-              <w:spacing w:after="60" w:before="60" w:line="240"/>
-              <w:ind w:left="60" w:right="60" w:firstLine="0" w:firstLineChars="0"/>
+              <w:spacing w:after="40" w:before="40" w:line="240"/>
+              <w:ind w:left="20" w:right="20" w:firstLine="0" w:firstLineChars="0"/>
               <w:rPr>
                 <w:rFonts w:ascii="Arial" w:hAnsi="Arial" w:eastAsia="Arial" w:cs="Arial"/>
                 <w:i w:val="false"/>
@@ -2576,8 +2576,8 @@
                 <w:left w:val="none" w:sz="0" w:space="0" w:color="000000"/>
                 <w:right w:val="none" w:sz="0" w:space="0" w:color="000000"/>
               </w:pBdr>
-              <w:spacing w:after="60" w:before="60" w:line="240"/>
-              <w:ind w:left="60" w:right="60" w:firstLine="0" w:firstLineChars="0"/>
+              <w:spacing w:after="40" w:before="40" w:line="240"/>
+              <w:ind w:left="20" w:right="20" w:firstLine="0" w:firstLineChars="0"/>
               <w:rPr>
                 <w:rFonts w:ascii="Arial" w:hAnsi="Arial" w:eastAsia="Arial" w:cs="Arial"/>
                 <w:i w:val="false"/>
@@ -2631,8 +2631,8 @@
                 <w:left w:val="none" w:sz="0" w:space="0" w:color="000000"/>
                 <w:right w:val="none" w:sz="0" w:space="0" w:color="000000"/>
               </w:pBdr>
-              <w:spacing w:after="60" w:before="60" w:line="240"/>
-              <w:ind w:left="60" w:right="60" w:firstLine="0" w:firstLineChars="0"/>
+              <w:spacing w:after="40" w:before="40" w:line="240"/>
+              <w:ind w:left="20" w:right="20" w:firstLine="0" w:firstLineChars="0"/>
               <w:rPr>
                 <w:rFonts w:ascii="Arial" w:hAnsi="Arial" w:eastAsia="Arial" w:cs="Arial"/>
                 <w:i w:val="false"/>
@@ -2686,8 +2686,8 @@
                 <w:left w:val="none" w:sz="0" w:space="0" w:color="000000"/>
                 <w:right w:val="none" w:sz="0" w:space="0" w:color="000000"/>
               </w:pBdr>
-              <w:spacing w:after="60" w:before="60" w:line="240"/>
-              <w:ind w:left="60" w:right="60" w:firstLine="0" w:firstLineChars="0"/>
+              <w:spacing w:after="40" w:before="40" w:line="240"/>
+              <w:ind w:left="20" w:right="20" w:firstLine="0" w:firstLineChars="0"/>
               <w:rPr>
                 <w:rFonts w:ascii="Arial" w:hAnsi="Arial" w:eastAsia="Arial" w:cs="Arial"/>
                 <w:i w:val="false"/>
@@ -2741,8 +2741,8 @@
                 <w:left w:val="none" w:sz="0" w:space="0" w:color="000000"/>
                 <w:right w:val="none" w:sz="0" w:space="0" w:color="000000"/>
               </w:pBdr>
-              <w:spacing w:after="60" w:before="60" w:line="240"/>
-              <w:ind w:left="60" w:right="60" w:firstLine="0" w:firstLineChars="0"/>
+              <w:spacing w:after="40" w:before="40" w:line="240"/>
+              <w:ind w:left="20" w:right="20" w:firstLine="0" w:firstLineChars="0"/>
               <w:rPr>
                 <w:rFonts w:ascii="Arial" w:hAnsi="Arial" w:eastAsia="Arial" w:cs="Arial"/>
                 <w:i w:val="false"/>
@@ -2802,8 +2802,8 @@
                 <w:left w:val="none" w:sz="0" w:space="0" w:color="000000"/>
                 <w:right w:val="none" w:sz="0" w:space="0" w:color="000000"/>
               </w:pBdr>
-              <w:spacing w:after="60" w:before="60" w:line="240"/>
-              <w:ind w:left="60" w:right="60" w:firstLine="0" w:firstLineChars="0"/>
+              <w:spacing w:after="40" w:before="40" w:line="240"/>
+              <w:ind w:left="20" w:right="20" w:firstLine="0" w:firstLineChars="0"/>
               <w:rPr>
                 <w:rFonts w:ascii="Arial" w:hAnsi="Arial" w:eastAsia="Arial" w:cs="Arial"/>
                 <w:i w:val="false"/>
@@ -2857,8 +2857,8 @@
                 <w:left w:val="none" w:sz="0" w:space="0" w:color="000000"/>
                 <w:right w:val="none" w:sz="0" w:space="0" w:color="000000"/>
               </w:pBdr>
-              <w:spacing w:after="60" w:before="60" w:line="240"/>
-              <w:ind w:left="60" w:right="60" w:firstLine="0" w:firstLineChars="0"/>
+              <w:spacing w:after="40" w:before="40" w:line="240"/>
+              <w:ind w:left="20" w:right="20" w:firstLine="0" w:firstLineChars="0"/>
               <w:rPr>
                 <w:rFonts w:ascii="Arial" w:hAnsi="Arial" w:eastAsia="Arial" w:cs="Arial"/>
                 <w:i w:val="false"/>
@@ -2912,8 +2912,8 @@
                 <w:left w:val="none" w:sz="0" w:space="0" w:color="000000"/>
                 <w:right w:val="none" w:sz="0" w:space="0" w:color="000000"/>
               </w:pBdr>
-              <w:spacing w:after="60" w:before="60" w:line="240"/>
-              <w:ind w:left="60" w:right="60" w:firstLine="0" w:firstLineChars="0"/>
+              <w:spacing w:after="40" w:before="40" w:line="240"/>
+              <w:ind w:left="20" w:right="20" w:firstLine="0" w:firstLineChars="0"/>
               <w:rPr>
                 <w:rFonts w:ascii="Arial" w:hAnsi="Arial" w:eastAsia="Arial" w:cs="Arial"/>
                 <w:i w:val="false"/>
@@ -2967,8 +2967,8 @@
                 <w:left w:val="none" w:sz="0" w:space="0" w:color="000000"/>
                 <w:right w:val="none" w:sz="0" w:space="0" w:color="000000"/>
               </w:pBdr>
-              <w:spacing w:after="60" w:before="60" w:line="240"/>
-              <w:ind w:left="60" w:right="60" w:firstLine="0" w:firstLineChars="0"/>
+              <w:spacing w:after="40" w:before="40" w:line="240"/>
+              <w:ind w:left="20" w:right="20" w:firstLine="0" w:firstLineChars="0"/>
               <w:rPr>
                 <w:rFonts w:ascii="Arial" w:hAnsi="Arial" w:eastAsia="Arial" w:cs="Arial"/>
                 <w:i w:val="false"/>
@@ -3022,8 +3022,8 @@
                 <w:left w:val="none" w:sz="0" w:space="0" w:color="000000"/>
                 <w:right w:val="none" w:sz="0" w:space="0" w:color="000000"/>
               </w:pBdr>
-              <w:spacing w:after="60" w:before="60" w:line="240"/>
-              <w:ind w:left="60" w:right="60" w:firstLine="0" w:firstLineChars="0"/>
+              <w:spacing w:after="40" w:before="40" w:line="240"/>
+              <w:ind w:left="20" w:right="20" w:firstLine="0" w:firstLineChars="0"/>
               <w:rPr>
                 <w:rFonts w:ascii="Arial" w:hAnsi="Arial" w:eastAsia="Arial" w:cs="Arial"/>
                 <w:i w:val="false"/>
@@ -3077,8 +3077,8 @@
                 <w:left w:val="none" w:sz="0" w:space="0" w:color="000000"/>
                 <w:right w:val="none" w:sz="0" w:space="0" w:color="000000"/>
               </w:pBdr>
-              <w:spacing w:after="60" w:before="60" w:line="240"/>
-              <w:ind w:left="60" w:right="60" w:firstLine="0" w:firstLineChars="0"/>
+              <w:spacing w:after="40" w:before="40" w:line="240"/>
+              <w:ind w:left="20" w:right="20" w:firstLine="0" w:firstLineChars="0"/>
               <w:rPr>
                 <w:rFonts w:ascii="Arial" w:hAnsi="Arial" w:eastAsia="Arial" w:cs="Arial"/>
                 <w:i w:val="false"/>
@@ -3132,8 +3132,8 @@
                 <w:left w:val="none" w:sz="0" w:space="0" w:color="000000"/>
                 <w:right w:val="none" w:sz="0" w:space="0" w:color="000000"/>
               </w:pBdr>
-              <w:spacing w:after="60" w:before="60" w:line="240"/>
-              <w:ind w:left="60" w:right="60" w:firstLine="0" w:firstLineChars="0"/>
+              <w:spacing w:after="40" w:before="40" w:line="240"/>
+              <w:ind w:left="20" w:right="20" w:firstLine="0" w:firstLineChars="0"/>
               <w:rPr>
                 <w:rFonts w:ascii="Arial" w:hAnsi="Arial" w:eastAsia="Arial" w:cs="Arial"/>
                 <w:i w:val="false"/>
@@ -3193,8 +3193,8 @@
                 <w:left w:val="none" w:sz="0" w:space="0" w:color="000000"/>
                 <w:right w:val="none" w:sz="0" w:space="0" w:color="000000"/>
               </w:pBdr>
-              <w:spacing w:after="60" w:before="60" w:line="240"/>
-              <w:ind w:left="60" w:right="60" w:firstLine="0" w:firstLineChars="0"/>
+              <w:spacing w:after="40" w:before="40" w:line="240"/>
+              <w:ind w:left="20" w:right="20" w:firstLine="0" w:firstLineChars="0"/>
               <w:rPr>
                 <w:rFonts w:ascii="Arial" w:hAnsi="Arial" w:eastAsia="Arial" w:cs="Arial"/>
                 <w:i w:val="false"/>
@@ -3248,8 +3248,8 @@
                 <w:left w:val="none" w:sz="0" w:space="0" w:color="000000"/>
                 <w:right w:val="none" w:sz="0" w:space="0" w:color="000000"/>
               </w:pBdr>
-              <w:spacing w:after="60" w:before="60" w:line="240"/>
-              <w:ind w:left="60" w:right="60" w:firstLine="0" w:firstLineChars="0"/>
+              <w:spacing w:after="40" w:before="40" w:line="240"/>
+              <w:ind w:left="20" w:right="20" w:firstLine="0" w:firstLineChars="0"/>
               <w:rPr>
                 <w:rFonts w:ascii="Arial" w:hAnsi="Arial" w:eastAsia="Arial" w:cs="Arial"/>
                 <w:i w:val="false"/>
@@ -3303,8 +3303,8 @@
                 <w:left w:val="none" w:sz="0" w:space="0" w:color="000000"/>
                 <w:right w:val="none" w:sz="0" w:space="0" w:color="000000"/>
               </w:pBdr>
-              <w:spacing w:after="60" w:before="60" w:line="240"/>
-              <w:ind w:left="60" w:right="60" w:firstLine="0" w:firstLineChars="0"/>
+              <w:spacing w:after="40" w:before="40" w:line="240"/>
+              <w:ind w:left="20" w:right="20" w:firstLine="0" w:firstLineChars="0"/>
               <w:rPr>
                 <w:rFonts w:ascii="Arial" w:hAnsi="Arial" w:eastAsia="Arial" w:cs="Arial"/>
                 <w:i w:val="false"/>
@@ -3358,8 +3358,8 @@
                 <w:left w:val="none" w:sz="0" w:space="0" w:color="000000"/>
                 <w:right w:val="none" w:sz="0" w:space="0" w:color="000000"/>
               </w:pBdr>
-              <w:spacing w:after="60" w:before="60" w:line="240"/>
-              <w:ind w:left="60" w:right="60" w:firstLine="0" w:firstLineChars="0"/>
+              <w:spacing w:after="40" w:before="40" w:line="240"/>
+              <w:ind w:left="20" w:right="20" w:firstLine="0" w:firstLineChars="0"/>
               <w:rPr>
                 <w:rFonts w:ascii="Arial" w:hAnsi="Arial" w:eastAsia="Arial" w:cs="Arial"/>
                 <w:i w:val="false"/>
@@ -3413,8 +3413,8 @@
                 <w:left w:val="none" w:sz="0" w:space="0" w:color="000000"/>
                 <w:right w:val="none" w:sz="0" w:space="0" w:color="000000"/>
               </w:pBdr>
-              <w:spacing w:after="60" w:before="60" w:line="240"/>
-              <w:ind w:left="60" w:right="60" w:firstLine="0" w:firstLineChars="0"/>
+              <w:spacing w:after="40" w:before="40" w:line="240"/>
+              <w:ind w:left="20" w:right="20" w:firstLine="0" w:firstLineChars="0"/>
               <w:rPr>
                 <w:rFonts w:ascii="Arial" w:hAnsi="Arial" w:eastAsia="Arial" w:cs="Arial"/>
                 <w:i w:val="false"/>
@@ -3468,8 +3468,8 @@
                 <w:left w:val="none" w:sz="0" w:space="0" w:color="000000"/>
                 <w:right w:val="none" w:sz="0" w:space="0" w:color="000000"/>
               </w:pBdr>
-              <w:spacing w:after="60" w:before="60" w:line="240"/>
-              <w:ind w:left="60" w:right="60" w:firstLine="0" w:firstLineChars="0"/>
+              <w:spacing w:after="40" w:before="40" w:line="240"/>
+              <w:ind w:left="20" w:right="20" w:firstLine="0" w:firstLineChars="0"/>
               <w:rPr>
                 <w:rFonts w:ascii="Arial" w:hAnsi="Arial" w:eastAsia="Arial" w:cs="Arial"/>
                 <w:i w:val="false"/>
@@ -3523,8 +3523,8 @@
                 <w:left w:val="none" w:sz="0" w:space="0" w:color="000000"/>
                 <w:right w:val="none" w:sz="0" w:space="0" w:color="000000"/>
               </w:pBdr>
-              <w:spacing w:after="60" w:before="60" w:line="240"/>
-              <w:ind w:left="60" w:right="60" w:firstLine="0" w:firstLineChars="0"/>
+              <w:spacing w:after="40" w:before="40" w:line="240"/>
+              <w:ind w:left="20" w:right="20" w:firstLine="0" w:firstLineChars="0"/>
               <w:rPr>
                 <w:rFonts w:ascii="Arial" w:hAnsi="Arial" w:eastAsia="Arial" w:cs="Arial"/>
                 <w:i w:val="false"/>
@@ -3584,8 +3584,8 @@
                 <w:left w:val="none" w:sz="0" w:space="0" w:color="000000"/>
                 <w:right w:val="none" w:sz="0" w:space="0" w:color="000000"/>
               </w:pBdr>
-              <w:spacing w:after="60" w:before="60" w:line="240"/>
-              <w:ind w:left="60" w:right="60" w:firstLine="0" w:firstLineChars="0"/>
+              <w:spacing w:after="40" w:before="40" w:line="240"/>
+              <w:ind w:left="20" w:right="20" w:firstLine="0" w:firstLineChars="0"/>
               <w:rPr>
                 <w:rFonts w:ascii="Arial" w:hAnsi="Arial" w:eastAsia="Arial" w:cs="Arial"/>
                 <w:i w:val="false"/>
@@ -3639,8 +3639,8 @@
                 <w:left w:val="none" w:sz="0" w:space="0" w:color="000000"/>
                 <w:right w:val="none" w:sz="0" w:space="0" w:color="000000"/>
               </w:pBdr>
-              <w:spacing w:after="60" w:before="60" w:line="240"/>
-              <w:ind w:left="60" w:right="60" w:firstLine="0" w:firstLineChars="0"/>
+              <w:spacing w:after="40" w:before="40" w:line="240"/>
+              <w:ind w:left="20" w:right="20" w:firstLine="0" w:firstLineChars="0"/>
               <w:rPr>
                 <w:rFonts w:ascii="Arial" w:hAnsi="Arial" w:eastAsia="Arial" w:cs="Arial"/>
                 <w:i w:val="false"/>
@@ -3694,8 +3694,8 @@
                 <w:left w:val="none" w:sz="0" w:space="0" w:color="000000"/>
                 <w:right w:val="none" w:sz="0" w:space="0" w:color="000000"/>
               </w:pBdr>
-              <w:spacing w:after="60" w:before="60" w:line="240"/>
-              <w:ind w:left="60" w:right="60" w:firstLine="0" w:firstLineChars="0"/>
+              <w:spacing w:after="40" w:before="40" w:line="240"/>
+              <w:ind w:left="20" w:right="20" w:firstLine="0" w:firstLineChars="0"/>
               <w:rPr>
                 <w:rFonts w:ascii="Arial" w:hAnsi="Arial" w:eastAsia="Arial" w:cs="Arial"/>
                 <w:i w:val="false"/>
@@ -3749,8 +3749,8 @@
                 <w:left w:val="none" w:sz="0" w:space="0" w:color="000000"/>
                 <w:right w:val="none" w:sz="0" w:space="0" w:color="000000"/>
               </w:pBdr>
-              <w:spacing w:after="60" w:before="60" w:line="240"/>
-              <w:ind w:left="60" w:right="60" w:firstLine="0" w:firstLineChars="0"/>
+              <w:spacing w:after="40" w:before="40" w:line="240"/>
+              <w:ind w:left="20" w:right="20" w:firstLine="0" w:firstLineChars="0"/>
               <w:rPr>
                 <w:rFonts w:ascii="Arial" w:hAnsi="Arial" w:eastAsia="Arial" w:cs="Arial"/>
                 <w:i w:val="false"/>
@@ -3804,8 +3804,8 @@
                 <w:left w:val="none" w:sz="0" w:space="0" w:color="000000"/>
                 <w:right w:val="none" w:sz="0" w:space="0" w:color="000000"/>
               </w:pBdr>
-              <w:spacing w:after="60" w:before="60" w:line="240"/>
-              <w:ind w:left="60" w:right="60" w:firstLine="0" w:firstLineChars="0"/>
+              <w:spacing w:after="40" w:before="40" w:line="240"/>
+              <w:ind w:left="20" w:right="20" w:firstLine="0" w:firstLineChars="0"/>
               <w:rPr>
                 <w:rFonts w:ascii="Arial" w:hAnsi="Arial" w:eastAsia="Arial" w:cs="Arial"/>
                 <w:i w:val="false"/>
@@ -3859,8 +3859,8 @@
                 <w:left w:val="none" w:sz="0" w:space="0" w:color="000000"/>
                 <w:right w:val="none" w:sz="0" w:space="0" w:color="000000"/>
               </w:pBdr>
-              <w:spacing w:after="60" w:before="60" w:line="240"/>
-              <w:ind w:left="60" w:right="60" w:firstLine="0" w:firstLineChars="0"/>
+              <w:spacing w:after="40" w:before="40" w:line="240"/>
+              <w:ind w:left="20" w:right="20" w:firstLine="0" w:firstLineChars="0"/>
               <w:rPr>
                 <w:rFonts w:ascii="Arial" w:hAnsi="Arial" w:eastAsia="Arial" w:cs="Arial"/>
                 <w:i w:val="false"/>
@@ -3914,8 +3914,8 @@
                 <w:left w:val="none" w:sz="0" w:space="0" w:color="000000"/>
                 <w:right w:val="none" w:sz="0" w:space="0" w:color="000000"/>
               </w:pBdr>
-              <w:spacing w:after="60" w:before="60" w:line="240"/>
-              <w:ind w:left="60" w:right="60" w:firstLine="0" w:firstLineChars="0"/>
+              <w:spacing w:after="40" w:before="40" w:line="240"/>
+              <w:ind w:left="20" w:right="20" w:firstLine="0" w:firstLineChars="0"/>
               <w:rPr>
                 <w:rFonts w:ascii="Arial" w:hAnsi="Arial" w:eastAsia="Arial" w:cs="Arial"/>
                 <w:i w:val="false"/>
@@ -3975,8 +3975,8 @@
                 <w:left w:val="none" w:sz="0" w:space="0" w:color="000000"/>
                 <w:right w:val="none" w:sz="0" w:space="0" w:color="000000"/>
               </w:pBdr>
-              <w:spacing w:after="60" w:before="60" w:line="240"/>
-              <w:ind w:left="60" w:right="60" w:firstLine="0" w:firstLineChars="0"/>
+              <w:spacing w:after="40" w:before="40" w:line="240"/>
+              <w:ind w:left="20" w:right="20" w:firstLine="0" w:firstLineChars="0"/>
               <w:rPr>
                 <w:rFonts w:ascii="Arial" w:hAnsi="Arial" w:eastAsia="Arial" w:cs="Arial"/>
                 <w:i w:val="false"/>
@@ -4030,8 +4030,8 @@
                 <w:left w:val="none" w:sz="0" w:space="0" w:color="000000"/>
                 <w:right w:val="none" w:sz="0" w:space="0" w:color="000000"/>
               </w:pBdr>
-              <w:spacing w:after="60" w:before="60" w:line="240"/>
-              <w:ind w:left="60" w:right="60" w:firstLine="0" w:firstLineChars="0"/>
+              <w:spacing w:after="40" w:before="40" w:line="240"/>
+              <w:ind w:left="20" w:right="20" w:firstLine="0" w:firstLineChars="0"/>
               <w:rPr>
                 <w:rFonts w:ascii="Arial" w:hAnsi="Arial" w:eastAsia="Arial" w:cs="Arial"/>
                 <w:i w:val="false"/>
@@ -4085,8 +4085,8 @@
                 <w:left w:val="none" w:sz="0" w:space="0" w:color="000000"/>
                 <w:right w:val="none" w:sz="0" w:space="0" w:color="000000"/>
               </w:pBdr>
-              <w:spacing w:after="60" w:before="60" w:line="240"/>
-              <w:ind w:left="60" w:right="60" w:firstLine="0" w:firstLineChars="0"/>
+              <w:spacing w:after="40" w:before="40" w:line="240"/>
+              <w:ind w:left="20" w:right="20" w:firstLine="0" w:firstLineChars="0"/>
               <w:rPr>
                 <w:rFonts w:ascii="Arial" w:hAnsi="Arial" w:eastAsia="Arial" w:cs="Arial"/>
                 <w:i w:val="false"/>
@@ -4140,8 +4140,8 @@
                 <w:left w:val="none" w:sz="0" w:space="0" w:color="000000"/>
                 <w:right w:val="none" w:sz="0" w:space="0" w:color="000000"/>
               </w:pBdr>
-              <w:spacing w:after="60" w:before="60" w:line="240"/>
-              <w:ind w:left="60" w:right="60" w:firstLine="0" w:firstLineChars="0"/>
+              <w:spacing w:after="40" w:before="40" w:line="240"/>
+              <w:ind w:left="20" w:right="20" w:firstLine="0" w:firstLineChars="0"/>
               <w:rPr>
                 <w:rFonts w:ascii="Arial" w:hAnsi="Arial" w:eastAsia="Arial" w:cs="Arial"/>
                 <w:i w:val="false"/>
@@ -4195,8 +4195,8 @@
                 <w:left w:val="none" w:sz="0" w:space="0" w:color="000000"/>
                 <w:right w:val="none" w:sz="0" w:space="0" w:color="000000"/>
               </w:pBdr>
-              <w:spacing w:after="60" w:before="60" w:line="240"/>
-              <w:ind w:left="60" w:right="60" w:firstLine="0" w:firstLineChars="0"/>
+              <w:spacing w:after="40" w:before="40" w:line="240"/>
+              <w:ind w:left="20" w:right="20" w:firstLine="0" w:firstLineChars="0"/>
               <w:rPr>
                 <w:rFonts w:ascii="Arial" w:hAnsi="Arial" w:eastAsia="Arial" w:cs="Arial"/>
                 <w:i w:val="false"/>
@@ -4250,8 +4250,8 @@
                 <w:left w:val="none" w:sz="0" w:space="0" w:color="000000"/>
                 <w:right w:val="none" w:sz="0" w:space="0" w:color="000000"/>
               </w:pBdr>
-              <w:spacing w:after="60" w:before="60" w:line="240"/>
-              <w:ind w:left="60" w:right="60" w:firstLine="0" w:firstLineChars="0"/>
+              <w:spacing w:after="40" w:before="40" w:line="240"/>
+              <w:ind w:left="20" w:right="20" w:firstLine="0" w:firstLineChars="0"/>
               <w:rPr>
                 <w:rFonts w:ascii="Arial" w:hAnsi="Arial" w:eastAsia="Arial" w:cs="Arial"/>
                 <w:i w:val="false"/>
@@ -4305,8 +4305,8 @@
                 <w:left w:val="none" w:sz="0" w:space="0" w:color="000000"/>
                 <w:right w:val="none" w:sz="0" w:space="0" w:color="000000"/>
               </w:pBdr>
-              <w:spacing w:after="60" w:before="60" w:line="240"/>
-              <w:ind w:left="60" w:right="60" w:firstLine="0" w:firstLineChars="0"/>
+              <w:spacing w:after="40" w:before="40" w:line="240"/>
+              <w:ind w:left="20" w:right="20" w:firstLine="0" w:firstLineChars="0"/>
               <w:rPr>
                 <w:rFonts w:ascii="Arial" w:hAnsi="Arial" w:eastAsia="Arial" w:cs="Arial"/>
                 <w:i w:val="false"/>
@@ -4366,8 +4366,8 @@
                 <w:left w:val="none" w:sz="0" w:space="0" w:color="000000"/>
                 <w:right w:val="none" w:sz="0" w:space="0" w:color="000000"/>
               </w:pBdr>
-              <w:spacing w:after="60" w:before="60" w:line="240"/>
-              <w:ind w:left="60" w:right="60" w:firstLine="0" w:firstLineChars="0"/>
+              <w:spacing w:after="40" w:before="40" w:line="240"/>
+              <w:ind w:left="20" w:right="20" w:firstLine="0" w:firstLineChars="0"/>
               <w:rPr>
                 <w:rFonts w:ascii="Arial" w:hAnsi="Arial" w:eastAsia="Arial" w:cs="Arial"/>
                 <w:i w:val="false"/>
@@ -4421,8 +4421,8 @@
                 <w:left w:val="none" w:sz="0" w:space="0" w:color="000000"/>
                 <w:right w:val="none" w:sz="0" w:space="0" w:color="000000"/>
               </w:pBdr>
-              <w:spacing w:after="60" w:before="60" w:line="240"/>
-              <w:ind w:left="60" w:right="60" w:firstLine="0" w:firstLineChars="0"/>
+              <w:spacing w:after="40" w:before="40" w:line="240"/>
+              <w:ind w:left="20" w:right="20" w:firstLine="0" w:firstLineChars="0"/>
               <w:rPr>
                 <w:rFonts w:ascii="Arial" w:hAnsi="Arial" w:eastAsia="Arial" w:cs="Arial"/>
                 <w:i w:val="false"/>
@@ -4476,8 +4476,8 @@
                 <w:left w:val="none" w:sz="0" w:space="0" w:color="000000"/>
                 <w:right w:val="none" w:sz="0" w:space="0" w:color="000000"/>
               </w:pBdr>
-              <w:spacing w:after="60" w:before="60" w:line="240"/>
-              <w:ind w:left="60" w:right="60" w:firstLine="0" w:firstLineChars="0"/>
+              <w:spacing w:after="40" w:before="40" w:line="240"/>
+              <w:ind w:left="20" w:right="20" w:firstLine="0" w:firstLineChars="0"/>
               <w:rPr>
                 <w:rFonts w:ascii="Arial" w:hAnsi="Arial" w:eastAsia="Arial" w:cs="Arial"/>
                 <w:i w:val="false"/>
@@ -4531,8 +4531,8 @@
                 <w:left w:val="none" w:sz="0" w:space="0" w:color="000000"/>
                 <w:right w:val="none" w:sz="0" w:space="0" w:color="000000"/>
               </w:pBdr>
-              <w:spacing w:after="60" w:before="60" w:line="240"/>
-              <w:ind w:left="60" w:right="60" w:firstLine="0" w:firstLineChars="0"/>
+              <w:spacing w:after="40" w:before="40" w:line="240"/>
+              <w:ind w:left="20" w:right="20" w:firstLine="0" w:firstLineChars="0"/>
               <w:rPr>
                 <w:rFonts w:ascii="Arial" w:hAnsi="Arial" w:eastAsia="Arial" w:cs="Arial"/>
                 <w:i w:val="false"/>
@@ -4586,8 +4586,8 @@
                 <w:left w:val="none" w:sz="0" w:space="0" w:color="000000"/>
                 <w:right w:val="none" w:sz="0" w:space="0" w:color="000000"/>
               </w:pBdr>
-              <w:spacing w:after="60" w:before="60" w:line="240"/>
-              <w:ind w:left="60" w:right="60" w:firstLine="0" w:firstLineChars="0"/>
+              <w:spacing w:after="40" w:before="40" w:line="240"/>
+              <w:ind w:left="20" w:right="20" w:firstLine="0" w:firstLineChars="0"/>
               <w:rPr>
                 <w:rFonts w:ascii="Arial" w:hAnsi="Arial" w:eastAsia="Arial" w:cs="Arial"/>
                 <w:i w:val="false"/>
@@ -4641,8 +4641,8 @@
                 <w:left w:val="none" w:sz="0" w:space="0" w:color="000000"/>
                 <w:right w:val="none" w:sz="0" w:space="0" w:color="000000"/>
               </w:pBdr>
-              <w:spacing w:after="60" w:before="60" w:line="240"/>
-              <w:ind w:left="60" w:right="60" w:firstLine="0" w:firstLineChars="0"/>
+              <w:spacing w:after="40" w:before="40" w:line="240"/>
+              <w:ind w:left="20" w:right="20" w:firstLine="0" w:firstLineChars="0"/>
               <w:rPr>
                 <w:rFonts w:ascii="Arial" w:hAnsi="Arial" w:eastAsia="Arial" w:cs="Arial"/>
                 <w:i w:val="false"/>
@@ -4696,8 +4696,8 @@
                 <w:left w:val="none" w:sz="0" w:space="0" w:color="000000"/>
                 <w:right w:val="none" w:sz="0" w:space="0" w:color="000000"/>
               </w:pBdr>
-              <w:spacing w:after="60" w:before="60" w:line="240"/>
-              <w:ind w:left="60" w:right="60" w:firstLine="0" w:firstLineChars="0"/>
+              <w:spacing w:after="40" w:before="40" w:line="240"/>
+              <w:ind w:left="20" w:right="20" w:firstLine="0" w:firstLineChars="0"/>
               <w:rPr>
                 <w:rFonts w:ascii="Arial" w:hAnsi="Arial" w:eastAsia="Arial" w:cs="Arial"/>
                 <w:i w:val="false"/>
@@ -4757,8 +4757,8 @@
                 <w:left w:val="none" w:sz="0" w:space="0" w:color="000000"/>
                 <w:right w:val="none" w:sz="0" w:space="0" w:color="000000"/>
               </w:pBdr>
-              <w:spacing w:after="60" w:before="60" w:line="240"/>
-              <w:ind w:left="60" w:right="60" w:firstLine="0" w:firstLineChars="0"/>
+              <w:spacing w:after="40" w:before="40" w:line="240"/>
+              <w:ind w:left="20" w:right="20" w:firstLine="0" w:firstLineChars="0"/>
               <w:rPr>
                 <w:rFonts w:ascii="Arial" w:hAnsi="Arial" w:eastAsia="Arial" w:cs="Arial"/>
                 <w:i w:val="false"/>
@@ -4812,8 +4812,8 @@
                 <w:left w:val="none" w:sz="0" w:space="0" w:color="000000"/>
                 <w:right w:val="none" w:sz="0" w:space="0" w:color="000000"/>
               </w:pBdr>
-              <w:spacing w:after="60" w:before="60" w:line="240"/>
-              <w:ind w:left="60" w:right="60" w:firstLine="0" w:firstLineChars="0"/>
+              <w:spacing w:after="40" w:before="40" w:line="240"/>
+              <w:ind w:left="20" w:right="20" w:firstLine="0" w:firstLineChars="0"/>
               <w:rPr>
                 <w:rFonts w:ascii="Arial" w:hAnsi="Arial" w:eastAsia="Arial" w:cs="Arial"/>
                 <w:i w:val="false"/>
@@ -4867,8 +4867,8 @@
                 <w:left w:val="none" w:sz="0" w:space="0" w:color="000000"/>
                 <w:right w:val="none" w:sz="0" w:space="0" w:color="000000"/>
               </w:pBdr>
-              <w:spacing w:after="60" w:before="60" w:line="240"/>
-              <w:ind w:left="60" w:right="60" w:firstLine="0" w:firstLineChars="0"/>
+              <w:spacing w:after="40" w:before="40" w:line="240"/>
+              <w:ind w:left="20" w:right="20" w:firstLine="0" w:firstLineChars="0"/>
               <w:rPr>
                 <w:rFonts w:ascii="Arial" w:hAnsi="Arial" w:eastAsia="Arial" w:cs="Arial"/>
                 <w:i w:val="false"/>
@@ -4922,8 +4922,8 @@
                 <w:left w:val="none" w:sz="0" w:space="0" w:color="000000"/>
                 <w:right w:val="none" w:sz="0" w:space="0" w:color="000000"/>
               </w:pBdr>
-              <w:spacing w:after="60" w:before="60" w:line="240"/>
-              <w:ind w:left="60" w:right="60" w:firstLine="0" w:firstLineChars="0"/>
+              <w:spacing w:after="40" w:before="40" w:line="240"/>
+              <w:ind w:left="20" w:right="20" w:firstLine="0" w:firstLineChars="0"/>
               <w:rPr>
                 <w:rFonts w:ascii="Arial" w:hAnsi="Arial" w:eastAsia="Arial" w:cs="Arial"/>
                 <w:i w:val="false"/>
@@ -4977,8 +4977,8 @@
                 <w:left w:val="none" w:sz="0" w:space="0" w:color="000000"/>
                 <w:right w:val="none" w:sz="0" w:space="0" w:color="000000"/>
               </w:pBdr>
-              <w:spacing w:after="60" w:before="60" w:line="240"/>
-              <w:ind w:left="60" w:right="60" w:firstLine="0" w:firstLineChars="0"/>
+              <w:spacing w:after="40" w:before="40" w:line="240"/>
+              <w:ind w:left="20" w:right="20" w:firstLine="0" w:firstLineChars="0"/>
               <w:rPr>
                 <w:rFonts w:ascii="Arial" w:hAnsi="Arial" w:eastAsia="Arial" w:cs="Arial"/>
                 <w:i w:val="false"/>
@@ -5032,8 +5032,8 @@
                 <w:left w:val="none" w:sz="0" w:space="0" w:color="000000"/>
                 <w:right w:val="none" w:sz="0" w:space="0" w:color="000000"/>
               </w:pBdr>
-              <w:spacing w:after="60" w:before="60" w:line="240"/>
-              <w:ind w:left="60" w:right="60" w:firstLine="0" w:firstLineChars="0"/>
+              <w:spacing w:after="40" w:before="40" w:line="240"/>
+              <w:ind w:left="20" w:right="20" w:firstLine="0" w:firstLineChars="0"/>
               <w:rPr>
                 <w:rFonts w:ascii="Arial" w:hAnsi="Arial" w:eastAsia="Arial" w:cs="Arial"/>
                 <w:i w:val="false"/>
@@ -5087,8 +5087,8 @@
                 <w:left w:val="none" w:sz="0" w:space="0" w:color="000000"/>
                 <w:right w:val="none" w:sz="0" w:space="0" w:color="000000"/>
               </w:pBdr>
-              <w:spacing w:after="60" w:before="60" w:line="240"/>
-              <w:ind w:left="60" w:right="60" w:firstLine="0" w:firstLineChars="0"/>
+              <w:spacing w:after="40" w:before="40" w:line="240"/>
+              <w:ind w:left="20" w:right="20" w:firstLine="0" w:firstLineChars="0"/>
               <w:rPr>
                 <w:rFonts w:ascii="Arial" w:hAnsi="Arial" w:eastAsia="Arial" w:cs="Arial"/>
                 <w:i w:val="false"/>
@@ -5148,8 +5148,8 @@
                 <w:left w:val="none" w:sz="0" w:space="0" w:color="000000"/>
                 <w:right w:val="none" w:sz="0" w:space="0" w:color="000000"/>
               </w:pBdr>
-              <w:spacing w:after="60" w:before="60" w:line="240"/>
-              <w:ind w:left="60" w:right="60" w:firstLine="0" w:firstLineChars="0"/>
+              <w:spacing w:after="40" w:before="40" w:line="240"/>
+              <w:ind w:left="20" w:right="20" w:firstLine="0" w:firstLineChars="0"/>
               <w:rPr>
                 <w:rFonts w:ascii="Arial" w:hAnsi="Arial" w:eastAsia="Arial" w:cs="Arial"/>
                 <w:i w:val="false"/>
@@ -5203,8 +5203,8 @@
                 <w:left w:val="none" w:sz="0" w:space="0" w:color="000000"/>
                 <w:right w:val="none" w:sz="0" w:space="0" w:color="000000"/>
               </w:pBdr>
-              <w:spacing w:after="60" w:before="60" w:line="240"/>
-              <w:ind w:left="60" w:right="60" w:firstLine="0" w:firstLineChars="0"/>
+              <w:spacing w:after="40" w:before="40" w:line="240"/>
+              <w:ind w:left="20" w:right="20" w:firstLine="0" w:firstLineChars="0"/>
               <w:rPr>
                 <w:rFonts w:ascii="Arial" w:hAnsi="Arial" w:eastAsia="Arial" w:cs="Arial"/>
                 <w:i w:val="false"/>
@@ -5258,8 +5258,8 @@
                 <w:left w:val="none" w:sz="0" w:space="0" w:color="000000"/>
                 <w:right w:val="none" w:sz="0" w:space="0" w:color="000000"/>
               </w:pBdr>
-              <w:spacing w:after="60" w:before="60" w:line="240"/>
-              <w:ind w:left="60" w:right="60" w:firstLine="0" w:firstLineChars="0"/>
+              <w:spacing w:after="40" w:before="40" w:line="240"/>
+              <w:ind w:left="20" w:right="20" w:firstLine="0" w:firstLineChars="0"/>
               <w:rPr>
                 <w:rFonts w:ascii="Arial" w:hAnsi="Arial" w:eastAsia="Arial" w:cs="Arial"/>
                 <w:i w:val="false"/>
@@ -5313,8 +5313,8 @@
                 <w:left w:val="none" w:sz="0" w:space="0" w:color="000000"/>
                 <w:right w:val="none" w:sz="0" w:space="0" w:color="000000"/>
               </w:pBdr>
-              <w:spacing w:after="60" w:before="60" w:line="240"/>
-              <w:ind w:left="60" w:right="60" w:firstLine="0" w:firstLineChars="0"/>
+              <w:spacing w:after="40" w:before="40" w:line="240"/>
+              <w:ind w:left="20" w:right="20" w:firstLine="0" w:firstLineChars="0"/>
               <w:rPr>
                 <w:rFonts w:ascii="Arial" w:hAnsi="Arial" w:eastAsia="Arial" w:cs="Arial"/>
                 <w:i w:val="false"/>
@@ -5368,8 +5368,8 @@
                 <w:left w:val="none" w:sz="0" w:space="0" w:color="000000"/>
                 <w:right w:val="none" w:sz="0" w:space="0" w:color="000000"/>
               </w:pBdr>
-              <w:spacing w:after="60" w:before="60" w:line="240"/>
-              <w:ind w:left="60" w:right="60" w:firstLine="0" w:firstLineChars="0"/>
+              <w:spacing w:after="40" w:before="40" w:line="240"/>
+              <w:ind w:left="20" w:right="20" w:firstLine="0" w:firstLineChars="0"/>
               <w:rPr>
                 <w:rFonts w:ascii="Arial" w:hAnsi="Arial" w:eastAsia="Arial" w:cs="Arial"/>
                 <w:i w:val="false"/>
@@ -5423,8 +5423,8 @@
                 <w:left w:val="none" w:sz="0" w:space="0" w:color="000000"/>
                 <w:right w:val="none" w:sz="0" w:space="0" w:color="000000"/>
               </w:pBdr>
-              <w:spacing w:after="60" w:before="60" w:line="240"/>
-              <w:ind w:left="60" w:right="60" w:firstLine="0" w:firstLineChars="0"/>
+              <w:spacing w:after="40" w:before="40" w:line="240"/>
+              <w:ind w:left="20" w:right="20" w:firstLine="0" w:firstLineChars="0"/>
               <w:rPr>
                 <w:rFonts w:ascii="Arial" w:hAnsi="Arial" w:eastAsia="Arial" w:cs="Arial"/>
                 <w:i w:val="false"/>
@@ -5478,8 +5478,8 @@
                 <w:left w:val="none" w:sz="0" w:space="0" w:color="000000"/>
                 <w:right w:val="none" w:sz="0" w:space="0" w:color="000000"/>
               </w:pBdr>
-              <w:spacing w:after="60" w:before="60" w:line="240"/>
-              <w:ind w:left="60" w:right="60" w:firstLine="0" w:firstLineChars="0"/>
+              <w:spacing w:after="40" w:before="40" w:line="240"/>
+              <w:ind w:left="20" w:right="20" w:firstLine="0" w:firstLineChars="0"/>
               <w:rPr>
                 <w:rFonts w:ascii="Arial" w:hAnsi="Arial" w:eastAsia="Arial" w:cs="Arial"/>
                 <w:i w:val="false"/>
@@ -5539,8 +5539,8 @@
                 <w:left w:val="none" w:sz="0" w:space="0" w:color="000000"/>
                 <w:right w:val="none" w:sz="0" w:space="0" w:color="000000"/>
               </w:pBdr>
-              <w:spacing w:after="60" w:before="60" w:line="240"/>
-              <w:ind w:left="60" w:right="60" w:firstLine="0" w:firstLineChars="0"/>
+              <w:spacing w:after="40" w:before="40" w:line="240"/>
+              <w:ind w:left="20" w:right="20" w:firstLine="0" w:firstLineChars="0"/>
               <w:rPr>
                 <w:rFonts w:ascii="Arial" w:hAnsi="Arial" w:eastAsia="Arial" w:cs="Arial"/>
                 <w:i w:val="false"/>
@@ -5594,8 +5594,8 @@
                 <w:left w:val="none" w:sz="0" w:space="0" w:color="000000"/>
                 <w:right w:val="none" w:sz="0" w:space="0" w:color="000000"/>
               </w:pBdr>
-              <w:spacing w:after="60" w:before="60" w:line="240"/>
-              <w:ind w:left="60" w:right="60" w:firstLine="0" w:firstLineChars="0"/>
+              <w:spacing w:after="40" w:before="40" w:line="240"/>
+              <w:ind w:left="20" w:right="20" w:firstLine="0" w:firstLineChars="0"/>
               <w:rPr>
                 <w:rFonts w:ascii="Arial" w:hAnsi="Arial" w:eastAsia="Arial" w:cs="Arial"/>
                 <w:i w:val="false"/>
@@ -5649,8 +5649,8 @@
                 <w:left w:val="none" w:sz="0" w:space="0" w:color="000000"/>
                 <w:right w:val="none" w:sz="0" w:space="0" w:color="000000"/>
               </w:pBdr>
-              <w:spacing w:after="60" w:before="60" w:line="240"/>
-              <w:ind w:left="60" w:right="60" w:firstLine="0" w:firstLineChars="0"/>
+              <w:spacing w:after="40" w:before="40" w:line="240"/>
+              <w:ind w:left="20" w:right="20" w:firstLine="0" w:firstLineChars="0"/>
               <w:rPr>
                 <w:rFonts w:ascii="Arial" w:hAnsi="Arial" w:eastAsia="Arial" w:cs="Arial"/>
                 <w:i w:val="false"/>
@@ -5704,8 +5704,8 @@
                 <w:left w:val="none" w:sz="0" w:space="0" w:color="000000"/>
                 <w:right w:val="none" w:sz="0" w:space="0" w:color="000000"/>
               </w:pBdr>
-              <w:spacing w:after="60" w:before="60" w:line="240"/>
-              <w:ind w:left="60" w:right="60" w:firstLine="0" w:firstLineChars="0"/>
+              <w:spacing w:after="40" w:before="40" w:line="240"/>
+              <w:ind w:left="20" w:right="20" w:firstLine="0" w:firstLineChars="0"/>
               <w:rPr>
                 <w:rFonts w:ascii="Arial" w:hAnsi="Arial" w:eastAsia="Arial" w:cs="Arial"/>
                 <w:i w:val="false"/>
@@ -5759,8 +5759,8 @@
                 <w:left w:val="none" w:sz="0" w:space="0" w:color="000000"/>
                 <w:right w:val="none" w:sz="0" w:space="0" w:color="000000"/>
               </w:pBdr>
-              <w:spacing w:after="60" w:before="60" w:line="240"/>
-              <w:ind w:left="60" w:right="60" w:firstLine="0" w:firstLineChars="0"/>
+              <w:spacing w:after="40" w:before="40" w:line="240"/>
+              <w:ind w:left="20" w:right="20" w:firstLine="0" w:firstLineChars="0"/>
               <w:rPr>
                 <w:rFonts w:ascii="Arial" w:hAnsi="Arial" w:eastAsia="Arial" w:cs="Arial"/>
                 <w:i w:val="false"/>
@@ -5814,8 +5814,8 @@
                 <w:left w:val="none" w:sz="0" w:space="0" w:color="000000"/>
                 <w:right w:val="none" w:sz="0" w:space="0" w:color="000000"/>
               </w:pBdr>
-              <w:spacing w:after="60" w:before="60" w:line="240"/>
-              <w:ind w:left="60" w:right="60" w:firstLine="0" w:firstLineChars="0"/>
+              <w:spacing w:after="40" w:before="40" w:line="240"/>
+              <w:ind w:left="20" w:right="20" w:firstLine="0" w:firstLineChars="0"/>
               <w:rPr>
                 <w:rFonts w:ascii="Arial" w:hAnsi="Arial" w:eastAsia="Arial" w:cs="Arial"/>
                 <w:i w:val="false"/>
@@ -5869,8 +5869,8 @@
                 <w:left w:val="none" w:sz="0" w:space="0" w:color="000000"/>
                 <w:right w:val="none" w:sz="0" w:space="0" w:color="000000"/>
               </w:pBdr>
-              <w:spacing w:after="60" w:before="60" w:line="240"/>
-              <w:ind w:left="60" w:right="60" w:firstLine="0" w:firstLineChars="0"/>
+              <w:spacing w:after="40" w:before="40" w:line="240"/>
+              <w:ind w:left="20" w:right="20" w:firstLine="0" w:firstLineChars="0"/>
               <w:rPr>
                 <w:rFonts w:ascii="Arial" w:hAnsi="Arial" w:eastAsia="Arial" w:cs="Arial"/>
                 <w:i w:val="false"/>
@@ -5930,8 +5930,8 @@
                 <w:left w:val="none" w:sz="0" w:space="0" w:color="000000"/>
                 <w:right w:val="none" w:sz="0" w:space="0" w:color="000000"/>
               </w:pBdr>
-              <w:spacing w:after="60" w:before="60" w:line="240"/>
-              <w:ind w:left="60" w:right="60" w:firstLine="0" w:firstLineChars="0"/>
+              <w:spacing w:after="40" w:before="40" w:line="240"/>
+              <w:ind w:left="20" w:right="20" w:firstLine="0" w:firstLineChars="0"/>
               <w:rPr>
                 <w:rFonts w:ascii="Arial" w:hAnsi="Arial" w:eastAsia="Arial" w:cs="Arial"/>
                 <w:i w:val="false"/>
@@ -5985,8 +5985,8 @@
                 <w:left w:val="none" w:sz="0" w:space="0" w:color="000000"/>
                 <w:right w:val="none" w:sz="0" w:space="0" w:color="000000"/>
               </w:pBdr>
-              <w:spacing w:after="60" w:before="60" w:line="240"/>
-              <w:ind w:left="60" w:right="60" w:firstLine="0" w:firstLineChars="0"/>
+              <w:spacing w:after="40" w:before="40" w:line="240"/>
+              <w:ind w:left="20" w:right="20" w:firstLine="0" w:firstLineChars="0"/>
               <w:rPr>
                 <w:rFonts w:ascii="Arial" w:hAnsi="Arial" w:eastAsia="Arial" w:cs="Arial"/>
                 <w:i w:val="false"/>
@@ -6040,8 +6040,8 @@
                 <w:left w:val="none" w:sz="0" w:space="0" w:color="000000"/>
                 <w:right w:val="none" w:sz="0" w:space="0" w:color="000000"/>
               </w:pBdr>
-              <w:spacing w:after="60" w:before="60" w:line="240"/>
-              <w:ind w:left="60" w:right="60" w:firstLine="0" w:firstLineChars="0"/>
+              <w:spacing w:after="40" w:before="40" w:line="240"/>
+              <w:ind w:left="20" w:right="20" w:firstLine="0" w:firstLineChars="0"/>
               <w:rPr>
                 <w:rFonts w:ascii="Arial" w:hAnsi="Arial" w:eastAsia="Arial" w:cs="Arial"/>
                 <w:i w:val="false"/>
@@ -6095,8 +6095,8 @@
                 <w:left w:val="none" w:sz="0" w:space="0" w:color="000000"/>
                 <w:right w:val="none" w:sz="0" w:space="0" w:color="000000"/>
               </w:pBdr>
-              <w:spacing w:after="60" w:before="60" w:line="240"/>
-              <w:ind w:left="60" w:right="60" w:firstLine="0" w:firstLineChars="0"/>
+              <w:spacing w:after="40" w:before="40" w:line="240"/>
+              <w:ind w:left="20" w:right="20" w:firstLine="0" w:firstLineChars="0"/>
               <w:rPr>
                 <w:rFonts w:ascii="Arial" w:hAnsi="Arial" w:eastAsia="Arial" w:cs="Arial"/>
                 <w:i w:val="false"/>
@@ -6150,8 +6150,8 @@
                 <w:left w:val="none" w:sz="0" w:space="0" w:color="000000"/>
                 <w:right w:val="none" w:sz="0" w:space="0" w:color="000000"/>
               </w:pBdr>
-              <w:spacing w:after="60" w:before="60" w:line="240"/>
-              <w:ind w:left="60" w:right="60" w:firstLine="0" w:firstLineChars="0"/>
+              <w:spacing w:after="40" w:before="40" w:line="240"/>
+              <w:ind w:left="20" w:right="20" w:firstLine="0" w:firstLineChars="0"/>
               <w:rPr>
                 <w:rFonts w:ascii="Arial" w:hAnsi="Arial" w:eastAsia="Arial" w:cs="Arial"/>
                 <w:i w:val="false"/>
@@ -6205,8 +6205,8 @@
                 <w:left w:val="none" w:sz="0" w:space="0" w:color="000000"/>
                 <w:right w:val="none" w:sz="0" w:space="0" w:color="000000"/>
               </w:pBdr>
-              <w:spacing w:after="60" w:before="60" w:line="240"/>
-              <w:ind w:left="60" w:right="60" w:firstLine="0" w:firstLineChars="0"/>
+              <w:spacing w:after="40" w:before="40" w:line="240"/>
+              <w:ind w:left="20" w:right="20" w:firstLine="0" w:firstLineChars="0"/>
               <w:rPr>
                 <w:rFonts w:ascii="Arial" w:hAnsi="Arial" w:eastAsia="Arial" w:cs="Arial"/>
                 <w:i w:val="false"/>
@@ -6260,8 +6260,8 @@
                 <w:left w:val="none" w:sz="0" w:space="0" w:color="000000"/>
                 <w:right w:val="none" w:sz="0" w:space="0" w:color="000000"/>
               </w:pBdr>
-              <w:spacing w:after="60" w:before="60" w:line="240"/>
-              <w:ind w:left="60" w:right="60" w:firstLine="0" w:firstLineChars="0"/>
+              <w:spacing w:after="40" w:before="40" w:line="240"/>
+              <w:ind w:left="20" w:right="20" w:firstLine="0" w:firstLineChars="0"/>
               <w:rPr>
                 <w:rFonts w:ascii="Arial" w:hAnsi="Arial" w:eastAsia="Arial" w:cs="Arial"/>
                 <w:i w:val="false"/>
@@ -6321,8 +6321,8 @@
                 <w:left w:val="none" w:sz="0" w:space="0" w:color="000000"/>
                 <w:right w:val="none" w:sz="0" w:space="0" w:color="000000"/>
               </w:pBdr>
-              <w:spacing w:after="60" w:before="60" w:line="240"/>
-              <w:ind w:left="60" w:right="60" w:firstLine="0" w:firstLineChars="0"/>
+              <w:spacing w:after="40" w:before="40" w:line="240"/>
+              <w:ind w:left="20" w:right="20" w:firstLine="0" w:firstLineChars="0"/>
               <w:rPr>
                 <w:rFonts w:ascii="Arial" w:hAnsi="Arial" w:eastAsia="Arial" w:cs="Arial"/>
                 <w:i w:val="false"/>
@@ -6376,8 +6376,8 @@
                 <w:left w:val="none" w:sz="0" w:space="0" w:color="000000"/>
                 <w:right w:val="none" w:sz="0" w:space="0" w:color="000000"/>
               </w:pBdr>
-              <w:spacing w:after="60" w:before="60" w:line="240"/>
-              <w:ind w:left="60" w:right="60" w:firstLine="0" w:firstLineChars="0"/>
+              <w:spacing w:after="40" w:before="40" w:line="240"/>
+              <w:ind w:left="20" w:right="20" w:firstLine="0" w:firstLineChars="0"/>
               <w:rPr>
                 <w:rFonts w:ascii="Arial" w:hAnsi="Arial" w:eastAsia="Arial" w:cs="Arial"/>
                 <w:i w:val="false"/>
@@ -6431,8 +6431,8 @@
                 <w:left w:val="none" w:sz="0" w:space="0" w:color="000000"/>
                 <w:right w:val="none" w:sz="0" w:space="0" w:color="000000"/>
               </w:pBdr>
-              <w:spacing w:after="60" w:before="60" w:line="240"/>
-              <w:ind w:left="60" w:right="60" w:firstLine="0" w:firstLineChars="0"/>
+              <w:spacing w:after="40" w:before="40" w:line="240"/>
+              <w:ind w:left="20" w:right="20" w:firstLine="0" w:firstLineChars="0"/>
               <w:rPr>
                 <w:rFonts w:ascii="Arial" w:hAnsi="Arial" w:eastAsia="Arial" w:cs="Arial"/>
                 <w:i w:val="false"/>
@@ -6486,8 +6486,8 @@
                 <w:left w:val="none" w:sz="0" w:space="0" w:color="000000"/>
                 <w:right w:val="none" w:sz="0" w:space="0" w:color="000000"/>
               </w:pBdr>
-              <w:spacing w:after="60" w:before="60" w:line="240"/>
-              <w:ind w:left="60" w:right="60" w:firstLine="0" w:firstLineChars="0"/>
+              <w:spacing w:after="40" w:before="40" w:line="240"/>
+              <w:ind w:left="20" w:right="20" w:firstLine="0" w:firstLineChars="0"/>
               <w:rPr>
                 <w:rFonts w:ascii="Arial" w:hAnsi="Arial" w:eastAsia="Arial" w:cs="Arial"/>
                 <w:i w:val="false"/>
@@ -6541,8 +6541,8 @@
                 <w:left w:val="none" w:sz="0" w:space="0" w:color="000000"/>
                 <w:right w:val="none" w:sz="0" w:space="0" w:color="000000"/>
               </w:pBdr>
-              <w:spacing w:after="60" w:before="60" w:line="240"/>
-              <w:ind w:left="60" w:right="60" w:firstLine="0" w:firstLineChars="0"/>
+              <w:spacing w:after="40" w:before="40" w:line="240"/>
+              <w:ind w:left="20" w:right="20" w:firstLine="0" w:firstLineChars="0"/>
               <w:rPr>
                 <w:rFonts w:ascii="Arial" w:hAnsi="Arial" w:eastAsia="Arial" w:cs="Arial"/>
                 <w:i w:val="false"/>
@@ -6596,8 +6596,8 @@
                 <w:left w:val="none" w:sz="0" w:space="0" w:color="000000"/>
                 <w:right w:val="none" w:sz="0" w:space="0" w:color="000000"/>
               </w:pBdr>
-              <w:spacing w:after="60" w:before="60" w:line="240"/>
-              <w:ind w:left="60" w:right="60" w:firstLine="0" w:firstLineChars="0"/>
+              <w:spacing w:after="40" w:before="40" w:line="240"/>
+              <w:ind w:left="20" w:right="20" w:firstLine="0" w:firstLineChars="0"/>
               <w:rPr>
                 <w:rFonts w:ascii="Arial" w:hAnsi="Arial" w:eastAsia="Arial" w:cs="Arial"/>
                 <w:i w:val="false"/>
@@ -6651,8 +6651,8 @@
                 <w:left w:val="none" w:sz="0" w:space="0" w:color="000000"/>
                 <w:right w:val="none" w:sz="0" w:space="0" w:color="000000"/>
               </w:pBdr>
-              <w:spacing w:after="60" w:before="60" w:line="240"/>
-              <w:ind w:left="60" w:right="60" w:firstLine="0" w:firstLineChars="0"/>
+              <w:spacing w:after="40" w:before="40" w:line="240"/>
+              <w:ind w:left="20" w:right="20" w:firstLine="0" w:firstLineChars="0"/>
               <w:rPr>
                 <w:rFonts w:ascii="Arial" w:hAnsi="Arial" w:eastAsia="Arial" w:cs="Arial"/>
                 <w:i w:val="false"/>
@@ -6713,8 +6713,8 @@
                 <w:left w:val="none" w:sz="0" w:space="0" w:color="000000"/>
                 <w:right w:val="none" w:sz="0" w:space="0" w:color="000000"/>
               </w:pBdr>
-              <w:spacing w:after="60" w:before="60" w:line="240"/>
-              <w:ind w:left="60" w:right="60" w:firstLine="0" w:firstLineChars="0"/>
+              <w:spacing w:after="40" w:before="40" w:line="240"/>
+              <w:ind w:left="20" w:right="20" w:firstLine="0" w:firstLineChars="0"/>
               <w:rPr>
                 <w:rFonts w:ascii="Arial" w:hAnsi="Arial" w:eastAsia="Arial" w:cs="Arial"/>
                 <w:i w:val="false"/>
@@ -6769,8 +6769,8 @@
                 <w:left w:val="none" w:sz="0" w:space="0" w:color="000000"/>
                 <w:right w:val="none" w:sz="0" w:space="0" w:color="000000"/>
               </w:pBdr>
-              <w:spacing w:after="60" w:before="60" w:line="240"/>
-              <w:ind w:left="60" w:right="60" w:firstLine="0" w:firstLineChars="0"/>
+              <w:spacing w:after="40" w:before="40" w:line="240"/>
+              <w:ind w:left="20" w:right="20" w:firstLine="0" w:firstLineChars="0"/>
               <w:rPr>
                 <w:rFonts w:ascii="Arial" w:hAnsi="Arial" w:eastAsia="Arial" w:cs="Arial"/>
                 <w:i w:val="false"/>
@@ -6825,8 +6825,8 @@
                 <w:left w:val="none" w:sz="0" w:space="0" w:color="000000"/>
                 <w:right w:val="none" w:sz="0" w:space="0" w:color="000000"/>
               </w:pBdr>
-              <w:spacing w:after="60" w:before="60" w:line="240"/>
-              <w:ind w:left="60" w:right="60" w:firstLine="0" w:firstLineChars="0"/>
+              <w:spacing w:after="40" w:before="40" w:line="240"/>
+              <w:ind w:left="20" w:right="20" w:firstLine="0" w:firstLineChars="0"/>
               <w:rPr>
                 <w:rFonts w:ascii="Arial" w:hAnsi="Arial" w:eastAsia="Arial" w:cs="Arial"/>
                 <w:i w:val="false"/>
@@ -6881,8 +6881,8 @@
                 <w:left w:val="none" w:sz="0" w:space="0" w:color="000000"/>
                 <w:right w:val="none" w:sz="0" w:space="0" w:color="000000"/>
               </w:pBdr>
-              <w:spacing w:after="60" w:before="60" w:line="240"/>
-              <w:ind w:left="60" w:right="60" w:firstLine="0" w:firstLineChars="0"/>
+              <w:spacing w:after="40" w:before="40" w:line="240"/>
+              <w:ind w:left="20" w:right="20" w:firstLine="0" w:firstLineChars="0"/>
               <w:rPr>
                 <w:rFonts w:ascii="Arial" w:hAnsi="Arial" w:eastAsia="Arial" w:cs="Arial"/>
                 <w:i w:val="false"/>
@@ -6937,8 +6937,8 @@
                 <w:left w:val="none" w:sz="0" w:space="0" w:color="000000"/>
                 <w:right w:val="none" w:sz="0" w:space="0" w:color="000000"/>
               </w:pBdr>
-              <w:spacing w:after="60" w:before="60" w:line="240"/>
-              <w:ind w:left="60" w:right="60" w:firstLine="0" w:firstLineChars="0"/>
+              <w:spacing w:after="40" w:before="40" w:line="240"/>
+              <w:ind w:left="20" w:right="20" w:firstLine="0" w:firstLineChars="0"/>
               <w:rPr>
                 <w:rFonts w:ascii="Arial" w:hAnsi="Arial" w:eastAsia="Arial" w:cs="Arial"/>
                 <w:i w:val="false"/>
@@ -6993,8 +6993,8 @@
                 <w:left w:val="none" w:sz="0" w:space="0" w:color="000000"/>
                 <w:right w:val="none" w:sz="0" w:space="0" w:color="000000"/>
               </w:pBdr>
-              <w:spacing w:after="60" w:before="60" w:line="240"/>
-              <w:ind w:left="60" w:right="60" w:firstLine="0" w:firstLineChars="0"/>
+              <w:spacing w:after="40" w:before="40" w:line="240"/>
+              <w:ind w:left="20" w:right="20" w:firstLine="0" w:firstLineChars="0"/>
               <w:rPr>
                 <w:rFonts w:ascii="Arial" w:hAnsi="Arial" w:eastAsia="Arial" w:cs="Arial"/>
                 <w:i w:val="false"/>
@@ -7049,8 +7049,8 @@
                 <w:left w:val="none" w:sz="0" w:space="0" w:color="000000"/>
                 <w:right w:val="none" w:sz="0" w:space="0" w:color="000000"/>
               </w:pBdr>
-              <w:spacing w:after="60" w:before="60" w:line="240"/>
-              <w:ind w:left="60" w:right="60" w:firstLine="0" w:firstLineChars="0"/>
+              <w:spacing w:after="40" w:before="40" w:line="240"/>
+              <w:ind w:left="20" w:right="20" w:firstLine="0" w:firstLineChars="0"/>
               <w:rPr>
                 <w:rFonts w:ascii="Arial" w:hAnsi="Arial" w:eastAsia="Arial" w:cs="Arial"/>
                 <w:i w:val="false"/>
@@ -7111,8 +7111,8 @@
                 <w:left w:val="none" w:sz="0" w:space="0" w:color="000000"/>
                 <w:right w:val="none" w:sz="0" w:space="0" w:color="000000"/>
               </w:pBdr>
-              <w:spacing w:after="100" w:before="100" w:line="240"/>
-              <w:ind w:left="100" w:right="100" w:firstLine="0" w:firstLineChars="0"/>
+              <w:spacing w:after="40" w:before="40" w:line="240"/>
+              <w:ind w:left="20" w:right="20" w:firstLine="0" w:firstLineChars="0"/>
               <w:rPr>
                 <w:rFonts w:ascii="Arial" w:hAnsi="Arial" w:eastAsia="Arial" w:cs="Arial"/>
                 <w:i w:val="false"/>

</xml_diff>

<commit_message>
Render polished manuscript outputs and record round 12 validation
</commit_message>
<xml_diff>
--- a/analysis/output/manuscript/Table1.docx
+++ b/analysis/output/manuscript/Table1.docx
@@ -7,7 +7,7 @@
         <w:pStyle w:val="Titre1"/>
       </w:pPr>
       <w:r>
-        <w:t xml:space="preserve">Table 1. Benchmark set</w:t>
+        <w:t xml:space="preserve">Table 1. Sixteen meta-analyses across 15 specialties supplied the benchmark</w:t>
       </w:r>
     </w:p>
     <w:tbl xmlns:a="http://schemas.openxmlformats.org/drawingml/2006/main" xmlns:pic="http://schemas.openxmlformats.org/drawingml/2006/picture">
@@ -7135,7 +7135,7 @@
                 <w:szCs w:val="18"/>
                 <w:color w:val="000000"/>
               </w:rPr>
-              <w:t xml:space="preserve">SC, Some concerns; RoB 2, risk of bias tool for randomised trials. Counts are published labels pooled across D1–D5. Overall given indicates whether published Overall labels are available; total is labelled trials/all trials. The analysis excludes three unsupported-design trials from all arms. Metadata are curated from the source meta-analyses. ACL, anterior cruciate ligament; CDK4/6, cyclin-dependent kinases 4 and 6; eGFR, estimated glomerular filtration rate; GLP-1, glucagon-like peptide-1; HER2, human epidermal growth factor receptor 2; HR, hormone receptor; IgA, immunoglobulin A; SGLT2, sodium-glucose cotransporter 2.</w:t>
+              <w:t xml:space="preserve">SC, Some concerns; RoB 2, risk of bias tool for randomised trials. Counts are published labels pooled across D1–D5. Per-domain distributions: eTable 8. Overall given indicates whether published Overall labels are available; total is labelled trials/all trials. The analysis excludes three unsupported-design trials from all arms. Metadata are curated from the source meta-analyses. ACL, anterior cruciate ligament; CDK4/6, cyclin-dependent kinases 4 and 6; eGFR, estimated glomerular filtration rate; GLP-1, glucagon-like peptide-1; HER2, human epidermal growth factor receptor 2; HR, hormone receptor; IgA, immunoglobulin A; SGLT2, sodium-glucose cotransporter 2.</w:t>
             </w:r>
           </w:p>
         </w:tc>

</xml_diff>

<commit_message>
Polish Round 13 manuscript labels, figures and table layouts
</commit_message>
<xml_diff>
--- a/analysis/output/manuscript/Table1.docx
+++ b/analysis/output/manuscript/Table1.docx
@@ -17,12 +17,11 @@
         <w:tblLook w:firstRow="1" w:lastRow="0" w:firstColumn="0" w:lastColumn="0" w:noHBand="0" w:noVBand="1"/>
       </w:tblPr>
       <w:tblGrid>
-        <w:gridCol w:w="2318"/>
-        <w:gridCol w:w="2304"/>
-        <w:gridCol w:w="504"/>
-        <w:gridCol w:w="2405"/>
+        <w:gridCol w:w="2102"/>
+        <w:gridCol w:w="1656"/>
+        <w:gridCol w:w="3600"/>
         <w:gridCol w:w="576"/>
-        <w:gridCol w:w="1109"/>
+        <w:gridCol w:w="1325"/>
         <w:gridCol w:w="778"/>
       </w:tblGrid>
       <w:tr>
@@ -139,7 +138,7 @@
                 <w:szCs w:val="18"/>
                 <w:color w:val="000000"/>
               </w:rPr>
-              <w:t xml:space="preserve">Journal</w:t>
+              <w:t xml:space="preserve">Journal and year</w:t>
             </w:r>
           </w:p>
         </w:tc>
@@ -195,7 +194,7 @@
                 <w:szCs w:val="18"/>
                 <w:color w:val="000000"/>
               </w:rPr>
-              <w:t xml:space="preserve">Year</w:t>
+              <w:t xml:space="preserve">Topic</w:t>
             </w:r>
           </w:p>
         </w:tc>
@@ -251,7 +250,7 @@
                 <w:szCs w:val="18"/>
                 <w:color w:val="000000"/>
               </w:rPr>
-              <w:t xml:space="preserve">Topic</w:t>
+              <w:t xml:space="preserve">Trials</w:t>
             </w:r>
           </w:p>
         </w:tc>
@@ -307,63 +306,7 @@
                 <w:szCs w:val="18"/>
                 <w:color w:val="000000"/>
               </w:rPr>
-              <w:t xml:space="preserve">Trials</w:t>
-            </w:r>
-          </w:p>
-        </w:tc>
-        <w:tc>
-          <w:tcPr>
-            <w:tcBorders>
-              <w:bottom w:val="single" w:sz="5" w:space="0" w:color="000000"/>
-              <w:top w:val="single" w:sz="8" w:space="0" w:color="000000"/>
-              <w:left w:val="none" w:sz="0" w:space="0" w:color="000000"/>
-              <w:right w:val="none" w:sz="0" w:space="0" w:color="000000"/>
-            </w:tcBorders>
-            <w:shd w:val="clear" w:color="auto" w:fill="FFFFFF"/>
-            <w:tcMar>
-              <w:top w:w="0" w:type="dxa"/>
-              <w:bottom w:w="0" w:type="dxa"/>
-              <w:left w:w="0" w:type="dxa"/>
-              <w:right w:w="0" w:type="dxa"/>
-            </w:tcMar>
-            <w:vAlign w:val="top"/>
-          </w:tcPr>
-          <w:p>
-            <w:pPr>
-              <w:pStyle w:val="Normal"/>
-              <w:jc w:val="left"/>
-              <w:keepNext/>
-              <w:pBdr>
-                <w:bottom w:val="none" w:sz="0" w:space="0" w:color="000000"/>
-                <w:top w:val="none" w:sz="0" w:space="0" w:color="000000"/>
-                <w:left w:val="none" w:sz="0" w:space="0" w:color="000000"/>
-                <w:right w:val="none" w:sz="0" w:space="0" w:color="000000"/>
-              </w:pBdr>
-              <w:spacing w:after="40" w:before="40" w:line="240"/>
-              <w:ind w:left="20" w:right="20" w:firstLine="0" w:firstLineChars="0"/>
-              <w:rPr>
-                <w:rFonts w:ascii="Arial" w:hAnsi="Arial" w:eastAsia="Arial" w:cs="Arial"/>
-                <w:i w:val="false"/>
-                <w:b w:val="true"/>
-                <w:u w:val="none"/>
-                <w:strike w:val="false"/>
-                <w:sz w:val="18"/>
-                <w:szCs w:val="18"/>
-                <w:color w:val="000000"/>
-              </w:rPr>
-            </w:pPr>
-            <w:r>
-              <w:rPr>
-                <w:rFonts w:ascii="Arial" w:hAnsi="Arial" w:eastAsia="Arial" w:cs="Arial"/>
-                <w:i w:val="false"/>
-                <w:b w:val="true"/>
-                <w:u w:val="none"/>
-                <w:strike w:val="false"/>
-                <w:sz w:val="18"/>
-                <w:szCs w:val="18"/>
-                <w:color w:val="000000"/>
-              </w:rPr>
-              <w:t xml:space="preserve">Published D1–D5 labels, Low / SC / High</w:t>
+              <w:t xml:space="preserve">Published D1–D5 labels (Low/SC/High)</w:t>
             </w:r>
           </w:p>
         </w:tc>
@@ -535,62 +478,7 @@
                 <w:szCs w:val="18"/>
                 <w:color w:val="000000"/>
               </w:rPr>
-              <w:t xml:space="preserve">JAMA</w:t>
-            </w:r>
-          </w:p>
-        </w:tc>
-        <w:tc>
-          <w:tcPr>
-            <w:tcBorders>
-              <w:bottom w:val="none" w:sz="0" w:space="0" w:color="000000"/>
-              <w:top w:val="single" w:sz="5" w:space="0" w:color="000000"/>
-              <w:left w:val="none" w:sz="0" w:space="0" w:color="000000"/>
-              <w:right w:val="none" w:sz="0" w:space="0" w:color="000000"/>
-            </w:tcBorders>
-            <w:shd w:val="clear" w:color="auto" w:fill="FFFFFF"/>
-            <w:tcMar>
-              <w:top w:w="0" w:type="dxa"/>
-              <w:bottom w:w="0" w:type="dxa"/>
-              <w:left w:w="0" w:type="dxa"/>
-              <w:right w:w="0" w:type="dxa"/>
-            </w:tcMar>
-            <w:vAlign w:val="top"/>
-          </w:tcPr>
-          <w:p>
-            <w:pPr>
-              <w:pStyle w:val="Normal"/>
-              <w:jc w:val="left"/>
-              <w:pBdr>
-                <w:bottom w:val="none" w:sz="0" w:space="0" w:color="000000"/>
-                <w:top w:val="none" w:sz="0" w:space="0" w:color="000000"/>
-                <w:left w:val="none" w:sz="0" w:space="0" w:color="000000"/>
-                <w:right w:val="none" w:sz="0" w:space="0" w:color="000000"/>
-              </w:pBdr>
-              <w:spacing w:after="40" w:before="40" w:line="240"/>
-              <w:ind w:left="20" w:right="20" w:firstLine="0" w:firstLineChars="0"/>
-              <w:rPr>
-                <w:rFonts w:ascii="Arial" w:hAnsi="Arial" w:eastAsia="Arial" w:cs="Arial"/>
-                <w:i w:val="false"/>
-                <w:b w:val="false"/>
-                <w:u w:val="none"/>
-                <w:strike w:val="false"/>
-                <w:sz w:val="18"/>
-                <w:szCs w:val="18"/>
-                <w:color w:val="000000"/>
-              </w:rPr>
-            </w:pPr>
-            <w:r>
-              <w:rPr>
-                <w:rFonts w:ascii="Arial" w:hAnsi="Arial" w:eastAsia="Arial" w:cs="Arial"/>
-                <w:i w:val="false"/>
-                <w:b w:val="false"/>
-                <w:u w:val="none"/>
-                <w:strike w:val="false"/>
-                <w:sz w:val="18"/>
-                <w:szCs w:val="18"/>
-                <w:color w:val="000000"/>
-              </w:rPr>
-              <w:t xml:space="preserve">2026</w:t>
+              <w:t xml:space="preserve">JAMA 2026</w:t>
             </w:r>
           </w:p>
         </w:tc>
@@ -926,62 +814,7 @@
                 <w:szCs w:val="18"/>
                 <w:color w:val="000000"/>
               </w:rPr>
-              <w:t xml:space="preserve">Lancet</w:t>
-            </w:r>
-          </w:p>
-        </w:tc>
-        <w:tc>
-          <w:tcPr>
-            <w:tcBorders>
-              <w:bottom w:val="none" w:sz="0" w:space="0" w:color="000000"/>
-              <w:top w:val="none" w:sz="0" w:space="0" w:color="000000"/>
-              <w:left w:val="none" w:sz="0" w:space="0" w:color="000000"/>
-              <w:right w:val="none" w:sz="0" w:space="0" w:color="000000"/>
-            </w:tcBorders>
-            <w:shd w:val="clear" w:color="auto" w:fill="FFFFFF"/>
-            <w:tcMar>
-              <w:top w:w="0" w:type="dxa"/>
-              <w:bottom w:w="0" w:type="dxa"/>
-              <w:left w:w="0" w:type="dxa"/>
-              <w:right w:w="0" w:type="dxa"/>
-            </w:tcMar>
-            <w:vAlign w:val="top"/>
-          </w:tcPr>
-          <w:p>
-            <w:pPr>
-              <w:pStyle w:val="Normal"/>
-              <w:jc w:val="left"/>
-              <w:pBdr>
-                <w:bottom w:val="none" w:sz="0" w:space="0" w:color="000000"/>
-                <w:top w:val="none" w:sz="0" w:space="0" w:color="000000"/>
-                <w:left w:val="none" w:sz="0" w:space="0" w:color="000000"/>
-                <w:right w:val="none" w:sz="0" w:space="0" w:color="000000"/>
-              </w:pBdr>
-              <w:spacing w:after="40" w:before="40" w:line="240"/>
-              <w:ind w:left="20" w:right="20" w:firstLine="0" w:firstLineChars="0"/>
-              <w:rPr>
-                <w:rFonts w:ascii="Arial" w:hAnsi="Arial" w:eastAsia="Arial" w:cs="Arial"/>
-                <w:i w:val="false"/>
-                <w:b w:val="false"/>
-                <w:u w:val="none"/>
-                <w:strike w:val="false"/>
-                <w:sz w:val="18"/>
-                <w:szCs w:val="18"/>
-                <w:color w:val="000000"/>
-              </w:rPr>
-            </w:pPr>
-            <w:r>
-              <w:rPr>
-                <w:rFonts w:ascii="Arial" w:hAnsi="Arial" w:eastAsia="Arial" w:cs="Arial"/>
-                <w:i w:val="false"/>
-                <w:b w:val="false"/>
-                <w:u w:val="none"/>
-                <w:strike w:val="false"/>
-                <w:sz w:val="18"/>
-                <w:szCs w:val="18"/>
-                <w:color w:val="000000"/>
-              </w:rPr>
-              <w:t xml:space="preserve">2025</w:t>
+              <w:t xml:space="preserve">Lancet 2025</w:t>
             </w:r>
           </w:p>
         </w:tc>
@@ -1317,62 +1150,7 @@
                 <w:szCs w:val="18"/>
                 <w:color w:val="000000"/>
               </w:rPr>
-              <w:t xml:space="preserve">J Am Coll Cardiol</w:t>
-            </w:r>
-          </w:p>
-        </w:tc>
-        <w:tc>
-          <w:tcPr>
-            <w:tcBorders>
-              <w:bottom w:val="none" w:sz="0" w:space="0" w:color="000000"/>
-              <w:top w:val="none" w:sz="0" w:space="0" w:color="000000"/>
-              <w:left w:val="none" w:sz="0" w:space="0" w:color="000000"/>
-              <w:right w:val="none" w:sz="0" w:space="0" w:color="000000"/>
-            </w:tcBorders>
-            <w:shd w:val="clear" w:color="auto" w:fill="FFFFFF"/>
-            <w:tcMar>
-              <w:top w:w="0" w:type="dxa"/>
-              <w:bottom w:w="0" w:type="dxa"/>
-              <w:left w:w="0" w:type="dxa"/>
-              <w:right w:w="0" w:type="dxa"/>
-            </w:tcMar>
-            <w:vAlign w:val="top"/>
-          </w:tcPr>
-          <w:p>
-            <w:pPr>
-              <w:pStyle w:val="Normal"/>
-              <w:jc w:val="left"/>
-              <w:pBdr>
-                <w:bottom w:val="none" w:sz="0" w:space="0" w:color="000000"/>
-                <w:top w:val="none" w:sz="0" w:space="0" w:color="000000"/>
-                <w:left w:val="none" w:sz="0" w:space="0" w:color="000000"/>
-                <w:right w:val="none" w:sz="0" w:space="0" w:color="000000"/>
-              </w:pBdr>
-              <w:spacing w:after="40" w:before="40" w:line="240"/>
-              <w:ind w:left="20" w:right="20" w:firstLine="0" w:firstLineChars="0"/>
-              <w:rPr>
-                <w:rFonts w:ascii="Arial" w:hAnsi="Arial" w:eastAsia="Arial" w:cs="Arial"/>
-                <w:i w:val="false"/>
-                <w:b w:val="false"/>
-                <w:u w:val="none"/>
-                <w:strike w:val="false"/>
-                <w:sz w:val="18"/>
-                <w:szCs w:val="18"/>
-                <w:color w:val="000000"/>
-              </w:rPr>
-            </w:pPr>
-            <w:r>
-              <w:rPr>
-                <w:rFonts w:ascii="Arial" w:hAnsi="Arial" w:eastAsia="Arial" w:cs="Arial"/>
-                <w:i w:val="false"/>
-                <w:b w:val="false"/>
-                <w:u w:val="none"/>
-                <w:strike w:val="false"/>
-                <w:sz w:val="18"/>
-                <w:szCs w:val="18"/>
-                <w:color w:val="000000"/>
-              </w:rPr>
-              <w:t xml:space="preserve">2025</w:t>
+              <w:t xml:space="preserve">J Am Coll Cardiol 2025</w:t>
             </w:r>
           </w:p>
         </w:tc>
@@ -1708,62 +1486,7 @@
                 <w:szCs w:val="18"/>
                 <w:color w:val="000000"/>
               </w:rPr>
-              <w:t xml:space="preserve">Lancet Diabetes Endocrinol</w:t>
-            </w:r>
-          </w:p>
-        </w:tc>
-        <w:tc>
-          <w:tcPr>
-            <w:tcBorders>
-              <w:bottom w:val="none" w:sz="0" w:space="0" w:color="000000"/>
-              <w:top w:val="none" w:sz="0" w:space="0" w:color="000000"/>
-              <w:left w:val="none" w:sz="0" w:space="0" w:color="000000"/>
-              <w:right w:val="none" w:sz="0" w:space="0" w:color="000000"/>
-            </w:tcBorders>
-            <w:shd w:val="clear" w:color="auto" w:fill="FFFFFF"/>
-            <w:tcMar>
-              <w:top w:w="0" w:type="dxa"/>
-              <w:bottom w:w="0" w:type="dxa"/>
-              <w:left w:w="0" w:type="dxa"/>
-              <w:right w:w="0" w:type="dxa"/>
-            </w:tcMar>
-            <w:vAlign w:val="top"/>
-          </w:tcPr>
-          <w:p>
-            <w:pPr>
-              <w:pStyle w:val="Normal"/>
-              <w:jc w:val="left"/>
-              <w:pBdr>
-                <w:bottom w:val="none" w:sz="0" w:space="0" w:color="000000"/>
-                <w:top w:val="none" w:sz="0" w:space="0" w:color="000000"/>
-                <w:left w:val="none" w:sz="0" w:space="0" w:color="000000"/>
-                <w:right w:val="none" w:sz="0" w:space="0" w:color="000000"/>
-              </w:pBdr>
-              <w:spacing w:after="40" w:before="40" w:line="240"/>
-              <w:ind w:left="20" w:right="20" w:firstLine="0" w:firstLineChars="0"/>
-              <w:rPr>
-                <w:rFonts w:ascii="Arial" w:hAnsi="Arial" w:eastAsia="Arial" w:cs="Arial"/>
-                <w:i w:val="false"/>
-                <w:b w:val="false"/>
-                <w:u w:val="none"/>
-                <w:strike w:val="false"/>
-                <w:sz w:val="18"/>
-                <w:szCs w:val="18"/>
-                <w:color w:val="000000"/>
-              </w:rPr>
-            </w:pPr>
-            <w:r>
-              <w:rPr>
-                <w:rFonts w:ascii="Arial" w:hAnsi="Arial" w:eastAsia="Arial" w:cs="Arial"/>
-                <w:i w:val="false"/>
-                <w:b w:val="false"/>
-                <w:u w:val="none"/>
-                <w:strike w:val="false"/>
-                <w:sz w:val="18"/>
-                <w:szCs w:val="18"/>
-                <w:color w:val="000000"/>
-              </w:rPr>
-              <w:t xml:space="preserve">2025</w:t>
+              <w:t xml:space="preserve">Lancet Diabetes Endocrinol 2025</w:t>
             </w:r>
           </w:p>
         </w:tc>
@@ -2099,62 +1822,7 @@
                 <w:szCs w:val="18"/>
                 <w:color w:val="000000"/>
               </w:rPr>
-              <w:t xml:space="preserve">Gastroenterology</w:t>
-            </w:r>
-          </w:p>
-        </w:tc>
-        <w:tc>
-          <w:tcPr>
-            <w:tcBorders>
-              <w:bottom w:val="none" w:sz="0" w:space="0" w:color="000000"/>
-              <w:top w:val="none" w:sz="0" w:space="0" w:color="000000"/>
-              <w:left w:val="none" w:sz="0" w:space="0" w:color="000000"/>
-              <w:right w:val="none" w:sz="0" w:space="0" w:color="000000"/>
-            </w:tcBorders>
-            <w:shd w:val="clear" w:color="auto" w:fill="FFFFFF"/>
-            <w:tcMar>
-              <w:top w:w="0" w:type="dxa"/>
-              <w:bottom w:w="0" w:type="dxa"/>
-              <w:left w:w="0" w:type="dxa"/>
-              <w:right w:w="0" w:type="dxa"/>
-            </w:tcMar>
-            <w:vAlign w:val="top"/>
-          </w:tcPr>
-          <w:p>
-            <w:pPr>
-              <w:pStyle w:val="Normal"/>
-              <w:jc w:val="left"/>
-              <w:pBdr>
-                <w:bottom w:val="none" w:sz="0" w:space="0" w:color="000000"/>
-                <w:top w:val="none" w:sz="0" w:space="0" w:color="000000"/>
-                <w:left w:val="none" w:sz="0" w:space="0" w:color="000000"/>
-                <w:right w:val="none" w:sz="0" w:space="0" w:color="000000"/>
-              </w:pBdr>
-              <w:spacing w:after="40" w:before="40" w:line="240"/>
-              <w:ind w:left="20" w:right="20" w:firstLine="0" w:firstLineChars="0"/>
-              <w:rPr>
-                <w:rFonts w:ascii="Arial" w:hAnsi="Arial" w:eastAsia="Arial" w:cs="Arial"/>
-                <w:i w:val="false"/>
-                <w:b w:val="false"/>
-                <w:u w:val="none"/>
-                <w:strike w:val="false"/>
-                <w:sz w:val="18"/>
-                <w:szCs w:val="18"/>
-                <w:color w:val="000000"/>
-              </w:rPr>
-            </w:pPr>
-            <w:r>
-              <w:rPr>
-                <w:rFonts w:ascii="Arial" w:hAnsi="Arial" w:eastAsia="Arial" w:cs="Arial"/>
-                <w:i w:val="false"/>
-                <w:b w:val="false"/>
-                <w:u w:val="none"/>
-                <w:strike w:val="false"/>
-                <w:sz w:val="18"/>
-                <w:szCs w:val="18"/>
-                <w:color w:val="000000"/>
-              </w:rPr>
-              <w:t xml:space="preserve">2025</w:t>
+              <w:t xml:space="preserve">Gastroenterology 2025</w:t>
             </w:r>
           </w:p>
         </w:tc>
@@ -2490,62 +2158,7 @@
                 <w:szCs w:val="18"/>
                 <w:color w:val="000000"/>
               </w:rPr>
-              <w:t xml:space="preserve">Clin Infect Dis</w:t>
-            </w:r>
-          </w:p>
-        </w:tc>
-        <w:tc>
-          <w:tcPr>
-            <w:tcBorders>
-              <w:bottom w:val="none" w:sz="0" w:space="0" w:color="000000"/>
-              <w:top w:val="none" w:sz="0" w:space="0" w:color="000000"/>
-              <w:left w:val="none" w:sz="0" w:space="0" w:color="000000"/>
-              <w:right w:val="none" w:sz="0" w:space="0" w:color="000000"/>
-            </w:tcBorders>
-            <w:shd w:val="clear" w:color="auto" w:fill="FFFFFF"/>
-            <w:tcMar>
-              <w:top w:w="0" w:type="dxa"/>
-              <w:bottom w:w="0" w:type="dxa"/>
-              <w:left w:w="0" w:type="dxa"/>
-              <w:right w:w="0" w:type="dxa"/>
-            </w:tcMar>
-            <w:vAlign w:val="top"/>
-          </w:tcPr>
-          <w:p>
-            <w:pPr>
-              <w:pStyle w:val="Normal"/>
-              <w:jc w:val="left"/>
-              <w:pBdr>
-                <w:bottom w:val="none" w:sz="0" w:space="0" w:color="000000"/>
-                <w:top w:val="none" w:sz="0" w:space="0" w:color="000000"/>
-                <w:left w:val="none" w:sz="0" w:space="0" w:color="000000"/>
-                <w:right w:val="none" w:sz="0" w:space="0" w:color="000000"/>
-              </w:pBdr>
-              <w:spacing w:after="40" w:before="40" w:line="240"/>
-              <w:ind w:left="20" w:right="20" w:firstLine="0" w:firstLineChars="0"/>
-              <w:rPr>
-                <w:rFonts w:ascii="Arial" w:hAnsi="Arial" w:eastAsia="Arial" w:cs="Arial"/>
-                <w:i w:val="false"/>
-                <w:b w:val="false"/>
-                <w:u w:val="none"/>
-                <w:strike w:val="false"/>
-                <w:sz w:val="18"/>
-                <w:szCs w:val="18"/>
-                <w:color w:val="000000"/>
-              </w:rPr>
-            </w:pPr>
-            <w:r>
-              <w:rPr>
-                <w:rFonts w:ascii="Arial" w:hAnsi="Arial" w:eastAsia="Arial" w:cs="Arial"/>
-                <w:i w:val="false"/>
-                <w:b w:val="false"/>
-                <w:u w:val="none"/>
-                <w:strike w:val="false"/>
-                <w:sz w:val="18"/>
-                <w:szCs w:val="18"/>
-                <w:color w:val="000000"/>
-              </w:rPr>
-              <w:t xml:space="preserve">2025</w:t>
+              <w:t xml:space="preserve">Clin Infect Dis 2025</w:t>
             </w:r>
           </w:p>
         </w:tc>
@@ -2881,62 +2494,7 @@
                 <w:szCs w:val="18"/>
                 <w:color w:val="000000"/>
               </w:rPr>
-              <w:t xml:space="preserve">Clin J Am Soc Nephrol</w:t>
-            </w:r>
-          </w:p>
-        </w:tc>
-        <w:tc>
-          <w:tcPr>
-            <w:tcBorders>
-              <w:bottom w:val="none" w:sz="0" w:space="0" w:color="000000"/>
-              <w:top w:val="none" w:sz="0" w:space="0" w:color="000000"/>
-              <w:left w:val="none" w:sz="0" w:space="0" w:color="000000"/>
-              <w:right w:val="none" w:sz="0" w:space="0" w:color="000000"/>
-            </w:tcBorders>
-            <w:shd w:val="clear" w:color="auto" w:fill="FFFFFF"/>
-            <w:tcMar>
-              <w:top w:w="0" w:type="dxa"/>
-              <w:bottom w:w="0" w:type="dxa"/>
-              <w:left w:w="0" w:type="dxa"/>
-              <w:right w:w="0" w:type="dxa"/>
-            </w:tcMar>
-            <w:vAlign w:val="top"/>
-          </w:tcPr>
-          <w:p>
-            <w:pPr>
-              <w:pStyle w:val="Normal"/>
-              <w:jc w:val="left"/>
-              <w:pBdr>
-                <w:bottom w:val="none" w:sz="0" w:space="0" w:color="000000"/>
-                <w:top w:val="none" w:sz="0" w:space="0" w:color="000000"/>
-                <w:left w:val="none" w:sz="0" w:space="0" w:color="000000"/>
-                <w:right w:val="none" w:sz="0" w:space="0" w:color="000000"/>
-              </w:pBdr>
-              <w:spacing w:after="40" w:before="40" w:line="240"/>
-              <w:ind w:left="20" w:right="20" w:firstLine="0" w:firstLineChars="0"/>
-              <w:rPr>
-                <w:rFonts w:ascii="Arial" w:hAnsi="Arial" w:eastAsia="Arial" w:cs="Arial"/>
-                <w:i w:val="false"/>
-                <w:b w:val="false"/>
-                <w:u w:val="none"/>
-                <w:strike w:val="false"/>
-                <w:sz w:val="18"/>
-                <w:szCs w:val="18"/>
-                <w:color w:val="000000"/>
-              </w:rPr>
-            </w:pPr>
-            <w:r>
-              <w:rPr>
-                <w:rFonts w:ascii="Arial" w:hAnsi="Arial" w:eastAsia="Arial" w:cs="Arial"/>
-                <w:i w:val="false"/>
-                <w:b w:val="false"/>
-                <w:u w:val="none"/>
-                <w:strike w:val="false"/>
-                <w:sz w:val="18"/>
-                <w:szCs w:val="18"/>
-                <w:color w:val="000000"/>
-              </w:rPr>
-              <w:t xml:space="preserve">2025</w:t>
+              <w:t xml:space="preserve">Clin J Am Soc Nephrol 2025</w:t>
             </w:r>
           </w:p>
         </w:tc>
@@ -3272,62 +2830,7 @@
                 <w:szCs w:val="18"/>
                 <w:color w:val="000000"/>
               </w:rPr>
-              <w:t xml:space="preserve">Lancet Neurol</w:t>
-            </w:r>
-          </w:p>
-        </w:tc>
-        <w:tc>
-          <w:tcPr>
-            <w:tcBorders>
-              <w:bottom w:val="none" w:sz="0" w:space="0" w:color="000000"/>
-              <w:top w:val="none" w:sz="0" w:space="0" w:color="000000"/>
-              <w:left w:val="none" w:sz="0" w:space="0" w:color="000000"/>
-              <w:right w:val="none" w:sz="0" w:space="0" w:color="000000"/>
-            </w:tcBorders>
-            <w:shd w:val="clear" w:color="auto" w:fill="FFFFFF"/>
-            <w:tcMar>
-              <w:top w:w="0" w:type="dxa"/>
-              <w:bottom w:w="0" w:type="dxa"/>
-              <w:left w:w="0" w:type="dxa"/>
-              <w:right w:w="0" w:type="dxa"/>
-            </w:tcMar>
-            <w:vAlign w:val="top"/>
-          </w:tcPr>
-          <w:p>
-            <w:pPr>
-              <w:pStyle w:val="Normal"/>
-              <w:jc w:val="left"/>
-              <w:pBdr>
-                <w:bottom w:val="none" w:sz="0" w:space="0" w:color="000000"/>
-                <w:top w:val="none" w:sz="0" w:space="0" w:color="000000"/>
-                <w:left w:val="none" w:sz="0" w:space="0" w:color="000000"/>
-                <w:right w:val="none" w:sz="0" w:space="0" w:color="000000"/>
-              </w:pBdr>
-              <w:spacing w:after="40" w:before="40" w:line="240"/>
-              <w:ind w:left="20" w:right="20" w:firstLine="0" w:firstLineChars="0"/>
-              <w:rPr>
-                <w:rFonts w:ascii="Arial" w:hAnsi="Arial" w:eastAsia="Arial" w:cs="Arial"/>
-                <w:i w:val="false"/>
-                <w:b w:val="false"/>
-                <w:u w:val="none"/>
-                <w:strike w:val="false"/>
-                <w:sz w:val="18"/>
-                <w:szCs w:val="18"/>
-                <w:color w:val="000000"/>
-              </w:rPr>
-            </w:pPr>
-            <w:r>
-              <w:rPr>
-                <w:rFonts w:ascii="Arial" w:hAnsi="Arial" w:eastAsia="Arial" w:cs="Arial"/>
-                <w:i w:val="false"/>
-                <w:b w:val="false"/>
-                <w:u w:val="none"/>
-                <w:strike w:val="false"/>
-                <w:sz w:val="18"/>
-                <w:szCs w:val="18"/>
-                <w:color w:val="000000"/>
-              </w:rPr>
-              <w:t xml:space="preserve">2025</w:t>
+              <w:t xml:space="preserve">Lancet Neurol 2025</w:t>
             </w:r>
           </w:p>
         </w:tc>
@@ -3663,62 +3166,7 @@
                 <w:szCs w:val="18"/>
                 <w:color w:val="000000"/>
               </w:rPr>
-              <w:t xml:space="preserve">Hum Reprod Update</w:t>
-            </w:r>
-          </w:p>
-        </w:tc>
-        <w:tc>
-          <w:tcPr>
-            <w:tcBorders>
-              <w:bottom w:val="none" w:sz="0" w:space="0" w:color="000000"/>
-              <w:top w:val="none" w:sz="0" w:space="0" w:color="000000"/>
-              <w:left w:val="none" w:sz="0" w:space="0" w:color="000000"/>
-              <w:right w:val="none" w:sz="0" w:space="0" w:color="000000"/>
-            </w:tcBorders>
-            <w:shd w:val="clear" w:color="auto" w:fill="FFFFFF"/>
-            <w:tcMar>
-              <w:top w:w="0" w:type="dxa"/>
-              <w:bottom w:w="0" w:type="dxa"/>
-              <w:left w:w="0" w:type="dxa"/>
-              <w:right w:w="0" w:type="dxa"/>
-            </w:tcMar>
-            <w:vAlign w:val="top"/>
-          </w:tcPr>
-          <w:p>
-            <w:pPr>
-              <w:pStyle w:val="Normal"/>
-              <w:jc w:val="left"/>
-              <w:pBdr>
-                <w:bottom w:val="none" w:sz="0" w:space="0" w:color="000000"/>
-                <w:top w:val="none" w:sz="0" w:space="0" w:color="000000"/>
-                <w:left w:val="none" w:sz="0" w:space="0" w:color="000000"/>
-                <w:right w:val="none" w:sz="0" w:space="0" w:color="000000"/>
-              </w:pBdr>
-              <w:spacing w:after="40" w:before="40" w:line="240"/>
-              <w:ind w:left="20" w:right="20" w:firstLine="0" w:firstLineChars="0"/>
-              <w:rPr>
-                <w:rFonts w:ascii="Arial" w:hAnsi="Arial" w:eastAsia="Arial" w:cs="Arial"/>
-                <w:i w:val="false"/>
-                <w:b w:val="false"/>
-                <w:u w:val="none"/>
-                <w:strike w:val="false"/>
-                <w:sz w:val="18"/>
-                <w:szCs w:val="18"/>
-                <w:color w:val="000000"/>
-              </w:rPr>
-            </w:pPr>
-            <w:r>
-              <w:rPr>
-                <w:rFonts w:ascii="Arial" w:hAnsi="Arial" w:eastAsia="Arial" w:cs="Arial"/>
-                <w:i w:val="false"/>
-                <w:b w:val="false"/>
-                <w:u w:val="none"/>
-                <w:strike w:val="false"/>
-                <w:sz w:val="18"/>
-                <w:szCs w:val="18"/>
-                <w:color w:val="000000"/>
-              </w:rPr>
-              <w:t xml:space="preserve">2026</w:t>
+              <w:t xml:space="preserve">Hum Reprod Update 2026</w:t>
             </w:r>
           </w:p>
         </w:tc>
@@ -4054,62 +3502,7 @@
                 <w:szCs w:val="18"/>
                 <w:color w:val="000000"/>
               </w:rPr>
-              <w:t xml:space="preserve">Lancet Oncol</w:t>
-            </w:r>
-          </w:p>
-        </w:tc>
-        <w:tc>
-          <w:tcPr>
-            <w:tcBorders>
-              <w:bottom w:val="none" w:sz="0" w:space="0" w:color="000000"/>
-              <w:top w:val="none" w:sz="0" w:space="0" w:color="000000"/>
-              <w:left w:val="none" w:sz="0" w:space="0" w:color="000000"/>
-              <w:right w:val="none" w:sz="0" w:space="0" w:color="000000"/>
-            </w:tcBorders>
-            <w:shd w:val="clear" w:color="auto" w:fill="FFFFFF"/>
-            <w:tcMar>
-              <w:top w:w="0" w:type="dxa"/>
-              <w:bottom w:w="0" w:type="dxa"/>
-              <w:left w:w="0" w:type="dxa"/>
-              <w:right w:w="0" w:type="dxa"/>
-            </w:tcMar>
-            <w:vAlign w:val="top"/>
-          </w:tcPr>
-          <w:p>
-            <w:pPr>
-              <w:pStyle w:val="Normal"/>
-              <w:jc w:val="left"/>
-              <w:pBdr>
-                <w:bottom w:val="none" w:sz="0" w:space="0" w:color="000000"/>
-                <w:top w:val="none" w:sz="0" w:space="0" w:color="000000"/>
-                <w:left w:val="none" w:sz="0" w:space="0" w:color="000000"/>
-                <w:right w:val="none" w:sz="0" w:space="0" w:color="000000"/>
-              </w:pBdr>
-              <w:spacing w:after="40" w:before="40" w:line="240"/>
-              <w:ind w:left="20" w:right="20" w:firstLine="0" w:firstLineChars="0"/>
-              <w:rPr>
-                <w:rFonts w:ascii="Arial" w:hAnsi="Arial" w:eastAsia="Arial" w:cs="Arial"/>
-                <w:i w:val="false"/>
-                <w:b w:val="false"/>
-                <w:u w:val="none"/>
-                <w:strike w:val="false"/>
-                <w:sz w:val="18"/>
-                <w:szCs w:val="18"/>
-                <w:color w:val="000000"/>
-              </w:rPr>
-            </w:pPr>
-            <w:r>
-              <w:rPr>
-                <w:rFonts w:ascii="Arial" w:hAnsi="Arial" w:eastAsia="Arial" w:cs="Arial"/>
-                <w:i w:val="false"/>
-                <w:b w:val="false"/>
-                <w:u w:val="none"/>
-                <w:strike w:val="false"/>
-                <w:sz w:val="18"/>
-                <w:szCs w:val="18"/>
-                <w:color w:val="000000"/>
-              </w:rPr>
-              <w:t xml:space="preserve">2026</w:t>
+              <w:t xml:space="preserve">Lancet Oncol 2026</w:t>
             </w:r>
           </w:p>
         </w:tc>
@@ -4445,62 +3838,7 @@
                 <w:szCs w:val="18"/>
                 <w:color w:val="000000"/>
               </w:rPr>
-              <w:t xml:space="preserve">Am J Sports Med</w:t>
-            </w:r>
-          </w:p>
-        </w:tc>
-        <w:tc>
-          <w:tcPr>
-            <w:tcBorders>
-              <w:bottom w:val="none" w:sz="0" w:space="0" w:color="000000"/>
-              <w:top w:val="none" w:sz="0" w:space="0" w:color="000000"/>
-              <w:left w:val="none" w:sz="0" w:space="0" w:color="000000"/>
-              <w:right w:val="none" w:sz="0" w:space="0" w:color="000000"/>
-            </w:tcBorders>
-            <w:shd w:val="clear" w:color="auto" w:fill="FFFFFF"/>
-            <w:tcMar>
-              <w:top w:w="0" w:type="dxa"/>
-              <w:bottom w:w="0" w:type="dxa"/>
-              <w:left w:w="0" w:type="dxa"/>
-              <w:right w:w="0" w:type="dxa"/>
-            </w:tcMar>
-            <w:vAlign w:val="top"/>
-          </w:tcPr>
-          <w:p>
-            <w:pPr>
-              <w:pStyle w:val="Normal"/>
-              <w:jc w:val="left"/>
-              <w:pBdr>
-                <w:bottom w:val="none" w:sz="0" w:space="0" w:color="000000"/>
-                <w:top w:val="none" w:sz="0" w:space="0" w:color="000000"/>
-                <w:left w:val="none" w:sz="0" w:space="0" w:color="000000"/>
-                <w:right w:val="none" w:sz="0" w:space="0" w:color="000000"/>
-              </w:pBdr>
-              <w:spacing w:after="40" w:before="40" w:line="240"/>
-              <w:ind w:left="20" w:right="20" w:firstLine="0" w:firstLineChars="0"/>
-              <w:rPr>
-                <w:rFonts w:ascii="Arial" w:hAnsi="Arial" w:eastAsia="Arial" w:cs="Arial"/>
-                <w:i w:val="false"/>
-                <w:b w:val="false"/>
-                <w:u w:val="none"/>
-                <w:strike w:val="false"/>
-                <w:sz w:val="18"/>
-                <w:szCs w:val="18"/>
-                <w:color w:val="000000"/>
-              </w:rPr>
-            </w:pPr>
-            <w:r>
-              <w:rPr>
-                <w:rFonts w:ascii="Arial" w:hAnsi="Arial" w:eastAsia="Arial" w:cs="Arial"/>
-                <w:i w:val="false"/>
-                <w:b w:val="false"/>
-                <w:u w:val="none"/>
-                <w:strike w:val="false"/>
-                <w:sz w:val="18"/>
-                <w:szCs w:val="18"/>
-                <w:color w:val="000000"/>
-              </w:rPr>
-              <w:t xml:space="preserve">2025</w:t>
+              <w:t xml:space="preserve">Am J Sports Med 2025</w:t>
             </w:r>
           </w:p>
         </w:tc>
@@ -4836,62 +4174,7 @@
                 <w:szCs w:val="18"/>
                 <w:color w:val="000000"/>
               </w:rPr>
-              <w:t xml:space="preserve">JAMA Pediatr</w:t>
-            </w:r>
-          </w:p>
-        </w:tc>
-        <w:tc>
-          <w:tcPr>
-            <w:tcBorders>
-              <w:bottom w:val="none" w:sz="0" w:space="0" w:color="000000"/>
-              <w:top w:val="none" w:sz="0" w:space="0" w:color="000000"/>
-              <w:left w:val="none" w:sz="0" w:space="0" w:color="000000"/>
-              <w:right w:val="none" w:sz="0" w:space="0" w:color="000000"/>
-            </w:tcBorders>
-            <w:shd w:val="clear" w:color="auto" w:fill="FFFFFF"/>
-            <w:tcMar>
-              <w:top w:w="0" w:type="dxa"/>
-              <w:bottom w:w="0" w:type="dxa"/>
-              <w:left w:w="0" w:type="dxa"/>
-              <w:right w:w="0" w:type="dxa"/>
-            </w:tcMar>
-            <w:vAlign w:val="top"/>
-          </w:tcPr>
-          <w:p>
-            <w:pPr>
-              <w:pStyle w:val="Normal"/>
-              <w:jc w:val="left"/>
-              <w:pBdr>
-                <w:bottom w:val="none" w:sz="0" w:space="0" w:color="000000"/>
-                <w:top w:val="none" w:sz="0" w:space="0" w:color="000000"/>
-                <w:left w:val="none" w:sz="0" w:space="0" w:color="000000"/>
-                <w:right w:val="none" w:sz="0" w:space="0" w:color="000000"/>
-              </w:pBdr>
-              <w:spacing w:after="40" w:before="40" w:line="240"/>
-              <w:ind w:left="20" w:right="20" w:firstLine="0" w:firstLineChars="0"/>
-              <w:rPr>
-                <w:rFonts w:ascii="Arial" w:hAnsi="Arial" w:eastAsia="Arial" w:cs="Arial"/>
-                <w:i w:val="false"/>
-                <w:b w:val="false"/>
-                <w:u w:val="none"/>
-                <w:strike w:val="false"/>
-                <w:sz w:val="18"/>
-                <w:szCs w:val="18"/>
-                <w:color w:val="000000"/>
-              </w:rPr>
-            </w:pPr>
-            <w:r>
-              <w:rPr>
-                <w:rFonts w:ascii="Arial" w:hAnsi="Arial" w:eastAsia="Arial" w:cs="Arial"/>
-                <w:i w:val="false"/>
-                <w:b w:val="false"/>
-                <w:u w:val="none"/>
-                <w:strike w:val="false"/>
-                <w:sz w:val="18"/>
-                <w:szCs w:val="18"/>
-                <w:color w:val="000000"/>
-              </w:rPr>
-              <w:t xml:space="preserve">2025</w:t>
+              <w:t xml:space="preserve">JAMA Pediatr 2025</w:t>
             </w:r>
           </w:p>
         </w:tc>
@@ -5227,62 +4510,7 @@
                 <w:szCs w:val="18"/>
                 <w:color w:val="000000"/>
               </w:rPr>
-              <w:t xml:space="preserve">Lancet Psychiatry</w:t>
-            </w:r>
-          </w:p>
-        </w:tc>
-        <w:tc>
-          <w:tcPr>
-            <w:tcBorders>
-              <w:bottom w:val="none" w:sz="0" w:space="0" w:color="000000"/>
-              <w:top w:val="none" w:sz="0" w:space="0" w:color="000000"/>
-              <w:left w:val="none" w:sz="0" w:space="0" w:color="000000"/>
-              <w:right w:val="none" w:sz="0" w:space="0" w:color="000000"/>
-            </w:tcBorders>
-            <w:shd w:val="clear" w:color="auto" w:fill="FFFFFF"/>
-            <w:tcMar>
-              <w:top w:w="0" w:type="dxa"/>
-              <w:bottom w:w="0" w:type="dxa"/>
-              <w:left w:w="0" w:type="dxa"/>
-              <w:right w:w="0" w:type="dxa"/>
-            </w:tcMar>
-            <w:vAlign w:val="top"/>
-          </w:tcPr>
-          <w:p>
-            <w:pPr>
-              <w:pStyle w:val="Normal"/>
-              <w:jc w:val="left"/>
-              <w:pBdr>
-                <w:bottom w:val="none" w:sz="0" w:space="0" w:color="000000"/>
-                <w:top w:val="none" w:sz="0" w:space="0" w:color="000000"/>
-                <w:left w:val="none" w:sz="0" w:space="0" w:color="000000"/>
-                <w:right w:val="none" w:sz="0" w:space="0" w:color="000000"/>
-              </w:pBdr>
-              <w:spacing w:after="40" w:before="40" w:line="240"/>
-              <w:ind w:left="20" w:right="20" w:firstLine="0" w:firstLineChars="0"/>
-              <w:rPr>
-                <w:rFonts w:ascii="Arial" w:hAnsi="Arial" w:eastAsia="Arial" w:cs="Arial"/>
-                <w:i w:val="false"/>
-                <w:b w:val="false"/>
-                <w:u w:val="none"/>
-                <w:strike w:val="false"/>
-                <w:sz w:val="18"/>
-                <w:szCs w:val="18"/>
-                <w:color w:val="000000"/>
-              </w:rPr>
-            </w:pPr>
-            <w:r>
-              <w:rPr>
-                <w:rFonts w:ascii="Arial" w:hAnsi="Arial" w:eastAsia="Arial" w:cs="Arial"/>
-                <w:i w:val="false"/>
-                <w:b w:val="false"/>
-                <w:u w:val="none"/>
-                <w:strike w:val="false"/>
-                <w:sz w:val="18"/>
-                <w:szCs w:val="18"/>
-                <w:color w:val="000000"/>
-              </w:rPr>
-              <w:t xml:space="preserve">2026</w:t>
+              <w:t xml:space="preserve">Lancet Psychiatry 2026</w:t>
             </w:r>
           </w:p>
         </w:tc>
@@ -5618,62 +4846,7 @@
                 <w:szCs w:val="18"/>
                 <w:color w:val="000000"/>
               </w:rPr>
-              <w:t xml:space="preserve">Lancet Respir Med</w:t>
-            </w:r>
-          </w:p>
-        </w:tc>
-        <w:tc>
-          <w:tcPr>
-            <w:tcBorders>
-              <w:bottom w:val="none" w:sz="0" w:space="0" w:color="000000"/>
-              <w:top w:val="none" w:sz="0" w:space="0" w:color="000000"/>
-              <w:left w:val="none" w:sz="0" w:space="0" w:color="000000"/>
-              <w:right w:val="none" w:sz="0" w:space="0" w:color="000000"/>
-            </w:tcBorders>
-            <w:shd w:val="clear" w:color="auto" w:fill="FFFFFF"/>
-            <w:tcMar>
-              <w:top w:w="0" w:type="dxa"/>
-              <w:bottom w:w="0" w:type="dxa"/>
-              <w:left w:w="0" w:type="dxa"/>
-              <w:right w:w="0" w:type="dxa"/>
-            </w:tcMar>
-            <w:vAlign w:val="top"/>
-          </w:tcPr>
-          <w:p>
-            <w:pPr>
-              <w:pStyle w:val="Normal"/>
-              <w:jc w:val="left"/>
-              <w:pBdr>
-                <w:bottom w:val="none" w:sz="0" w:space="0" w:color="000000"/>
-                <w:top w:val="none" w:sz="0" w:space="0" w:color="000000"/>
-                <w:left w:val="none" w:sz="0" w:space="0" w:color="000000"/>
-                <w:right w:val="none" w:sz="0" w:space="0" w:color="000000"/>
-              </w:pBdr>
-              <w:spacing w:after="40" w:before="40" w:line="240"/>
-              <w:ind w:left="20" w:right="20" w:firstLine="0" w:firstLineChars="0"/>
-              <w:rPr>
-                <w:rFonts w:ascii="Arial" w:hAnsi="Arial" w:eastAsia="Arial" w:cs="Arial"/>
-                <w:i w:val="false"/>
-                <w:b w:val="false"/>
-                <w:u w:val="none"/>
-                <w:strike w:val="false"/>
-                <w:sz w:val="18"/>
-                <w:szCs w:val="18"/>
-                <w:color w:val="000000"/>
-              </w:rPr>
-            </w:pPr>
-            <w:r>
-              <w:rPr>
-                <w:rFonts w:ascii="Arial" w:hAnsi="Arial" w:eastAsia="Arial" w:cs="Arial"/>
-                <w:i w:val="false"/>
-                <w:b w:val="false"/>
-                <w:u w:val="none"/>
-                <w:strike w:val="false"/>
-                <w:sz w:val="18"/>
-                <w:szCs w:val="18"/>
-                <w:color w:val="000000"/>
-              </w:rPr>
-              <w:t xml:space="preserve">2025</w:t>
+              <w:t xml:space="preserve">Lancet Respir Med 2025</w:t>
             </w:r>
           </w:p>
         </w:tc>
@@ -6009,62 +5182,7 @@
                 <w:szCs w:val="18"/>
                 <w:color w:val="000000"/>
               </w:rPr>
-              <w:t xml:space="preserve">Lancet Rheumatol</w:t>
-            </w:r>
-          </w:p>
-        </w:tc>
-        <w:tc>
-          <w:tcPr>
-            <w:tcBorders>
-              <w:bottom w:val="none" w:sz="0" w:space="0" w:color="000000"/>
-              <w:top w:val="none" w:sz="0" w:space="0" w:color="000000"/>
-              <w:left w:val="none" w:sz="0" w:space="0" w:color="000000"/>
-              <w:right w:val="none" w:sz="0" w:space="0" w:color="000000"/>
-            </w:tcBorders>
-            <w:shd w:val="clear" w:color="auto" w:fill="FFFFFF"/>
-            <w:tcMar>
-              <w:top w:w="0" w:type="dxa"/>
-              <w:bottom w:w="0" w:type="dxa"/>
-              <w:left w:w="0" w:type="dxa"/>
-              <w:right w:w="0" w:type="dxa"/>
-            </w:tcMar>
-            <w:vAlign w:val="top"/>
-          </w:tcPr>
-          <w:p>
-            <w:pPr>
-              <w:pStyle w:val="Normal"/>
-              <w:jc w:val="left"/>
-              <w:pBdr>
-                <w:bottom w:val="none" w:sz="0" w:space="0" w:color="000000"/>
-                <w:top w:val="none" w:sz="0" w:space="0" w:color="000000"/>
-                <w:left w:val="none" w:sz="0" w:space="0" w:color="000000"/>
-                <w:right w:val="none" w:sz="0" w:space="0" w:color="000000"/>
-              </w:pBdr>
-              <w:spacing w:after="40" w:before="40" w:line="240"/>
-              <w:ind w:left="20" w:right="20" w:firstLine="0" w:firstLineChars="0"/>
-              <w:rPr>
-                <w:rFonts w:ascii="Arial" w:hAnsi="Arial" w:eastAsia="Arial" w:cs="Arial"/>
-                <w:i w:val="false"/>
-                <w:b w:val="false"/>
-                <w:u w:val="none"/>
-                <w:strike w:val="false"/>
-                <w:sz w:val="18"/>
-                <w:szCs w:val="18"/>
-                <w:color w:val="000000"/>
-              </w:rPr>
-            </w:pPr>
-            <w:r>
-              <w:rPr>
-                <w:rFonts w:ascii="Arial" w:hAnsi="Arial" w:eastAsia="Arial" w:cs="Arial"/>
-                <w:i w:val="false"/>
-                <w:b w:val="false"/>
-                <w:u w:val="none"/>
-                <w:strike w:val="false"/>
-                <w:sz w:val="18"/>
-                <w:szCs w:val="18"/>
-                <w:color w:val="000000"/>
-              </w:rPr>
-              <w:t xml:space="preserve">2025</w:t>
+              <w:t xml:space="preserve">Lancet Rheumatol 2025</w:t>
             </w:r>
           </w:p>
         </w:tc>
@@ -6400,62 +5518,7 @@
                 <w:szCs w:val="18"/>
                 <w:color w:val="000000"/>
               </w:rPr>
-              <w:t xml:space="preserve">Br J Anaesth</w:t>
-            </w:r>
-          </w:p>
-        </w:tc>
-        <w:tc>
-          <w:tcPr>
-            <w:tcBorders>
-              <w:bottom w:val="none" w:sz="0" w:space="0" w:color="000000"/>
-              <w:top w:val="none" w:sz="0" w:space="0" w:color="000000"/>
-              <w:left w:val="none" w:sz="0" w:space="0" w:color="000000"/>
-              <w:right w:val="none" w:sz="0" w:space="0" w:color="000000"/>
-            </w:tcBorders>
-            <w:shd w:val="clear" w:color="auto" w:fill="FFFFFF"/>
-            <w:tcMar>
-              <w:top w:w="0" w:type="dxa"/>
-              <w:bottom w:w="0" w:type="dxa"/>
-              <w:left w:w="0" w:type="dxa"/>
-              <w:right w:w="0" w:type="dxa"/>
-            </w:tcMar>
-            <w:vAlign w:val="top"/>
-          </w:tcPr>
-          <w:p>
-            <w:pPr>
-              <w:pStyle w:val="Normal"/>
-              <w:jc w:val="left"/>
-              <w:pBdr>
-                <w:bottom w:val="none" w:sz="0" w:space="0" w:color="000000"/>
-                <w:top w:val="none" w:sz="0" w:space="0" w:color="000000"/>
-                <w:left w:val="none" w:sz="0" w:space="0" w:color="000000"/>
-                <w:right w:val="none" w:sz="0" w:space="0" w:color="000000"/>
-              </w:pBdr>
-              <w:spacing w:after="40" w:before="40" w:line="240"/>
-              <w:ind w:left="20" w:right="20" w:firstLine="0" w:firstLineChars="0"/>
-              <w:rPr>
-                <w:rFonts w:ascii="Arial" w:hAnsi="Arial" w:eastAsia="Arial" w:cs="Arial"/>
-                <w:i w:val="false"/>
-                <w:b w:val="false"/>
-                <w:u w:val="none"/>
-                <w:strike w:val="false"/>
-                <w:sz w:val="18"/>
-                <w:szCs w:val="18"/>
-                <w:color w:val="000000"/>
-              </w:rPr>
-            </w:pPr>
-            <w:r>
-              <w:rPr>
-                <w:rFonts w:ascii="Arial" w:hAnsi="Arial" w:eastAsia="Arial" w:cs="Arial"/>
-                <w:i w:val="false"/>
-                <w:b w:val="false"/>
-                <w:u w:val="none"/>
-                <w:strike w:val="false"/>
-                <w:sz w:val="18"/>
-                <w:szCs w:val="18"/>
-                <w:color w:val="000000"/>
-              </w:rPr>
-              <w:t xml:space="preserve">2025</w:t>
+              <w:t xml:space="preserve">Br J Anaesth 2025</w:t>
             </w:r>
           </w:p>
         </w:tc>
@@ -6905,62 +5968,6 @@
                 <w:szCs w:val="18"/>
                 <w:color w:val="000000"/>
               </w:rPr>
-              <w:t xml:space="preserve"/>
-            </w:r>
-          </w:p>
-        </w:tc>
-        <w:tc>
-          <w:tcPr>
-            <w:tcBorders>
-              <w:bottom w:val="single" w:sz="8" w:space="0" w:color="000000"/>
-              <w:top w:val="none" w:sz="0" w:space="0" w:color="000000"/>
-              <w:left w:val="none" w:sz="0" w:space="0" w:color="000000"/>
-              <w:right w:val="none" w:sz="0" w:space="0" w:color="000000"/>
-            </w:tcBorders>
-            <w:shd w:val="clear" w:color="auto" w:fill="FFFFFF"/>
-            <w:tcMar>
-              <w:top w:w="0" w:type="dxa"/>
-              <w:bottom w:w="0" w:type="dxa"/>
-              <w:left w:w="0" w:type="dxa"/>
-              <w:right w:w="0" w:type="dxa"/>
-            </w:tcMar>
-            <w:vAlign w:val="top"/>
-          </w:tcPr>
-          <w:p>
-            <w:pPr>
-              <w:pStyle w:val="Normal"/>
-              <w:jc w:val="left"/>
-              <w:keepNext/>
-              <w:pBdr>
-                <w:bottom w:val="none" w:sz="0" w:space="0" w:color="000000"/>
-                <w:top w:val="none" w:sz="0" w:space="0" w:color="000000"/>
-                <w:left w:val="none" w:sz="0" w:space="0" w:color="000000"/>
-                <w:right w:val="none" w:sz="0" w:space="0" w:color="000000"/>
-              </w:pBdr>
-              <w:spacing w:after="40" w:before="40" w:line="240"/>
-              <w:ind w:left="20" w:right="20" w:firstLine="0" w:firstLineChars="0"/>
-              <w:rPr>
-                <w:rFonts w:ascii="Arial" w:hAnsi="Arial" w:eastAsia="Arial" w:cs="Arial"/>
-                <w:i w:val="false"/>
-                <w:b w:val="false"/>
-                <w:u w:val="none"/>
-                <w:strike w:val="false"/>
-                <w:sz w:val="18"/>
-                <w:szCs w:val="18"/>
-                <w:color w:val="000000"/>
-              </w:rPr>
-            </w:pPr>
-            <w:r>
-              <w:rPr>
-                <w:rFonts w:ascii="Arial" w:hAnsi="Arial" w:eastAsia="Arial" w:cs="Arial"/>
-                <w:i w:val="false"/>
-                <w:b w:val="false"/>
-                <w:u w:val="none"/>
-                <w:strike w:val="false"/>
-                <w:sz w:val="18"/>
-                <w:szCs w:val="18"/>
-                <w:color w:val="000000"/>
-              </w:rPr>
               <w:t xml:space="preserve">102</w:t>
             </w:r>
           </w:p>
@@ -7085,7 +6092,7 @@
         </w:trPr>
         <w:tc>
           <w:tcPr>
-            <w:gridSpan w:val="7"/>
+            <w:gridSpan w:val="6"/>
             <w:tcBorders>
               <w:bottom w:val="none" w:sz="0" w:space="0" w:color="FFFFFF"/>
               <w:top w:val="single" w:sz="8" w:space="0" w:color="000000"/>

</xml_diff>

<commit_message>
Address Round 13b manuscript display review
</commit_message>
<xml_diff>
--- a/analysis/output/manuscript/Table1.docx
+++ b/analysis/output/manuscript/Table1.docx
@@ -19,9 +19,9 @@
       <w:tblGrid>
         <w:gridCol w:w="2102"/>
         <w:gridCol w:w="1656"/>
-        <w:gridCol w:w="3600"/>
+        <w:gridCol w:w="2765"/>
         <w:gridCol w:w="576"/>
-        <w:gridCol w:w="1325"/>
+        <w:gridCol w:w="2160"/>
         <w:gridCol w:w="778"/>
       </w:tblGrid>
       <w:tr>
@@ -306,7 +306,33 @@
                 <w:szCs w:val="18"/>
                 <w:color w:val="000000"/>
               </w:rPr>
-              <w:t xml:space="preserve">Published D1–D5 labels (Low/SC/High)</w:t>
+              <w:t xml:space="preserve">Published D1⁠–⁠D5 labels</w:t>
+            </w:r>
+            <w:r>
+              <w:rPr>
+                <w:rFonts w:ascii="Arial" w:hAnsi="Arial" w:eastAsia="Arial" w:cs="Arial"/>
+                <w:i w:val="false"/>
+                <w:b w:val="true"/>
+                <w:u w:val="none"/>
+                <w:strike w:val="false"/>
+                <w:sz w:val="18"/>
+                <w:szCs w:val="18"/>
+                <w:color w:val="000000"/>
+              </w:rPr>
+              <w:br/>
+            </w:r>
+            <w:r>
+              <w:rPr>
+                <w:rFonts w:ascii="Arial" w:hAnsi="Arial" w:eastAsia="Arial" w:cs="Arial"/>
+                <w:i w:val="false"/>
+                <w:b w:val="true"/>
+                <w:u w:val="none"/>
+                <w:strike w:val="false"/>
+                <w:sz w:val="18"/>
+                <w:szCs w:val="18"/>
+                <w:color w:val="000000"/>
+              </w:rPr>
+              <w:t xml:space="preserve">(Low/SC/High)</w:t>
             </w:r>
           </w:p>
         </w:tc>
@@ -5415,7 +5441,7 @@
         <w:tc>
           <w:tcPr>
             <w:tcBorders>
-              <w:bottom w:val="none" w:sz="0" w:space="0" w:color="000000"/>
+              <w:bottom w:val="single" w:sz="5" w:space="0" w:color="000000"/>
               <w:top w:val="none" w:sz="0" w:space="0" w:color="000000"/>
               <w:left w:val="none" w:sz="0" w:space="0" w:color="000000"/>
               <w:right w:val="none" w:sz="0" w:space="0" w:color="000000"/>
@@ -5470,7 +5496,7 @@
         <w:tc>
           <w:tcPr>
             <w:tcBorders>
-              <w:bottom w:val="none" w:sz="0" w:space="0" w:color="000000"/>
+              <w:bottom w:val="single" w:sz="5" w:space="0" w:color="000000"/>
               <w:top w:val="none" w:sz="0" w:space="0" w:color="000000"/>
               <w:left w:val="none" w:sz="0" w:space="0" w:color="000000"/>
               <w:right w:val="none" w:sz="0" w:space="0" w:color="000000"/>
@@ -5525,7 +5551,7 @@
         <w:tc>
           <w:tcPr>
             <w:tcBorders>
-              <w:bottom w:val="none" w:sz="0" w:space="0" w:color="000000"/>
+              <w:bottom w:val="single" w:sz="5" w:space="0" w:color="000000"/>
               <w:top w:val="none" w:sz="0" w:space="0" w:color="000000"/>
               <w:left w:val="none" w:sz="0" w:space="0" w:color="000000"/>
               <w:right w:val="none" w:sz="0" w:space="0" w:color="000000"/>
@@ -5580,7 +5606,7 @@
         <w:tc>
           <w:tcPr>
             <w:tcBorders>
-              <w:bottom w:val="none" w:sz="0" w:space="0" w:color="000000"/>
+              <w:bottom w:val="single" w:sz="5" w:space="0" w:color="000000"/>
               <w:top w:val="none" w:sz="0" w:space="0" w:color="000000"/>
               <w:left w:val="none" w:sz="0" w:space="0" w:color="000000"/>
               <w:right w:val="none" w:sz="0" w:space="0" w:color="000000"/>
@@ -5635,7 +5661,7 @@
         <w:tc>
           <w:tcPr>
             <w:tcBorders>
-              <w:bottom w:val="none" w:sz="0" w:space="0" w:color="000000"/>
+              <w:bottom w:val="single" w:sz="5" w:space="0" w:color="000000"/>
               <w:top w:val="none" w:sz="0" w:space="0" w:color="000000"/>
               <w:left w:val="none" w:sz="0" w:space="0" w:color="000000"/>
               <w:right w:val="none" w:sz="0" w:space="0" w:color="000000"/>
@@ -5690,7 +5716,7 @@
         <w:tc>
           <w:tcPr>
             <w:tcBorders>
-              <w:bottom w:val="none" w:sz="0" w:space="0" w:color="000000"/>
+              <w:bottom w:val="single" w:sz="5" w:space="0" w:color="000000"/>
               <w:top w:val="none" w:sz="0" w:space="0" w:color="000000"/>
               <w:left w:val="none" w:sz="0" w:space="0" w:color="000000"/>
               <w:right w:val="none" w:sz="0" w:space="0" w:color="000000"/>
@@ -5752,7 +5778,7 @@
           <w:tcPr>
             <w:tcBorders>
               <w:bottom w:val="single" w:sz="8" w:space="0" w:color="000000"/>
-              <w:top w:val="none" w:sz="0" w:space="0" w:color="000000"/>
+              <w:top w:val="single" w:sz="5" w:space="0" w:color="000000"/>
               <w:left w:val="none" w:sz="0" w:space="0" w:color="000000"/>
               <w:right w:val="none" w:sz="0" w:space="0" w:color="000000"/>
             </w:tcBorders>
@@ -5781,19 +5807,19 @@
               <w:rPr>
                 <w:rFonts w:ascii="Arial" w:hAnsi="Arial" w:eastAsia="Arial" w:cs="Arial"/>
                 <w:i w:val="false"/>
-                <w:b w:val="false"/>
-                <w:u w:val="none"/>
-                <w:strike w:val="false"/>
-                <w:sz w:val="18"/>
-                <w:szCs w:val="18"/>
-                <w:color w:val="000000"/>
-              </w:rPr>
-            </w:pPr>
-            <w:r>
-              <w:rPr>
-                <w:rFonts w:ascii="Arial" w:hAnsi="Arial" w:eastAsia="Arial" w:cs="Arial"/>
-                <w:i w:val="false"/>
-                <w:b w:val="false"/>
+                <w:b w:val="true"/>
+                <w:u w:val="none"/>
+                <w:strike w:val="false"/>
+                <w:sz w:val="18"/>
+                <w:szCs w:val="18"/>
+                <w:color w:val="000000"/>
+              </w:rPr>
+            </w:pPr>
+            <w:r>
+              <w:rPr>
+                <w:rFonts w:ascii="Arial" w:hAnsi="Arial" w:eastAsia="Arial" w:cs="Arial"/>
+                <w:i w:val="false"/>
+                <w:b w:val="true"/>
                 <w:u w:val="none"/>
                 <w:strike w:val="false"/>
                 <w:sz w:val="18"/>
@@ -5808,7 +5834,7 @@
           <w:tcPr>
             <w:tcBorders>
               <w:bottom w:val="single" w:sz="8" w:space="0" w:color="000000"/>
-              <w:top w:val="none" w:sz="0" w:space="0" w:color="000000"/>
+              <w:top w:val="single" w:sz="5" w:space="0" w:color="000000"/>
               <w:left w:val="none" w:sz="0" w:space="0" w:color="000000"/>
               <w:right w:val="none" w:sz="0" w:space="0" w:color="000000"/>
             </w:tcBorders>
@@ -5864,7 +5890,7 @@
           <w:tcPr>
             <w:tcBorders>
               <w:bottom w:val="single" w:sz="8" w:space="0" w:color="000000"/>
-              <w:top w:val="none" w:sz="0" w:space="0" w:color="000000"/>
+              <w:top w:val="single" w:sz="5" w:space="0" w:color="000000"/>
               <w:left w:val="none" w:sz="0" w:space="0" w:color="000000"/>
               <w:right w:val="none" w:sz="0" w:space="0" w:color="000000"/>
             </w:tcBorders>
@@ -5920,7 +5946,7 @@
           <w:tcPr>
             <w:tcBorders>
               <w:bottom w:val="single" w:sz="8" w:space="0" w:color="000000"/>
-              <w:top w:val="none" w:sz="0" w:space="0" w:color="000000"/>
+              <w:top w:val="single" w:sz="5" w:space="0" w:color="000000"/>
               <w:left w:val="none" w:sz="0" w:space="0" w:color="000000"/>
               <w:right w:val="none" w:sz="0" w:space="0" w:color="000000"/>
             </w:tcBorders>
@@ -5976,7 +6002,7 @@
           <w:tcPr>
             <w:tcBorders>
               <w:bottom w:val="single" w:sz="8" w:space="0" w:color="000000"/>
-              <w:top w:val="none" w:sz="0" w:space="0" w:color="000000"/>
+              <w:top w:val="single" w:sz="5" w:space="0" w:color="000000"/>
               <w:left w:val="none" w:sz="0" w:space="0" w:color="000000"/>
               <w:right w:val="none" w:sz="0" w:space="0" w:color="000000"/>
             </w:tcBorders>
@@ -6032,7 +6058,7 @@
           <w:tcPr>
             <w:tcBorders>
               <w:bottom w:val="single" w:sz="8" w:space="0" w:color="000000"/>
-              <w:top w:val="none" w:sz="0" w:space="0" w:color="000000"/>
+              <w:top w:val="single" w:sz="5" w:space="0" w:color="000000"/>
               <w:left w:val="none" w:sz="0" w:space="0" w:color="000000"/>
               <w:right w:val="none" w:sz="0" w:space="0" w:color="000000"/>
             </w:tcBorders>

</xml_diff>